<commit_message>
TIS zpracovano, WT na ceste
</commit_message>
<xml_diff>
--- a/SZZ_okruhy_AI_2019-2020_2023.docx
+++ b/SZZ_okruhy_AI_2019-2020_2023.docx
@@ -54,7 +54,7 @@
       </w:pPr>
       <w:r>
         <w:rPr>
-          <w:rFonts w:eastAsia="Calibri" w:cs="Calibri" w:ascii="Calibri" w:hAnsi="Calibri"/>
+          <w:rFonts w:eastAsia="Calibri" w:cs="Calibri"/>
           <w:b/>
           <w:sz w:val="28"/>
           <w:szCs w:val="28"/>
@@ -64,7 +64,7 @@
       </w:r>
       <w:r>
         <w:rPr>
-          <w:rFonts w:eastAsia="Calibri" w:cs="Calibri" w:ascii="Calibri" w:hAnsi="Calibri"/>
+          <w:rFonts w:eastAsia="Calibri" w:cs="Calibri"/>
           <w:b/>
           <w:spacing w:val="-1"/>
           <w:sz w:val="28"/>
@@ -75,7 +75,7 @@
       </w:r>
       <w:r>
         <w:rPr>
-          <w:rFonts w:eastAsia="Calibri" w:cs="Calibri" w:ascii="Calibri" w:hAnsi="Calibri"/>
+          <w:rFonts w:eastAsia="Calibri" w:cs="Calibri"/>
           <w:b/>
           <w:spacing w:val="1"/>
           <w:sz w:val="28"/>
@@ -86,7 +86,7 @@
       </w:r>
       <w:r>
         <w:rPr>
-          <w:rFonts w:eastAsia="Calibri" w:cs="Calibri" w:ascii="Calibri" w:hAnsi="Calibri"/>
+          <w:rFonts w:eastAsia="Calibri" w:cs="Calibri"/>
           <w:b/>
           <w:sz w:val="28"/>
           <w:szCs w:val="28"/>
@@ -96,7 +96,7 @@
       </w:r>
       <w:r>
         <w:rPr>
-          <w:rFonts w:eastAsia="Calibri" w:cs="Calibri" w:ascii="Calibri" w:hAnsi="Calibri"/>
+          <w:rFonts w:eastAsia="Calibri" w:cs="Calibri"/>
           <w:b/>
           <w:spacing w:val="27"/>
           <w:sz w:val="28"/>
@@ -107,7 +107,7 @@
       </w:r>
       <w:r>
         <w:rPr>
-          <w:rFonts w:eastAsia="Calibri" w:cs="Calibri" w:ascii="Calibri" w:hAnsi="Calibri"/>
+          <w:rFonts w:eastAsia="Calibri" w:cs="Calibri"/>
           <w:b/>
           <w:spacing w:val="1"/>
           <w:sz w:val="28"/>
@@ -118,7 +118,7 @@
       </w:r>
       <w:r>
         <w:rPr>
-          <w:rFonts w:eastAsia="Calibri" w:cs="Calibri" w:ascii="Calibri" w:hAnsi="Calibri"/>
+          <w:rFonts w:eastAsia="Calibri" w:cs="Calibri"/>
           <w:b/>
           <w:sz w:val="28"/>
           <w:szCs w:val="28"/>
@@ -128,7 +128,7 @@
       </w:r>
       <w:r>
         <w:rPr>
-          <w:rFonts w:eastAsia="Calibri" w:cs="Calibri" w:ascii="Calibri" w:hAnsi="Calibri"/>
+          <w:rFonts w:eastAsia="Calibri" w:cs="Calibri"/>
           <w:b/>
           <w:spacing w:val="-2"/>
           <w:sz w:val="28"/>
@@ -139,7 +139,7 @@
       </w:r>
       <w:r>
         <w:rPr>
-          <w:rFonts w:eastAsia="Calibri" w:cs="Calibri" w:ascii="Calibri" w:hAnsi="Calibri"/>
+          <w:rFonts w:eastAsia="Calibri" w:cs="Calibri"/>
           <w:b/>
           <w:spacing w:val="1"/>
           <w:sz w:val="28"/>
@@ -150,7 +150,7 @@
       </w:r>
       <w:r>
         <w:rPr>
-          <w:rFonts w:eastAsia="Calibri" w:cs="Calibri" w:ascii="Calibri" w:hAnsi="Calibri"/>
+          <w:rFonts w:eastAsia="Calibri" w:cs="Calibri"/>
           <w:b/>
           <w:sz w:val="28"/>
           <w:szCs w:val="28"/>
@@ -160,7 +160,7 @@
       </w:r>
       <w:r>
         <w:rPr>
-          <w:rFonts w:eastAsia="Calibri" w:cs="Calibri" w:ascii="Calibri" w:hAnsi="Calibri"/>
+          <w:rFonts w:eastAsia="Calibri" w:cs="Calibri"/>
           <w:b/>
           <w:spacing w:val="20"/>
           <w:sz w:val="28"/>
@@ -171,7 +171,7 @@
       </w:r>
       <w:r>
         <w:rPr>
-          <w:rFonts w:eastAsia="Calibri" w:cs="Calibri" w:ascii="Calibri" w:hAnsi="Calibri"/>
+          <w:rFonts w:eastAsia="Calibri" w:cs="Calibri"/>
           <w:b/>
           <w:spacing w:val="1"/>
           <w:sz w:val="28"/>
@@ -182,7 +182,7 @@
       </w:r>
       <w:r>
         <w:rPr>
-          <w:rFonts w:eastAsia="Calibri" w:cs="Calibri" w:ascii="Calibri" w:hAnsi="Calibri"/>
+          <w:rFonts w:eastAsia="Calibri" w:cs="Calibri"/>
           <w:b/>
           <w:spacing w:val="-2"/>
           <w:sz w:val="28"/>
@@ -193,7 +193,7 @@
       </w:r>
       <w:r>
         <w:rPr>
-          <w:rFonts w:eastAsia="Calibri" w:cs="Calibri" w:ascii="Calibri" w:hAnsi="Calibri"/>
+          <w:rFonts w:eastAsia="Calibri" w:cs="Calibri"/>
           <w:b/>
           <w:spacing w:val="1"/>
           <w:sz w:val="28"/>
@@ -204,7 +204,7 @@
       </w:r>
       <w:r>
         <w:rPr>
-          <w:rFonts w:eastAsia="Calibri" w:cs="Calibri" w:ascii="Calibri" w:hAnsi="Calibri"/>
+          <w:rFonts w:eastAsia="Calibri" w:cs="Calibri"/>
           <w:b/>
           <w:spacing w:val="-1"/>
           <w:sz w:val="28"/>
@@ -215,7 +215,7 @@
       </w:r>
       <w:r>
         <w:rPr>
-          <w:rFonts w:eastAsia="Calibri" w:cs="Calibri" w:ascii="Calibri" w:hAnsi="Calibri"/>
+          <w:rFonts w:eastAsia="Calibri" w:cs="Calibri"/>
           <w:b/>
           <w:spacing w:val="1"/>
           <w:sz w:val="28"/>
@@ -226,7 +226,7 @@
       </w:r>
       <w:r>
         <w:rPr>
-          <w:rFonts w:eastAsia="Calibri" w:cs="Calibri" w:ascii="Calibri" w:hAnsi="Calibri"/>
+          <w:rFonts w:eastAsia="Calibri" w:cs="Calibri"/>
           <w:b/>
           <w:sz w:val="28"/>
           <w:szCs w:val="28"/>
@@ -236,7 +236,7 @@
       </w:r>
       <w:r>
         <w:rPr>
-          <w:rFonts w:eastAsia="Calibri" w:cs="Calibri" w:ascii="Calibri" w:hAnsi="Calibri"/>
+          <w:rFonts w:eastAsia="Calibri" w:cs="Calibri"/>
           <w:b/>
           <w:spacing w:val="-2"/>
           <w:sz w:val="28"/>
@@ -247,7 +247,7 @@
       </w:r>
       <w:r>
         <w:rPr>
-          <w:rFonts w:eastAsia="Calibri" w:cs="Calibri" w:ascii="Calibri" w:hAnsi="Calibri"/>
+          <w:rFonts w:eastAsia="Calibri" w:cs="Calibri"/>
           <w:b/>
           <w:spacing w:val="1"/>
           <w:sz w:val="28"/>
@@ -258,7 +258,7 @@
       </w:r>
       <w:r>
         <w:rPr>
-          <w:rFonts w:eastAsia="Calibri" w:cs="Calibri" w:ascii="Calibri" w:hAnsi="Calibri"/>
+          <w:rFonts w:eastAsia="Calibri" w:cs="Calibri"/>
           <w:b/>
           <w:sz w:val="28"/>
           <w:szCs w:val="28"/>
@@ -268,7 +268,7 @@
       </w:r>
       <w:r>
         <w:rPr>
-          <w:rFonts w:eastAsia="Calibri" w:cs="Calibri" w:ascii="Calibri" w:hAnsi="Calibri"/>
+          <w:rFonts w:eastAsia="Calibri" w:cs="Calibri"/>
           <w:b/>
           <w:spacing w:val="-3"/>
           <w:sz w:val="28"/>
@@ -279,7 +279,7 @@
       </w:r>
       <w:r>
         <w:rPr>
-          <w:rFonts w:eastAsia="Calibri" w:cs="Calibri" w:ascii="Calibri" w:hAnsi="Calibri"/>
+          <w:rFonts w:eastAsia="Calibri" w:cs="Calibri"/>
           <w:b/>
           <w:sz w:val="28"/>
           <w:szCs w:val="28"/>
@@ -289,7 +289,7 @@
       </w:r>
       <w:r>
         <w:rPr>
-          <w:rFonts w:eastAsia="Calibri" w:cs="Calibri" w:ascii="Calibri" w:hAnsi="Calibri"/>
+          <w:rFonts w:eastAsia="Calibri" w:cs="Calibri"/>
           <w:b/>
           <w:spacing w:val="38"/>
           <w:sz w:val="28"/>
@@ -300,7 +300,7 @@
       </w:r>
       <w:r>
         <w:rPr>
-          <w:rFonts w:eastAsia="Calibri" w:cs="Calibri" w:ascii="Calibri" w:hAnsi="Calibri"/>
+          <w:rFonts w:eastAsia="Calibri" w:cs="Calibri"/>
           <w:b/>
           <w:spacing w:val="1"/>
           <w:w w:val="104"/>
@@ -312,7 +312,7 @@
       </w:r>
       <w:r>
         <w:rPr>
-          <w:rFonts w:eastAsia="Calibri" w:cs="Calibri" w:ascii="Calibri" w:hAnsi="Calibri"/>
+          <w:rFonts w:eastAsia="Calibri" w:cs="Calibri"/>
           <w:b/>
           <w:spacing w:val="1"/>
           <w:w w:val="107"/>
@@ -324,7 +324,7 @@
       </w:r>
       <w:r>
         <w:rPr>
-          <w:rFonts w:eastAsia="Calibri" w:cs="Calibri" w:ascii="Calibri" w:hAnsi="Calibri"/>
+          <w:rFonts w:eastAsia="Calibri" w:cs="Calibri"/>
           <w:b/>
           <w:spacing w:val="-2"/>
           <w:w w:val="102"/>
@@ -336,7 +336,7 @@
       </w:r>
       <w:r>
         <w:rPr>
-          <w:rFonts w:eastAsia="Calibri" w:cs="Calibri" w:ascii="Calibri" w:hAnsi="Calibri"/>
+          <w:rFonts w:eastAsia="Calibri" w:cs="Calibri"/>
           <w:b/>
           <w:spacing w:val="1"/>
           <w:w w:val="107"/>
@@ -348,7 +348,7 @@
       </w:r>
       <w:r>
         <w:rPr>
-          <w:rFonts w:eastAsia="Calibri" w:cs="Calibri" w:ascii="Calibri" w:hAnsi="Calibri"/>
+          <w:rFonts w:eastAsia="Calibri" w:cs="Calibri"/>
           <w:b/>
           <w:spacing w:val="1"/>
           <w:w w:val="103"/>
@@ -360,7 +360,7 @@
       </w:r>
       <w:r>
         <w:rPr>
-          <w:rFonts w:eastAsia="Calibri" w:cs="Calibri" w:ascii="Calibri" w:hAnsi="Calibri"/>
+          <w:rFonts w:eastAsia="Calibri" w:cs="Calibri"/>
           <w:b/>
           <w:spacing w:val="-1"/>
           <w:w w:val="104"/>
@@ -372,7 +372,7 @@
       </w:r>
       <w:r>
         <w:rPr>
-          <w:rFonts w:eastAsia="Calibri" w:cs="Calibri" w:ascii="Calibri" w:hAnsi="Calibri"/>
+          <w:rFonts w:eastAsia="Calibri" w:cs="Calibri"/>
           <w:b/>
           <w:w w:val="103"/>
           <w:sz w:val="28"/>
@@ -418,7 +418,7 @@
       </w:pPr>
       <w:r>
         <w:rPr>
-          <w:rFonts w:eastAsia="Calibri" w:cs="Calibri" w:ascii="Calibri" w:hAnsi="Calibri"/>
+          <w:rFonts w:eastAsia="Calibri" w:cs="Calibri"/>
           <w:b/>
           <w:sz w:val="28"/>
           <w:szCs w:val="28"/>
@@ -428,7 +428,7 @@
       </w:r>
       <w:r>
         <w:rPr>
-          <w:rFonts w:eastAsia="Calibri" w:cs="Calibri" w:ascii="Calibri" w:hAnsi="Calibri"/>
+          <w:rFonts w:eastAsia="Calibri" w:cs="Calibri"/>
           <w:b/>
           <w:spacing w:val="1"/>
           <w:sz w:val="28"/>
@@ -439,7 +439,7 @@
       </w:r>
       <w:r>
         <w:rPr>
-          <w:rFonts w:eastAsia="Calibri" w:cs="Calibri" w:ascii="Calibri" w:hAnsi="Calibri"/>
+          <w:rFonts w:eastAsia="Calibri" w:cs="Calibri"/>
           <w:b/>
           <w:spacing w:val="-2"/>
           <w:sz w:val="28"/>
@@ -450,7 +450,7 @@
       </w:r>
       <w:r>
         <w:rPr>
-          <w:rFonts w:eastAsia="Calibri" w:cs="Calibri" w:ascii="Calibri" w:hAnsi="Calibri"/>
+          <w:rFonts w:eastAsia="Calibri" w:cs="Calibri"/>
           <w:b/>
           <w:spacing w:val="1"/>
           <w:sz w:val="28"/>
@@ -461,7 +461,7 @@
       </w:r>
       <w:r>
         <w:rPr>
-          <w:rFonts w:eastAsia="Calibri" w:cs="Calibri" w:ascii="Calibri" w:hAnsi="Calibri"/>
+          <w:rFonts w:eastAsia="Calibri" w:cs="Calibri"/>
           <w:b/>
           <w:spacing w:val="-1"/>
           <w:sz w:val="28"/>
@@ -472,7 +472,7 @@
       </w:r>
       <w:r>
         <w:rPr>
-          <w:rFonts w:eastAsia="Calibri" w:cs="Calibri" w:ascii="Calibri" w:hAnsi="Calibri"/>
+          <w:rFonts w:eastAsia="Calibri" w:cs="Calibri"/>
           <w:b/>
           <w:sz w:val="28"/>
           <w:szCs w:val="28"/>
@@ -482,7 +482,7 @@
       </w:r>
       <w:r>
         <w:rPr>
-          <w:rFonts w:eastAsia="Calibri" w:cs="Calibri" w:ascii="Calibri" w:hAnsi="Calibri"/>
+          <w:rFonts w:eastAsia="Calibri" w:cs="Calibri"/>
           <w:b/>
           <w:spacing w:val="24"/>
           <w:sz w:val="28"/>
@@ -493,7 +493,7 @@
       </w:r>
       <w:r>
         <w:rPr>
-          <w:rFonts w:eastAsia="Calibri" w:cs="Calibri" w:ascii="Calibri" w:hAnsi="Calibri"/>
+          <w:rFonts w:eastAsia="Calibri" w:cs="Calibri"/>
           <w:b/>
           <w:sz w:val="28"/>
           <w:szCs w:val="28"/>
@@ -538,7 +538,7 @@
       </w:pPr>
       <w:r>
         <w:rPr>
-          <w:rFonts w:eastAsia="Calibri" w:cs="Calibri" w:ascii="Calibri" w:hAnsi="Calibri"/>
+          <w:rFonts w:eastAsia="Calibri" w:cs="Calibri"/>
           <w:b/>
           <w:sz w:val="32"/>
           <w:szCs w:val="32"/>
@@ -548,7 +548,7 @@
       </w:r>
       <w:r>
         <w:rPr>
-          <w:rFonts w:eastAsia="Calibri" w:cs="Calibri" w:ascii="Calibri" w:hAnsi="Calibri"/>
+          <w:rFonts w:eastAsia="Calibri" w:cs="Calibri"/>
           <w:b/>
           <w:spacing w:val="1"/>
           <w:sz w:val="32"/>
@@ -559,7 +559,7 @@
       </w:r>
       <w:r>
         <w:rPr>
-          <w:rFonts w:eastAsia="Calibri" w:cs="Calibri" w:ascii="Calibri" w:hAnsi="Calibri"/>
+          <w:rFonts w:eastAsia="Calibri" w:cs="Calibri"/>
           <w:b/>
           <w:sz w:val="32"/>
           <w:szCs w:val="32"/>
@@ -569,7 +569,7 @@
       </w:r>
       <w:r>
         <w:rPr>
-          <w:rFonts w:eastAsia="Calibri" w:cs="Calibri" w:ascii="Calibri" w:hAnsi="Calibri"/>
+          <w:rFonts w:eastAsia="Calibri" w:cs="Calibri"/>
           <w:b/>
           <w:spacing w:val="1"/>
           <w:sz w:val="32"/>
@@ -580,7 +580,7 @@
       </w:r>
       <w:r>
         <w:rPr>
-          <w:rFonts w:eastAsia="Calibri" w:cs="Calibri" w:ascii="Calibri" w:hAnsi="Calibri"/>
+          <w:rFonts w:eastAsia="Calibri" w:cs="Calibri"/>
           <w:b/>
           <w:sz w:val="32"/>
           <w:szCs w:val="32"/>
@@ -590,7 +590,7 @@
       </w:r>
       <w:r>
         <w:rPr>
-          <w:rFonts w:eastAsia="Calibri" w:cs="Calibri" w:ascii="Calibri" w:hAnsi="Calibri"/>
+          <w:rFonts w:eastAsia="Calibri" w:cs="Calibri"/>
           <w:b/>
           <w:spacing w:val="19"/>
           <w:sz w:val="32"/>
@@ -601,7 +601,7 @@
       </w:r>
       <w:r>
         <w:rPr>
-          <w:rFonts w:eastAsia="Calibri" w:cs="Calibri" w:ascii="Calibri" w:hAnsi="Calibri"/>
+          <w:rFonts w:eastAsia="Calibri" w:cs="Calibri"/>
           <w:b/>
           <w:spacing w:val="1"/>
           <w:sz w:val="32"/>
@@ -612,7 +612,7 @@
       </w:r>
       <w:r>
         <w:rPr>
-          <w:rFonts w:eastAsia="Calibri" w:cs="Calibri" w:ascii="Calibri" w:hAnsi="Calibri"/>
+          <w:rFonts w:eastAsia="Calibri" w:cs="Calibri"/>
           <w:b/>
           <w:sz w:val="32"/>
           <w:szCs w:val="32"/>
@@ -622,7 +622,7 @@
       </w:r>
       <w:r>
         <w:rPr>
-          <w:rFonts w:eastAsia="Calibri" w:cs="Calibri" w:ascii="Calibri" w:hAnsi="Calibri"/>
+          <w:rFonts w:eastAsia="Calibri" w:cs="Calibri"/>
           <w:b/>
           <w:spacing w:val="-1"/>
           <w:sz w:val="32"/>
@@ -633,7 +633,7 @@
       </w:r>
       <w:r>
         <w:rPr>
-          <w:rFonts w:eastAsia="Calibri" w:cs="Calibri" w:ascii="Calibri" w:hAnsi="Calibri"/>
+          <w:rFonts w:eastAsia="Calibri" w:cs="Calibri"/>
           <w:b/>
           <w:spacing w:val="2"/>
           <w:sz w:val="32"/>
@@ -644,7 +644,7 @@
       </w:r>
       <w:r>
         <w:rPr>
-          <w:rFonts w:eastAsia="Calibri" w:cs="Calibri" w:ascii="Calibri" w:hAnsi="Calibri"/>
+          <w:rFonts w:eastAsia="Calibri" w:cs="Calibri"/>
           <w:b/>
           <w:spacing w:val="-1"/>
           <w:sz w:val="32"/>
@@ -655,7 +655,7 @@
       </w:r>
       <w:r>
         <w:rPr>
-          <w:rFonts w:eastAsia="Calibri" w:cs="Calibri" w:ascii="Calibri" w:hAnsi="Calibri"/>
+          <w:rFonts w:eastAsia="Calibri" w:cs="Calibri"/>
           <w:b/>
           <w:sz w:val="32"/>
           <w:szCs w:val="32"/>
@@ -665,7 +665,7 @@
       </w:r>
       <w:r>
         <w:rPr>
-          <w:rFonts w:eastAsia="Calibri" w:cs="Calibri" w:ascii="Calibri" w:hAnsi="Calibri"/>
+          <w:rFonts w:eastAsia="Calibri" w:cs="Calibri"/>
           <w:b/>
           <w:spacing w:val="21"/>
           <w:sz w:val="32"/>
@@ -676,7 +676,7 @@
       </w:r>
       <w:r>
         <w:rPr>
-          <w:rFonts w:eastAsia="Calibri" w:cs="Calibri" w:ascii="Calibri" w:hAnsi="Calibri"/>
+          <w:rFonts w:eastAsia="Calibri" w:cs="Calibri"/>
           <w:b/>
           <w:spacing w:val="-1"/>
           <w:sz w:val="32"/>
@@ -687,7 +687,7 @@
       </w:r>
       <w:r>
         <w:rPr>
-          <w:rFonts w:eastAsia="Calibri" w:cs="Calibri" w:ascii="Calibri" w:hAnsi="Calibri"/>
+          <w:rFonts w:eastAsia="Calibri" w:cs="Calibri"/>
           <w:b/>
           <w:sz w:val="32"/>
           <w:szCs w:val="32"/>
@@ -697,7 +697,7 @@
       </w:r>
       <w:r>
         <w:rPr>
-          <w:rFonts w:eastAsia="Calibri" w:cs="Calibri" w:ascii="Calibri" w:hAnsi="Calibri"/>
+          <w:rFonts w:eastAsia="Calibri" w:cs="Calibri"/>
           <w:b/>
           <w:spacing w:val="5"/>
           <w:sz w:val="32"/>
@@ -708,7 +708,7 @@
       </w:r>
       <w:r>
         <w:rPr>
-          <w:rFonts w:eastAsia="Calibri" w:cs="Calibri" w:ascii="Calibri" w:hAnsi="Calibri"/>
+          <w:rFonts w:eastAsia="Calibri" w:cs="Calibri"/>
           <w:b/>
           <w:sz w:val="32"/>
           <w:szCs w:val="32"/>
@@ -718,7 +718,7 @@
       </w:r>
       <w:r>
         <w:rPr>
-          <w:rFonts w:eastAsia="Calibri" w:cs="Calibri" w:ascii="Calibri" w:hAnsi="Calibri"/>
+          <w:rFonts w:eastAsia="Calibri" w:cs="Calibri"/>
           <w:b/>
           <w:spacing w:val="1"/>
           <w:sz w:val="32"/>
@@ -729,7 +729,7 @@
       </w:r>
       <w:r>
         <w:rPr>
-          <w:rFonts w:eastAsia="Calibri" w:cs="Calibri" w:ascii="Calibri" w:hAnsi="Calibri"/>
+          <w:rFonts w:eastAsia="Calibri" w:cs="Calibri"/>
           <w:b/>
           <w:spacing w:val="2"/>
           <w:sz w:val="32"/>
@@ -740,7 +740,7 @@
       </w:r>
       <w:r>
         <w:rPr>
-          <w:rFonts w:eastAsia="Calibri" w:cs="Calibri" w:ascii="Calibri" w:hAnsi="Calibri"/>
+          <w:rFonts w:eastAsia="Calibri" w:cs="Calibri"/>
           <w:b/>
           <w:spacing w:val="-1"/>
           <w:sz w:val="32"/>
@@ -751,7 +751,7 @@
       </w:r>
       <w:r>
         <w:rPr>
-          <w:rFonts w:eastAsia="Calibri" w:cs="Calibri" w:ascii="Calibri" w:hAnsi="Calibri"/>
+          <w:rFonts w:eastAsia="Calibri" w:cs="Calibri"/>
           <w:b/>
           <w:sz w:val="32"/>
           <w:szCs w:val="32"/>
@@ -761,7 +761,7 @@
       </w:r>
       <w:r>
         <w:rPr>
-          <w:rFonts w:eastAsia="Calibri" w:cs="Calibri" w:ascii="Calibri" w:hAnsi="Calibri"/>
+          <w:rFonts w:eastAsia="Calibri" w:cs="Calibri"/>
           <w:b/>
           <w:spacing w:val="17"/>
           <w:sz w:val="32"/>
@@ -772,7 +772,7 @@
       </w:r>
       <w:r>
         <w:rPr>
-          <w:rFonts w:eastAsia="Calibri" w:cs="Calibri" w:ascii="Calibri" w:hAnsi="Calibri"/>
+          <w:rFonts w:eastAsia="Calibri" w:cs="Calibri"/>
           <w:b/>
           <w:sz w:val="32"/>
           <w:szCs w:val="32"/>
@@ -782,7 +782,7 @@
       </w:r>
       <w:r>
         <w:rPr>
-          <w:rFonts w:eastAsia="Calibri" w:cs="Calibri" w:ascii="Calibri" w:hAnsi="Calibri"/>
+          <w:rFonts w:eastAsia="Calibri" w:cs="Calibri"/>
           <w:b/>
           <w:spacing w:val="1"/>
           <w:sz w:val="32"/>
@@ -793,7 +793,7 @@
       </w:r>
       <w:r>
         <w:rPr>
-          <w:rFonts w:eastAsia="Calibri" w:cs="Calibri" w:ascii="Calibri" w:hAnsi="Calibri"/>
+          <w:rFonts w:eastAsia="Calibri" w:cs="Calibri"/>
           <w:b/>
           <w:sz w:val="32"/>
           <w:szCs w:val="32"/>
@@ -803,7 +803,7 @@
       </w:r>
       <w:r>
         <w:rPr>
-          <w:rFonts w:eastAsia="Calibri" w:cs="Calibri" w:ascii="Calibri" w:hAnsi="Calibri"/>
+          <w:rFonts w:eastAsia="Calibri" w:cs="Calibri"/>
           <w:b/>
           <w:spacing w:val="-1"/>
           <w:sz w:val="32"/>
@@ -814,7 +814,7 @@
       </w:r>
       <w:r>
         <w:rPr>
-          <w:rFonts w:eastAsia="Calibri" w:cs="Calibri" w:ascii="Calibri" w:hAnsi="Calibri"/>
+          <w:rFonts w:eastAsia="Calibri" w:cs="Calibri"/>
           <w:b/>
           <w:sz w:val="32"/>
           <w:szCs w:val="32"/>
@@ -824,7 +824,7 @@
       </w:r>
       <w:r>
         <w:rPr>
-          <w:rFonts w:eastAsia="Calibri" w:cs="Calibri" w:ascii="Calibri" w:hAnsi="Calibri"/>
+          <w:rFonts w:eastAsia="Calibri" w:cs="Calibri"/>
           <w:b/>
           <w:spacing w:val="3"/>
           <w:sz w:val="32"/>
@@ -835,7 +835,7 @@
       </w:r>
       <w:r>
         <w:rPr>
-          <w:rFonts w:eastAsia="Calibri" w:cs="Calibri" w:ascii="Calibri" w:hAnsi="Calibri"/>
+          <w:rFonts w:eastAsia="Calibri" w:cs="Calibri"/>
           <w:b/>
           <w:spacing w:val="-1"/>
           <w:sz w:val="32"/>
@@ -846,7 +846,7 @@
       </w:r>
       <w:r>
         <w:rPr>
-          <w:rFonts w:eastAsia="Calibri" w:cs="Calibri" w:ascii="Calibri" w:hAnsi="Calibri"/>
+          <w:rFonts w:eastAsia="Calibri" w:cs="Calibri"/>
           <w:b/>
           <w:sz w:val="32"/>
           <w:szCs w:val="32"/>
@@ -856,7 +856,7 @@
       </w:r>
       <w:r>
         <w:rPr>
-          <w:rFonts w:eastAsia="Calibri" w:cs="Calibri" w:ascii="Calibri" w:hAnsi="Calibri"/>
+          <w:rFonts w:eastAsia="Calibri" w:cs="Calibri"/>
           <w:b/>
           <w:spacing w:val="9"/>
           <w:sz w:val="32"/>
@@ -867,7 +867,7 @@
       </w:r>
       <w:r>
         <w:rPr>
-          <w:rFonts w:eastAsia="Calibri" w:cs="Calibri" w:ascii="Calibri" w:hAnsi="Calibri"/>
+          <w:rFonts w:eastAsia="Calibri" w:cs="Calibri"/>
           <w:b/>
           <w:sz w:val="32"/>
           <w:szCs w:val="32"/>
@@ -877,7 +877,7 @@
       </w:r>
       <w:r>
         <w:rPr>
-          <w:rFonts w:eastAsia="Calibri" w:cs="Calibri" w:ascii="Calibri" w:hAnsi="Calibri"/>
+          <w:rFonts w:eastAsia="Calibri" w:cs="Calibri"/>
           <w:b/>
           <w:spacing w:val="1"/>
           <w:sz w:val="32"/>
@@ -888,7 +888,7 @@
       </w:r>
       <w:r>
         <w:rPr>
-          <w:rFonts w:eastAsia="Calibri" w:cs="Calibri" w:ascii="Calibri" w:hAnsi="Calibri"/>
+          <w:rFonts w:eastAsia="Calibri" w:cs="Calibri"/>
           <w:b/>
           <w:spacing w:val="-1"/>
           <w:sz w:val="32"/>
@@ -899,7 +899,7 @@
       </w:r>
       <w:r>
         <w:rPr>
-          <w:rFonts w:eastAsia="Calibri" w:cs="Calibri" w:ascii="Calibri" w:hAnsi="Calibri"/>
+          <w:rFonts w:eastAsia="Calibri" w:cs="Calibri"/>
           <w:b/>
           <w:sz w:val="32"/>
           <w:szCs w:val="32"/>
@@ -909,7 +909,7 @@
       </w:r>
       <w:r>
         <w:rPr>
-          <w:rFonts w:eastAsia="Calibri" w:cs="Calibri" w:ascii="Calibri" w:hAnsi="Calibri"/>
+          <w:rFonts w:eastAsia="Calibri" w:cs="Calibri"/>
           <w:b/>
           <w:spacing w:val="27"/>
           <w:sz w:val="32"/>
@@ -920,7 +920,7 @@
       </w:r>
       <w:r>
         <w:rPr>
-          <w:rFonts w:eastAsia="Calibri" w:cs="Calibri" w:ascii="Calibri" w:hAnsi="Calibri"/>
+          <w:rFonts w:eastAsia="Calibri" w:cs="Calibri"/>
           <w:b/>
           <w:spacing w:val="1"/>
           <w:w w:val="101"/>
@@ -932,7 +932,7 @@
       </w:r>
       <w:r>
         <w:rPr>
-          <w:rFonts w:eastAsia="Calibri" w:cs="Calibri" w:ascii="Calibri" w:hAnsi="Calibri"/>
+          <w:rFonts w:eastAsia="Calibri" w:cs="Calibri"/>
           <w:b/>
           <w:spacing w:val="-1"/>
           <w:w w:val="101"/>
@@ -944,7 +944,7 @@
       </w:r>
       <w:r>
         <w:rPr>
-          <w:rFonts w:eastAsia="Calibri" w:cs="Calibri" w:ascii="Calibri" w:hAnsi="Calibri"/>
+          <w:rFonts w:eastAsia="Calibri" w:cs="Calibri"/>
           <w:b/>
           <w:spacing w:val="1"/>
           <w:w w:val="101"/>
@@ -956,7 +956,7 @@
       </w:r>
       <w:r>
         <w:rPr>
-          <w:rFonts w:eastAsia="Calibri" w:cs="Calibri" w:ascii="Calibri" w:hAnsi="Calibri"/>
+          <w:rFonts w:eastAsia="Calibri" w:cs="Calibri"/>
           <w:b/>
           <w:spacing w:val="-1"/>
           <w:w w:val="101"/>
@@ -968,7 +968,7 @@
       </w:r>
       <w:r>
         <w:rPr>
-          <w:rFonts w:eastAsia="Calibri" w:cs="Calibri" w:ascii="Calibri" w:hAnsi="Calibri"/>
+          <w:rFonts w:eastAsia="Calibri" w:cs="Calibri"/>
           <w:b/>
           <w:w w:val="101"/>
           <w:sz w:val="32"/>
@@ -1014,7 +1014,7 @@
       </w:pPr>
       <w:r>
         <w:rPr>
-          <w:rFonts w:eastAsia="Calibri" w:cs="Calibri" w:ascii="Calibri" w:hAnsi="Calibri"/>
+          <w:rFonts w:eastAsia="Calibri" w:cs="Calibri"/>
           <w:b/>
           <w:sz w:val="36"/>
           <w:szCs w:val="36"/>
@@ -1024,7 +1024,7 @@
       </w:r>
       <w:r>
         <w:rPr>
-          <w:rFonts w:eastAsia="Calibri" w:cs="Calibri" w:ascii="Calibri" w:hAnsi="Calibri"/>
+          <w:rFonts w:eastAsia="Calibri" w:cs="Calibri"/>
           <w:b/>
           <w:spacing w:val="1"/>
           <w:sz w:val="36"/>
@@ -1035,7 +1035,7 @@
       </w:r>
       <w:r>
         <w:rPr>
-          <w:rFonts w:eastAsia="Calibri" w:cs="Calibri" w:ascii="Calibri" w:hAnsi="Calibri"/>
+          <w:rFonts w:eastAsia="Calibri" w:cs="Calibri"/>
           <w:b/>
           <w:sz w:val="36"/>
           <w:szCs w:val="36"/>
@@ -1045,7 +1045,7 @@
       </w:r>
       <w:r>
         <w:rPr>
-          <w:rFonts w:eastAsia="Calibri" w:cs="Calibri" w:ascii="Calibri" w:hAnsi="Calibri"/>
+          <w:rFonts w:eastAsia="Calibri" w:cs="Calibri"/>
           <w:b/>
           <w:spacing w:val="1"/>
           <w:sz w:val="36"/>
@@ -1056,7 +1056,7 @@
       </w:r>
       <w:r>
         <w:rPr>
-          <w:rFonts w:eastAsia="Calibri" w:cs="Calibri" w:ascii="Calibri" w:hAnsi="Calibri"/>
+          <w:rFonts w:eastAsia="Calibri" w:cs="Calibri"/>
           <w:b/>
           <w:sz w:val="36"/>
           <w:szCs w:val="36"/>
@@ -1066,7 +1066,7 @@
       </w:r>
       <w:r>
         <w:rPr>
-          <w:rFonts w:eastAsia="Calibri" w:cs="Calibri" w:ascii="Calibri" w:hAnsi="Calibri"/>
+          <w:rFonts w:eastAsia="Calibri" w:cs="Calibri"/>
           <w:b/>
           <w:spacing w:val="-2"/>
           <w:sz w:val="36"/>
@@ -1077,7 +1077,7 @@
       </w:r>
       <w:r>
         <w:rPr>
-          <w:rFonts w:eastAsia="Calibri" w:cs="Calibri" w:ascii="Calibri" w:hAnsi="Calibri"/>
+          <w:rFonts w:eastAsia="Calibri" w:cs="Calibri"/>
           <w:b/>
           <w:spacing w:val="1"/>
           <w:sz w:val="36"/>
@@ -1088,7 +1088,7 @@
       </w:r>
       <w:r>
         <w:rPr>
-          <w:rFonts w:eastAsia="Calibri" w:cs="Calibri" w:ascii="Calibri" w:hAnsi="Calibri"/>
+          <w:rFonts w:eastAsia="Calibri" w:cs="Calibri"/>
           <w:b/>
           <w:sz w:val="36"/>
           <w:szCs w:val="36"/>
@@ -1098,7 +1098,7 @@
       </w:r>
       <w:r>
         <w:rPr>
-          <w:rFonts w:eastAsia="Calibri" w:cs="Calibri" w:ascii="Calibri" w:hAnsi="Calibri"/>
+          <w:rFonts w:eastAsia="Calibri" w:cs="Calibri"/>
           <w:b/>
           <w:spacing w:val="51"/>
           <w:sz w:val="36"/>
@@ -1109,7 +1109,7 @@
       </w:r>
       <w:r>
         <w:rPr>
-          <w:rFonts w:eastAsia="Calibri" w:cs="Calibri" w:ascii="Calibri" w:hAnsi="Calibri"/>
+          <w:rFonts w:eastAsia="Calibri" w:cs="Calibri"/>
           <w:b/>
           <w:spacing w:val="1"/>
           <w:w w:val="107"/>
@@ -1121,7 +1121,7 @@
       </w:r>
       <w:r>
         <w:rPr>
-          <w:rFonts w:eastAsia="Calibri" w:cs="Calibri" w:ascii="Calibri" w:hAnsi="Calibri"/>
+          <w:rFonts w:eastAsia="Calibri" w:cs="Calibri"/>
           <w:b/>
           <w:spacing w:val="1"/>
           <w:w w:val="102"/>
@@ -1133,7 +1133,7 @@
       </w:r>
       <w:r>
         <w:rPr>
-          <w:rFonts w:eastAsia="Calibri" w:cs="Calibri" w:ascii="Calibri" w:hAnsi="Calibri"/>
+          <w:rFonts w:eastAsia="Calibri" w:cs="Calibri"/>
           <w:b/>
           <w:spacing w:val="-1"/>
           <w:w w:val="103"/>
@@ -1145,7 +1145,7 @@
       </w:r>
       <w:r>
         <w:rPr>
-          <w:rFonts w:eastAsia="Calibri" w:cs="Calibri" w:ascii="Calibri" w:hAnsi="Calibri"/>
+          <w:rFonts w:eastAsia="Calibri" w:cs="Calibri"/>
           <w:b/>
           <w:spacing w:val="-1"/>
           <w:w w:val="101"/>
@@ -1157,7 +1157,7 @@
       </w:r>
       <w:r>
         <w:rPr>
-          <w:rFonts w:eastAsia="Calibri" w:cs="Calibri" w:ascii="Calibri" w:hAnsi="Calibri"/>
+          <w:rFonts w:eastAsia="Calibri" w:cs="Calibri"/>
           <w:b/>
           <w:w w:val="101"/>
           <w:sz w:val="36"/>
@@ -1168,7 +1168,7 @@
       </w:r>
       <w:r>
         <w:rPr>
-          <w:rFonts w:eastAsia="Calibri" w:cs="Calibri" w:ascii="Calibri" w:hAnsi="Calibri"/>
+          <w:rFonts w:eastAsia="Calibri" w:cs="Calibri"/>
           <w:b/>
           <w:w w:val="102"/>
           <w:sz w:val="36"/>
@@ -1179,7 +1179,7 @@
       </w:r>
       <w:r>
         <w:rPr>
-          <w:rFonts w:eastAsia="Calibri" w:cs="Calibri" w:ascii="Calibri" w:hAnsi="Calibri"/>
+          <w:rFonts w:eastAsia="Calibri" w:cs="Calibri"/>
           <w:b/>
           <w:w w:val="103"/>
           <w:sz w:val="36"/>
@@ -1190,7 +1190,7 @@
       </w:r>
       <w:r>
         <w:rPr>
-          <w:rFonts w:eastAsia="Calibri" w:cs="Calibri" w:ascii="Calibri" w:hAnsi="Calibri"/>
+          <w:rFonts w:eastAsia="Calibri" w:cs="Calibri"/>
           <w:b/>
           <w:spacing w:val="1"/>
           <w:w w:val="107"/>
@@ -1202,7 +1202,7 @@
       </w:r>
       <w:r>
         <w:rPr>
-          <w:rFonts w:eastAsia="Calibri" w:cs="Calibri" w:ascii="Calibri" w:hAnsi="Calibri"/>
+          <w:rFonts w:eastAsia="Calibri" w:cs="Calibri"/>
           <w:b/>
           <w:w w:val="105"/>
           <w:sz w:val="36"/>
@@ -1213,7 +1213,7 @@
       </w:r>
       <w:r>
         <w:rPr>
-          <w:rFonts w:eastAsia="Calibri" w:cs="Calibri" w:ascii="Calibri" w:hAnsi="Calibri"/>
+          <w:rFonts w:eastAsia="Calibri" w:cs="Calibri"/>
           <w:b/>
           <w:w w:val="102"/>
           <w:sz w:val="36"/>
@@ -1317,7 +1317,7 @@
       </w:pPr>
       <w:r>
         <w:rPr>
-          <w:rFonts w:eastAsia="Calibri" w:cs="Calibri" w:ascii="Calibri" w:hAnsi="Calibri"/>
+          <w:rFonts w:eastAsia="Calibri" w:cs="Calibri"/>
           <w:b/>
           <w:spacing w:val="1"/>
           <w:lang w:val="cs-CZ"/>
@@ -1326,7 +1326,7 @@
       </w:r>
       <w:r>
         <w:rPr>
-          <w:rFonts w:eastAsia="Calibri" w:cs="Calibri" w:ascii="Calibri" w:hAnsi="Calibri"/>
+          <w:rFonts w:eastAsia="Calibri" w:cs="Calibri"/>
           <w:b/>
           <w:lang w:val="cs-CZ"/>
         </w:rPr>
@@ -1334,7 +1334,7 @@
       </w:r>
       <w:r>
         <w:rPr>
-          <w:rFonts w:eastAsia="Calibri" w:cs="Calibri" w:ascii="Calibri" w:hAnsi="Calibri"/>
+          <w:rFonts w:eastAsia="Calibri" w:cs="Calibri"/>
           <w:b/>
           <w:spacing w:val="-1"/>
           <w:lang w:val="cs-CZ"/>
@@ -1343,7 +1343,7 @@
       </w:r>
       <w:r>
         <w:rPr>
-          <w:rFonts w:eastAsia="Calibri" w:cs="Calibri" w:ascii="Calibri" w:hAnsi="Calibri"/>
+          <w:rFonts w:eastAsia="Calibri" w:cs="Calibri"/>
           <w:b/>
           <w:lang w:val="cs-CZ"/>
         </w:rPr>
@@ -1351,7 +1351,7 @@
       </w:r>
       <w:r>
         <w:rPr>
-          <w:rFonts w:eastAsia="Calibri" w:cs="Calibri" w:ascii="Calibri" w:hAnsi="Calibri"/>
+          <w:rFonts w:eastAsia="Calibri" w:cs="Calibri"/>
           <w:b/>
           <w:spacing w:val="1"/>
           <w:lang w:val="cs-CZ"/>
@@ -1360,7 +1360,7 @@
       </w:r>
       <w:r>
         <w:rPr>
-          <w:rFonts w:eastAsia="Calibri" w:cs="Calibri" w:ascii="Calibri" w:hAnsi="Calibri"/>
+          <w:rFonts w:eastAsia="Calibri" w:cs="Calibri"/>
           <w:b/>
           <w:spacing w:val="-1"/>
           <w:lang w:val="cs-CZ"/>
@@ -1369,7 +1369,7 @@
       </w:r>
       <w:r>
         <w:rPr>
-          <w:rFonts w:eastAsia="Calibri" w:cs="Calibri" w:ascii="Calibri" w:hAnsi="Calibri"/>
+          <w:rFonts w:eastAsia="Calibri" w:cs="Calibri"/>
           <w:b/>
           <w:lang w:val="cs-CZ"/>
         </w:rPr>
@@ -1377,7 +1377,7 @@
       </w:r>
       <w:r>
         <w:rPr>
-          <w:rFonts w:eastAsia="Calibri" w:cs="Calibri" w:ascii="Calibri" w:hAnsi="Calibri"/>
+          <w:rFonts w:eastAsia="Calibri" w:cs="Calibri"/>
           <w:b/>
           <w:spacing w:val="-1"/>
           <w:lang w:val="cs-CZ"/>
@@ -1386,7 +1386,7 @@
       </w:r>
       <w:r>
         <w:rPr>
-          <w:rFonts w:eastAsia="Calibri" w:cs="Calibri" w:ascii="Calibri" w:hAnsi="Calibri"/>
+          <w:rFonts w:eastAsia="Calibri" w:cs="Calibri"/>
           <w:b/>
           <w:spacing w:val="1"/>
           <w:lang w:val="cs-CZ"/>
@@ -1395,7 +1395,7 @@
       </w:r>
       <w:r>
         <w:rPr>
-          <w:rFonts w:eastAsia="Calibri" w:cs="Calibri" w:ascii="Calibri" w:hAnsi="Calibri"/>
+          <w:rFonts w:eastAsia="Calibri" w:cs="Calibri"/>
           <w:b/>
           <w:spacing w:val="-1"/>
           <w:lang w:val="cs-CZ"/>
@@ -1404,7 +1404,7 @@
       </w:r>
       <w:r>
         <w:rPr>
-          <w:rFonts w:eastAsia="Calibri" w:cs="Calibri" w:ascii="Calibri" w:hAnsi="Calibri"/>
+          <w:rFonts w:eastAsia="Calibri" w:cs="Calibri"/>
           <w:b/>
           <w:lang w:val="cs-CZ"/>
         </w:rPr>
@@ -1412,7 +1412,7 @@
       </w:r>
       <w:r>
         <w:rPr>
-          <w:rFonts w:eastAsia="Calibri" w:cs="Calibri" w:ascii="Calibri" w:hAnsi="Calibri"/>
+          <w:rFonts w:eastAsia="Calibri" w:cs="Calibri"/>
           <w:b/>
           <w:spacing w:val="-1"/>
           <w:lang w:val="cs-CZ"/>
@@ -1421,7 +1421,7 @@
       </w:r>
       <w:r>
         <w:rPr>
-          <w:rFonts w:eastAsia="Calibri" w:cs="Calibri" w:ascii="Calibri" w:hAnsi="Calibri"/>
+          <w:rFonts w:eastAsia="Calibri" w:cs="Calibri"/>
           <w:b/>
           <w:spacing w:val="1"/>
           <w:lang w:val="cs-CZ"/>
@@ -1430,7 +1430,7 @@
       </w:r>
       <w:r>
         <w:rPr>
-          <w:rFonts w:eastAsia="Calibri" w:cs="Calibri" w:ascii="Calibri" w:hAnsi="Calibri"/>
+          <w:rFonts w:eastAsia="Calibri" w:cs="Calibri"/>
           <w:b/>
           <w:spacing w:val="-1"/>
           <w:lang w:val="cs-CZ"/>
@@ -1439,7 +1439,7 @@
       </w:r>
       <w:r>
         <w:rPr>
-          <w:rFonts w:eastAsia="Calibri" w:cs="Calibri" w:ascii="Calibri" w:hAnsi="Calibri"/>
+          <w:rFonts w:eastAsia="Calibri" w:cs="Calibri"/>
           <w:b/>
           <w:lang w:val="cs-CZ"/>
         </w:rPr>
@@ -1447,7 +1447,7 @@
       </w:r>
       <w:r>
         <w:rPr>
-          <w:rFonts w:eastAsia="Calibri" w:cs="Calibri" w:ascii="Calibri" w:hAnsi="Calibri"/>
+          <w:rFonts w:eastAsia="Calibri" w:cs="Calibri"/>
           <w:b/>
           <w:spacing w:val="-1"/>
           <w:lang w:val="cs-CZ"/>
@@ -1456,7 +1456,7 @@
       </w:r>
       <w:r>
         <w:rPr>
-          <w:rFonts w:eastAsia="Calibri" w:cs="Calibri" w:ascii="Calibri" w:hAnsi="Calibri"/>
+          <w:rFonts w:eastAsia="Calibri" w:cs="Calibri"/>
           <w:b/>
           <w:lang w:val="cs-CZ"/>
         </w:rPr>
@@ -1464,7 +1464,7 @@
       </w:r>
       <w:r>
         <w:rPr>
-          <w:rFonts w:eastAsia="Calibri" w:cs="Calibri" w:ascii="Calibri" w:hAnsi="Calibri"/>
+          <w:rFonts w:eastAsia="Calibri" w:cs="Calibri"/>
           <w:b/>
           <w:spacing w:val="-1"/>
           <w:lang w:val="cs-CZ"/>
@@ -1473,7 +1473,7 @@
       </w:r>
       <w:r>
         <w:rPr>
-          <w:rFonts w:eastAsia="Calibri" w:cs="Calibri" w:ascii="Calibri" w:hAnsi="Calibri"/>
+          <w:rFonts w:eastAsia="Calibri" w:cs="Calibri"/>
           <w:b/>
           <w:spacing w:val="1"/>
           <w:lang w:val="cs-CZ"/>
@@ -1482,7 +1482,7 @@
       </w:r>
       <w:r>
         <w:rPr>
-          <w:rFonts w:eastAsia="Calibri" w:cs="Calibri" w:ascii="Calibri" w:hAnsi="Calibri"/>
+          <w:rFonts w:eastAsia="Calibri" w:cs="Calibri"/>
           <w:b/>
           <w:lang w:val="cs-CZ"/>
         </w:rPr>
@@ -1490,7 +1490,7 @@
       </w:r>
       <w:r>
         <w:rPr>
-          <w:rFonts w:eastAsia="Calibri" w:cs="Calibri" w:ascii="Calibri" w:hAnsi="Calibri"/>
+          <w:rFonts w:eastAsia="Calibri" w:cs="Calibri"/>
           <w:b/>
           <w:spacing w:val="1"/>
           <w:lang w:val="cs-CZ"/>
@@ -1499,7 +1499,7 @@
       </w:r>
       <w:r>
         <w:rPr>
-          <w:rFonts w:eastAsia="Calibri" w:cs="Calibri" w:ascii="Calibri" w:hAnsi="Calibri"/>
+          <w:rFonts w:eastAsia="Calibri" w:cs="Calibri"/>
           <w:b/>
           <w:lang w:val="cs-CZ"/>
         </w:rPr>
@@ -1507,7 +1507,7 @@
       </w:r>
       <w:r>
         <w:rPr>
-          <w:rFonts w:eastAsia="Calibri" w:cs="Calibri" w:ascii="Calibri" w:hAnsi="Calibri"/>
+          <w:rFonts w:eastAsia="Calibri" w:cs="Calibri"/>
           <w:b/>
           <w:spacing w:val="-1"/>
           <w:lang w:val="cs-CZ"/>
@@ -1516,7 +1516,7 @@
       </w:r>
       <w:r>
         <w:rPr>
-          <w:rFonts w:eastAsia="Calibri" w:cs="Calibri" w:ascii="Calibri" w:hAnsi="Calibri"/>
+          <w:rFonts w:eastAsia="Calibri" w:cs="Calibri"/>
           <w:b/>
           <w:lang w:val="cs-CZ"/>
         </w:rPr>
@@ -1524,7 +1524,7 @@
       </w:r>
       <w:r>
         <w:rPr>
-          <w:rFonts w:eastAsia="Calibri" w:cs="Calibri" w:ascii="Calibri" w:hAnsi="Calibri"/>
+          <w:rFonts w:eastAsia="Calibri" w:cs="Calibri"/>
           <w:b/>
           <w:spacing w:val="1"/>
           <w:lang w:val="cs-CZ"/>
@@ -1533,7 +1533,7 @@
       </w:r>
       <w:r>
         <w:rPr>
-          <w:rFonts w:eastAsia="Calibri" w:cs="Calibri" w:ascii="Calibri" w:hAnsi="Calibri"/>
+          <w:rFonts w:eastAsia="Calibri" w:cs="Calibri"/>
           <w:b/>
           <w:lang w:val="cs-CZ"/>
         </w:rPr>
@@ -1541,7 +1541,7 @@
       </w:r>
       <w:r>
         <w:rPr>
-          <w:rFonts w:eastAsia="Calibri" w:cs="Calibri" w:ascii="Calibri" w:hAnsi="Calibri"/>
+          <w:rFonts w:eastAsia="Calibri" w:cs="Calibri"/>
           <w:b/>
           <w:spacing w:val="-1"/>
           <w:lang w:val="cs-CZ"/>
@@ -1550,7 +1550,7 @@
       </w:r>
       <w:r>
         <w:rPr>
-          <w:rFonts w:eastAsia="Calibri" w:cs="Calibri" w:ascii="Calibri" w:hAnsi="Calibri"/>
+          <w:rFonts w:eastAsia="Calibri" w:cs="Calibri"/>
           <w:b/>
           <w:spacing w:val="1"/>
           <w:lang w:val="cs-CZ"/>
@@ -1559,7 +1559,7 @@
       </w:r>
       <w:r>
         <w:rPr>
-          <w:rFonts w:eastAsia="Calibri" w:cs="Calibri" w:ascii="Calibri" w:hAnsi="Calibri"/>
+          <w:rFonts w:eastAsia="Calibri" w:cs="Calibri"/>
           <w:b/>
           <w:lang w:val="cs-CZ"/>
         </w:rPr>
@@ -1567,7 +1567,7 @@
       </w:r>
       <w:r>
         <w:rPr>
-          <w:rFonts w:eastAsia="Calibri" w:cs="Calibri" w:ascii="Calibri" w:hAnsi="Calibri"/>
+          <w:rFonts w:eastAsia="Calibri" w:cs="Calibri"/>
           <w:b/>
           <w:spacing w:val="1"/>
           <w:lang w:val="cs-CZ"/>
@@ -1576,7 +1576,7 @@
       </w:r>
       <w:r>
         <w:rPr>
-          <w:rFonts w:eastAsia="Calibri" w:cs="Calibri" w:ascii="Calibri" w:hAnsi="Calibri"/>
+          <w:rFonts w:eastAsia="Calibri" w:cs="Calibri"/>
           <w:b/>
           <w:spacing w:val="-1"/>
           <w:lang w:val="cs-CZ"/>
@@ -1585,7 +1585,7 @@
       </w:r>
       <w:r>
         <w:rPr>
-          <w:rFonts w:eastAsia="Calibri" w:cs="Calibri" w:ascii="Calibri" w:hAnsi="Calibri"/>
+          <w:rFonts w:eastAsia="Calibri" w:cs="Calibri"/>
           <w:b/>
           <w:spacing w:val="-3"/>
           <w:lang w:val="cs-CZ"/>
@@ -1594,7 +1594,7 @@
       </w:r>
       <w:r>
         <w:rPr>
-          <w:rFonts w:eastAsia="Calibri" w:cs="Calibri" w:ascii="Calibri" w:hAnsi="Calibri"/>
+          <w:rFonts w:eastAsia="Calibri" w:cs="Calibri"/>
           <w:b/>
           <w:spacing w:val="-1"/>
           <w:lang w:val="cs-CZ"/>
@@ -1603,7 +1603,7 @@
       </w:r>
       <w:r>
         <w:rPr>
-          <w:rFonts w:eastAsia="Calibri" w:cs="Calibri" w:ascii="Calibri" w:hAnsi="Calibri"/>
+          <w:rFonts w:eastAsia="Calibri" w:cs="Calibri"/>
           <w:b/>
           <w:spacing w:val="1"/>
           <w:lang w:val="cs-CZ"/>
@@ -1612,7 +1612,7 @@
       </w:r>
       <w:r>
         <w:rPr>
-          <w:rFonts w:eastAsia="Calibri" w:cs="Calibri" w:ascii="Calibri" w:hAnsi="Calibri"/>
+          <w:rFonts w:eastAsia="Calibri" w:cs="Calibri"/>
           <w:b/>
           <w:spacing w:val="-1"/>
           <w:lang w:val="cs-CZ"/>
@@ -1621,7 +1621,7 @@
       </w:r>
       <w:r>
         <w:rPr>
-          <w:rFonts w:eastAsia="Calibri" w:cs="Calibri" w:ascii="Calibri" w:hAnsi="Calibri"/>
+          <w:rFonts w:eastAsia="Calibri" w:cs="Calibri"/>
           <w:b/>
           <w:lang w:val="cs-CZ"/>
         </w:rPr>
@@ -1629,7 +1629,7 @@
       </w:r>
       <w:r>
         <w:rPr>
-          <w:rFonts w:eastAsia="Calibri" w:cs="Calibri" w:ascii="Calibri" w:hAnsi="Calibri"/>
+          <w:rFonts w:eastAsia="Calibri" w:cs="Calibri"/>
           <w:b/>
           <w:spacing w:val="1"/>
           <w:lang w:val="cs-CZ"/>
@@ -1638,7 +1638,7 @@
       </w:r>
       <w:r>
         <w:rPr>
-          <w:rFonts w:eastAsia="Calibri" w:cs="Calibri" w:ascii="Calibri" w:hAnsi="Calibri"/>
+          <w:rFonts w:eastAsia="Calibri" w:cs="Calibri"/>
           <w:b/>
           <w:lang w:val="cs-CZ"/>
         </w:rPr>
@@ -1646,7 +1646,7 @@
       </w:r>
       <w:r>
         <w:rPr>
-          <w:rFonts w:eastAsia="Calibri" w:cs="Calibri" w:ascii="Calibri" w:hAnsi="Calibri"/>
+          <w:rFonts w:eastAsia="Calibri" w:cs="Calibri"/>
           <w:b/>
           <w:spacing w:val="-1"/>
           <w:lang w:val="cs-CZ"/>
@@ -1655,7 +1655,7 @@
       </w:r>
       <w:r>
         <w:rPr>
-          <w:rFonts w:eastAsia="Calibri" w:cs="Calibri" w:ascii="Calibri" w:hAnsi="Calibri"/>
+          <w:rFonts w:eastAsia="Calibri" w:cs="Calibri"/>
           <w:b/>
           <w:spacing w:val="1"/>
           <w:lang w:val="cs-CZ"/>
@@ -1664,7 +1664,7 @@
       </w:r>
       <w:r>
         <w:rPr>
-          <w:rFonts w:eastAsia="Calibri" w:cs="Calibri" w:ascii="Calibri" w:hAnsi="Calibri"/>
+          <w:rFonts w:eastAsia="Calibri" w:cs="Calibri"/>
           <w:b/>
           <w:spacing w:val="-3"/>
           <w:lang w:val="cs-CZ"/>
@@ -1673,7 +1673,7 @@
       </w:r>
       <w:r>
         <w:rPr>
-          <w:rFonts w:eastAsia="Calibri" w:cs="Calibri" w:ascii="Calibri" w:hAnsi="Calibri"/>
+          <w:rFonts w:eastAsia="Calibri" w:cs="Calibri"/>
           <w:b/>
           <w:lang w:val="cs-CZ"/>
         </w:rPr>
@@ -1681,7 +1681,7 @@
       </w:r>
       <w:r>
         <w:rPr>
-          <w:rFonts w:eastAsia="Calibri" w:cs="Calibri" w:ascii="Calibri" w:hAnsi="Calibri"/>
+          <w:rFonts w:eastAsia="Calibri" w:cs="Calibri"/>
           <w:b/>
           <w:spacing w:val="-1"/>
           <w:lang w:val="cs-CZ"/>
@@ -1690,7 +1690,7 @@
       </w:r>
       <w:r>
         <w:rPr>
-          <w:rFonts w:eastAsia="Calibri" w:cs="Calibri" w:ascii="Calibri" w:hAnsi="Calibri"/>
+          <w:rFonts w:eastAsia="Calibri" w:cs="Calibri"/>
           <w:b/>
           <w:spacing w:val="1"/>
           <w:lang w:val="cs-CZ"/>
@@ -1699,7 +1699,7 @@
       </w:r>
       <w:r>
         <w:rPr>
-          <w:rFonts w:eastAsia="Calibri" w:cs="Calibri" w:ascii="Calibri" w:hAnsi="Calibri"/>
+          <w:rFonts w:eastAsia="Calibri" w:cs="Calibri"/>
           <w:b/>
           <w:spacing w:val="-1"/>
           <w:lang w:val="cs-CZ"/>
@@ -1708,7 +1708,7 @@
       </w:r>
       <w:r>
         <w:rPr>
-          <w:rFonts w:eastAsia="Calibri" w:cs="Calibri" w:ascii="Calibri" w:hAnsi="Calibri"/>
+          <w:rFonts w:eastAsia="Calibri" w:cs="Calibri"/>
           <w:b/>
           <w:spacing w:val="1"/>
           <w:lang w:val="cs-CZ"/>
@@ -1717,7 +1717,7 @@
       </w:r>
       <w:r>
         <w:rPr>
-          <w:rFonts w:eastAsia="Calibri" w:cs="Calibri" w:ascii="Calibri" w:hAnsi="Calibri"/>
+          <w:rFonts w:eastAsia="Calibri" w:cs="Calibri"/>
           <w:b/>
           <w:spacing w:val="-1"/>
           <w:lang w:val="cs-CZ"/>
@@ -1726,7 +1726,7 @@
       </w:r>
       <w:r>
         <w:rPr>
-          <w:rFonts w:eastAsia="Calibri" w:cs="Calibri" w:ascii="Calibri" w:hAnsi="Calibri"/>
+          <w:rFonts w:eastAsia="Calibri" w:cs="Calibri"/>
           <w:b/>
           <w:spacing w:val="1"/>
           <w:lang w:val="cs-CZ"/>
@@ -1735,7 +1735,7 @@
       </w:r>
       <w:r>
         <w:rPr>
-          <w:rFonts w:eastAsia="Calibri" w:cs="Calibri" w:ascii="Calibri" w:hAnsi="Calibri"/>
+          <w:rFonts w:eastAsia="Calibri" w:cs="Calibri"/>
           <w:b/>
           <w:lang w:val="cs-CZ"/>
         </w:rPr>
@@ -1743,7 +1743,7 @@
       </w:r>
       <w:r>
         <w:rPr>
-          <w:rFonts w:eastAsia="Calibri" w:cs="Calibri" w:ascii="Calibri" w:hAnsi="Calibri"/>
+          <w:rFonts w:eastAsia="Calibri" w:cs="Calibri"/>
           <w:b/>
           <w:spacing w:val="3"/>
           <w:lang w:val="cs-CZ"/>
@@ -1752,7 +1752,7 @@
       </w:r>
       <w:r>
         <w:rPr>
-          <w:rFonts w:eastAsia="Calibri" w:cs="Calibri" w:ascii="Calibri" w:hAnsi="Calibri"/>
+          <w:rFonts w:eastAsia="Calibri" w:cs="Calibri"/>
           <w:b/>
           <w:spacing w:val="-1"/>
           <w:lang w:val="cs-CZ"/>
@@ -1761,7 +1761,7 @@
       </w:r>
       <w:r>
         <w:rPr>
-          <w:rFonts w:eastAsia="Calibri" w:cs="Calibri" w:ascii="Calibri" w:hAnsi="Calibri"/>
+          <w:rFonts w:eastAsia="Calibri" w:cs="Calibri"/>
           <w:b/>
           <w:lang w:val="cs-CZ"/>
         </w:rPr>
@@ -1769,7 +1769,7 @@
       </w:r>
       <w:r>
         <w:rPr>
-          <w:rFonts w:eastAsia="Calibri" w:cs="Calibri" w:ascii="Calibri" w:hAnsi="Calibri"/>
+          <w:rFonts w:eastAsia="Calibri" w:cs="Calibri"/>
           <w:b/>
           <w:spacing w:val="-1"/>
           <w:lang w:val="cs-CZ"/>
@@ -1778,7 +1778,7 @@
       </w:r>
       <w:r>
         <w:rPr>
-          <w:rFonts w:eastAsia="Calibri" w:cs="Calibri" w:ascii="Calibri" w:hAnsi="Calibri"/>
+          <w:rFonts w:eastAsia="Calibri" w:cs="Calibri"/>
           <w:b/>
           <w:lang w:val="cs-CZ"/>
         </w:rPr>
@@ -1786,7 +1786,7 @@
       </w:r>
       <w:r>
         <w:rPr>
-          <w:rFonts w:eastAsia="Calibri" w:cs="Calibri" w:ascii="Calibri" w:hAnsi="Calibri"/>
+          <w:rFonts w:eastAsia="Calibri" w:cs="Calibri"/>
           <w:b/>
           <w:spacing w:val="1"/>
           <w:lang w:val="cs-CZ"/>
@@ -1795,7 +1795,7 @@
       </w:r>
       <w:r>
         <w:rPr>
-          <w:rFonts w:eastAsia="Calibri" w:cs="Calibri" w:ascii="Calibri" w:hAnsi="Calibri"/>
+          <w:rFonts w:eastAsia="Calibri" w:cs="Calibri"/>
           <w:b/>
           <w:lang w:val="cs-CZ"/>
         </w:rPr>
@@ -1803,7 +1803,7 @@
       </w:r>
       <w:r>
         <w:rPr>
-          <w:rFonts w:eastAsia="Calibri" w:cs="Calibri" w:ascii="Calibri" w:hAnsi="Calibri"/>
+          <w:rFonts w:eastAsia="Calibri" w:cs="Calibri"/>
           <w:b/>
           <w:spacing w:val="-1"/>
           <w:lang w:val="cs-CZ"/>
@@ -1812,7 +1812,7 @@
       </w:r>
       <w:r>
         <w:rPr>
-          <w:rFonts w:eastAsia="Calibri" w:cs="Calibri" w:ascii="Calibri" w:hAnsi="Calibri"/>
+          <w:rFonts w:eastAsia="Calibri" w:cs="Calibri"/>
           <w:b/>
           <w:lang w:val="cs-CZ"/>
         </w:rPr>
@@ -1820,7 +1820,7 @@
       </w:r>
       <w:r>
         <w:rPr>
-          <w:rFonts w:eastAsia="Calibri" w:cs="Calibri" w:ascii="Calibri" w:hAnsi="Calibri"/>
+          <w:rFonts w:eastAsia="Calibri" w:cs="Calibri"/>
           <w:b/>
           <w:spacing w:val="1"/>
           <w:w w:val="102"/>
@@ -1830,7 +1830,7 @@
       </w:r>
       <w:r>
         <w:rPr>
-          <w:rFonts w:eastAsia="Calibri" w:cs="Calibri" w:ascii="Calibri" w:hAnsi="Calibri"/>
+          <w:rFonts w:eastAsia="Calibri" w:cs="Calibri"/>
           <w:b/>
           <w:spacing w:val="-3"/>
           <w:w w:val="102"/>
@@ -1840,7 +1840,7 @@
       </w:r>
       <w:r>
         <w:rPr>
-          <w:rFonts w:eastAsia="Calibri" w:cs="Calibri" w:ascii="Calibri" w:hAnsi="Calibri"/>
+          <w:rFonts w:eastAsia="Calibri" w:cs="Calibri"/>
           <w:b/>
           <w:spacing w:val="1"/>
           <w:w w:val="99"/>
@@ -1850,7 +1850,7 @@
       </w:r>
       <w:r>
         <w:rPr>
-          <w:rFonts w:eastAsia="Calibri" w:cs="Calibri" w:ascii="Calibri" w:hAnsi="Calibri"/>
+          <w:rFonts w:eastAsia="Calibri" w:cs="Calibri"/>
           <w:b/>
           <w:w w:val="101"/>
           <w:lang w:val="cs-CZ"/>
@@ -1859,7 +1859,7 @@
       </w:r>
       <w:r>
         <w:rPr>
-          <w:rFonts w:eastAsia="Calibri" w:cs="Calibri" w:ascii="Calibri" w:hAnsi="Calibri"/>
+          <w:rFonts w:eastAsia="Calibri" w:cs="Calibri"/>
           <w:b/>
           <w:spacing w:val="1"/>
           <w:lang w:val="cs-CZ"/>
@@ -1868,7 +1868,7 @@
       </w:r>
       <w:r>
         <w:rPr>
-          <w:rFonts w:eastAsia="Calibri" w:cs="Calibri" w:ascii="Calibri" w:hAnsi="Calibri"/>
+          <w:rFonts w:eastAsia="Calibri" w:cs="Calibri"/>
           <w:b/>
           <w:spacing w:val="-1"/>
           <w:lang w:val="cs-CZ"/>
@@ -1877,7 +1877,7 @@
       </w:r>
       <w:r>
         <w:rPr>
-          <w:rFonts w:eastAsia="Calibri" w:cs="Calibri" w:ascii="Calibri" w:hAnsi="Calibri"/>
+          <w:rFonts w:eastAsia="Calibri" w:cs="Calibri"/>
           <w:b/>
           <w:spacing w:val="1"/>
           <w:w w:val="111"/>
@@ -1887,7 +1887,7 @@
       </w:r>
       <w:r>
         <w:rPr>
-          <w:rFonts w:eastAsia="Calibri" w:cs="Calibri" w:ascii="Calibri" w:hAnsi="Calibri"/>
+          <w:rFonts w:eastAsia="Calibri" w:cs="Calibri"/>
           <w:b/>
           <w:spacing w:val="-1"/>
           <w:lang w:val="cs-CZ"/>
@@ -1896,7 +1896,7 @@
       </w:r>
       <w:r>
         <w:rPr>
-          <w:rFonts w:eastAsia="Calibri" w:cs="Calibri" w:ascii="Calibri" w:hAnsi="Calibri"/>
+          <w:rFonts w:eastAsia="Calibri" w:cs="Calibri"/>
           <w:b/>
           <w:spacing w:val="1"/>
           <w:lang w:val="cs-CZ"/>
@@ -1905,7 +1905,7 @@
       </w:r>
       <w:r>
         <w:rPr>
-          <w:rFonts w:eastAsia="Calibri" w:cs="Calibri" w:ascii="Calibri" w:hAnsi="Calibri"/>
+          <w:rFonts w:eastAsia="Calibri" w:cs="Calibri"/>
           <w:b/>
           <w:w w:val="106"/>
           <w:lang w:val="cs-CZ"/>
@@ -2009,7 +2009,7 @@
       </w:pPr>
       <w:r>
         <w:rPr>
-          <w:rFonts w:eastAsia="Calibri" w:cs="Calibri" w:ascii="Calibri" w:hAnsi="Calibri"/>
+          <w:rFonts w:eastAsia="Calibri" w:cs="Calibri"/>
           <w:b/>
           <w:spacing w:val="1"/>
           <w:sz w:val="24"/>
@@ -2020,7 +2020,7 @@
       </w:r>
       <w:r>
         <w:rPr>
-          <w:rFonts w:eastAsia="Calibri" w:cs="Calibri" w:ascii="Calibri" w:hAnsi="Calibri"/>
+          <w:rFonts w:eastAsia="Calibri" w:cs="Calibri"/>
           <w:b/>
           <w:spacing w:val="-1"/>
           <w:sz w:val="24"/>
@@ -2031,7 +2031,7 @@
       </w:r>
       <w:r>
         <w:rPr>
-          <w:rFonts w:eastAsia="Calibri" w:cs="Calibri" w:ascii="Calibri" w:hAnsi="Calibri"/>
+          <w:rFonts w:eastAsia="Calibri" w:cs="Calibri"/>
           <w:b/>
           <w:sz w:val="24"/>
           <w:szCs w:val="24"/>
@@ -2041,7 +2041,7 @@
       </w:r>
       <w:r>
         <w:rPr>
-          <w:rFonts w:eastAsia="Calibri" w:cs="Calibri" w:ascii="Calibri" w:hAnsi="Calibri"/>
+          <w:rFonts w:eastAsia="Calibri" w:cs="Calibri"/>
           <w:b/>
           <w:spacing w:val="1"/>
           <w:sz w:val="24"/>
@@ -2052,7 +2052,7 @@
       </w:r>
       <w:r>
         <w:rPr>
-          <w:rFonts w:eastAsia="Calibri" w:cs="Calibri" w:ascii="Calibri" w:hAnsi="Calibri"/>
+          <w:rFonts w:eastAsia="Calibri" w:cs="Calibri"/>
           <w:b/>
           <w:sz w:val="24"/>
           <w:szCs w:val="24"/>
@@ -2062,7 +2062,7 @@
       </w:r>
       <w:r>
         <w:rPr>
-          <w:rFonts w:eastAsia="Calibri" w:cs="Calibri" w:ascii="Calibri" w:hAnsi="Calibri"/>
+          <w:rFonts w:eastAsia="Calibri" w:cs="Calibri"/>
           <w:b/>
           <w:spacing w:val="9"/>
           <w:sz w:val="24"/>
@@ -2073,7 +2073,7 @@
       </w:r>
       <w:r>
         <w:rPr>
-          <w:rFonts w:eastAsia="Calibri" w:cs="Calibri" w:ascii="Calibri" w:hAnsi="Calibri"/>
+          <w:rFonts w:eastAsia="Calibri" w:cs="Calibri"/>
           <w:b/>
           <w:spacing w:val="-1"/>
           <w:w w:val="107"/>
@@ -2085,7 +2085,7 @@
       </w:r>
       <w:r>
         <w:rPr>
-          <w:rFonts w:eastAsia="Calibri" w:cs="Calibri" w:ascii="Calibri" w:hAnsi="Calibri"/>
+          <w:rFonts w:eastAsia="Calibri" w:cs="Calibri"/>
           <w:b/>
           <w:spacing w:val="1"/>
           <w:w w:val="102"/>
@@ -2097,7 +2097,7 @@
       </w:r>
       <w:r>
         <w:rPr>
-          <w:rFonts w:eastAsia="Calibri" w:cs="Calibri" w:ascii="Calibri" w:hAnsi="Calibri"/>
+          <w:rFonts w:eastAsia="Calibri" w:cs="Calibri"/>
           <w:b/>
           <w:spacing w:val="1"/>
           <w:w w:val="103"/>
@@ -2109,7 +2109,7 @@
       </w:r>
       <w:r>
         <w:rPr>
-          <w:rFonts w:eastAsia="Calibri" w:cs="Calibri" w:ascii="Calibri" w:hAnsi="Calibri"/>
+          <w:rFonts w:eastAsia="Calibri" w:cs="Calibri"/>
           <w:b/>
           <w:spacing w:val="-2"/>
           <w:w w:val="101"/>
@@ -2121,7 +2121,7 @@
       </w:r>
       <w:r>
         <w:rPr>
-          <w:rFonts w:eastAsia="Calibri" w:cs="Calibri" w:ascii="Calibri" w:hAnsi="Calibri"/>
+          <w:rFonts w:eastAsia="Calibri" w:cs="Calibri"/>
           <w:b/>
           <w:spacing w:val="1"/>
           <w:w w:val="101"/>
@@ -2133,7 +2133,7 @@
       </w:r>
       <w:r>
         <w:rPr>
-          <w:rFonts w:eastAsia="Calibri" w:cs="Calibri" w:ascii="Calibri" w:hAnsi="Calibri"/>
+          <w:rFonts w:eastAsia="Calibri" w:cs="Calibri"/>
           <w:b/>
           <w:spacing w:val="-1"/>
           <w:w w:val="101"/>
@@ -2145,7 +2145,7 @@
       </w:r>
       <w:r>
         <w:rPr>
-          <w:rFonts w:eastAsia="Calibri" w:cs="Calibri" w:ascii="Calibri" w:hAnsi="Calibri"/>
+          <w:rFonts w:eastAsia="Calibri" w:cs="Calibri"/>
           <w:b/>
           <w:spacing w:val="-1"/>
           <w:w w:val="102"/>
@@ -2157,7 +2157,7 @@
       </w:r>
       <w:r>
         <w:rPr>
-          <w:rFonts w:eastAsia="Calibri" w:cs="Calibri" w:ascii="Calibri" w:hAnsi="Calibri"/>
+          <w:rFonts w:eastAsia="Calibri" w:cs="Calibri"/>
           <w:b/>
           <w:w w:val="98"/>
           <w:sz w:val="24"/>
@@ -2168,7 +2168,7 @@
       </w:r>
       <w:r>
         <w:rPr>
-          <w:rFonts w:eastAsia="Calibri" w:cs="Calibri" w:ascii="Calibri" w:hAnsi="Calibri"/>
+          <w:rFonts w:eastAsia="Calibri" w:cs="Calibri"/>
           <w:b/>
           <w:spacing w:val="-1"/>
           <w:w w:val="101"/>
@@ -2180,7 +2180,7 @@
       </w:r>
       <w:r>
         <w:rPr>
-          <w:rFonts w:eastAsia="Calibri" w:cs="Calibri" w:ascii="Calibri" w:hAnsi="Calibri"/>
+          <w:rFonts w:eastAsia="Calibri" w:cs="Calibri"/>
           <w:b/>
           <w:w w:val="102"/>
           <w:sz w:val="24"/>
@@ -2203,7 +2203,7 @@
       </w:pPr>
       <w:r>
         <w:rPr>
-          <w:rFonts w:eastAsia="Calibri" w:cs="Calibri" w:ascii="Calibri" w:hAnsi="Calibri"/>
+          <w:rFonts w:eastAsia="Calibri" w:cs="Calibri"/>
           <w:spacing w:val="1"/>
           <w:lang w:val="cs-CZ"/>
         </w:rPr>
@@ -2211,14 +2211,14 @@
       </w:r>
       <w:r>
         <w:rPr>
-          <w:rFonts w:eastAsia="Calibri" w:cs="Calibri" w:ascii="Calibri" w:hAnsi="Calibri"/>
+          <w:rFonts w:eastAsia="Calibri" w:cs="Calibri"/>
           <w:lang w:val="cs-CZ"/>
         </w:rPr>
         <w:t>ř</w:t>
       </w:r>
       <w:r>
         <w:rPr>
-          <w:rFonts w:eastAsia="Calibri" w:cs="Calibri" w:ascii="Calibri" w:hAnsi="Calibri"/>
+          <w:rFonts w:eastAsia="Calibri" w:cs="Calibri"/>
           <w:spacing w:val="1"/>
           <w:lang w:val="cs-CZ"/>
         </w:rPr>
@@ -2226,7 +2226,7 @@
       </w:r>
       <w:r>
         <w:rPr>
-          <w:rFonts w:eastAsia="Calibri" w:cs="Calibri" w:ascii="Calibri" w:hAnsi="Calibri"/>
+          <w:rFonts w:eastAsia="Calibri" w:cs="Calibri"/>
           <w:spacing w:val="-3"/>
           <w:lang w:val="cs-CZ"/>
         </w:rPr>
@@ -2234,7 +2234,7 @@
       </w:r>
       <w:r>
         <w:rPr>
-          <w:rFonts w:eastAsia="Calibri" w:cs="Calibri" w:ascii="Calibri" w:hAnsi="Calibri"/>
+          <w:rFonts w:eastAsia="Calibri" w:cs="Calibri"/>
           <w:spacing w:val="1"/>
           <w:lang w:val="cs-CZ"/>
         </w:rPr>
@@ -2242,7 +2242,7 @@
       </w:r>
       <w:r>
         <w:rPr>
-          <w:rFonts w:eastAsia="Calibri" w:cs="Calibri" w:ascii="Calibri" w:hAnsi="Calibri"/>
+          <w:rFonts w:eastAsia="Calibri" w:cs="Calibri"/>
           <w:spacing w:val="-2"/>
           <w:lang w:val="cs-CZ"/>
         </w:rPr>
@@ -2250,14 +2250,14 @@
       </w:r>
       <w:r>
         <w:rPr>
-          <w:rFonts w:eastAsia="Calibri" w:cs="Calibri" w:ascii="Calibri" w:hAnsi="Calibri"/>
+          <w:rFonts w:eastAsia="Calibri" w:cs="Calibri"/>
           <w:lang w:val="cs-CZ"/>
         </w:rPr>
         <w:t>y</w:t>
       </w:r>
       <w:r>
         <w:rPr>
-          <w:rFonts w:eastAsia="Calibri" w:cs="Calibri" w:ascii="Calibri" w:hAnsi="Calibri"/>
+          <w:rFonts w:eastAsia="Calibri" w:cs="Calibri"/>
           <w:spacing w:val="2"/>
           <w:lang w:val="cs-CZ"/>
         </w:rPr>
@@ -2265,7 +2265,7 @@
       </w:r>
       <w:r>
         <w:rPr>
-          <w:rFonts w:eastAsia="Calibri" w:cs="Calibri" w:ascii="Calibri" w:hAnsi="Calibri"/>
+          <w:rFonts w:eastAsia="Calibri" w:cs="Calibri"/>
           <w:spacing w:val="-2"/>
           <w:lang w:val="cs-CZ"/>
         </w:rPr>
@@ -2273,14 +2273,14 @@
       </w:r>
       <w:r>
         <w:rPr>
-          <w:rFonts w:eastAsia="Calibri" w:cs="Calibri" w:ascii="Calibri" w:hAnsi="Calibri"/>
+          <w:rFonts w:eastAsia="Calibri" w:cs="Calibri"/>
           <w:lang w:val="cs-CZ"/>
         </w:rPr>
         <w:t>tát</w:t>
       </w:r>
       <w:r>
         <w:rPr>
-          <w:rFonts w:eastAsia="Calibri" w:cs="Calibri" w:ascii="Calibri" w:hAnsi="Calibri"/>
+          <w:rFonts w:eastAsia="Calibri" w:cs="Calibri"/>
           <w:spacing w:val="-1"/>
           <w:lang w:val="cs-CZ"/>
         </w:rPr>
@@ -2288,14 +2288,14 @@
       </w:r>
       <w:r>
         <w:rPr>
-          <w:rFonts w:eastAsia="Calibri" w:cs="Calibri" w:ascii="Calibri" w:hAnsi="Calibri"/>
+          <w:rFonts w:eastAsia="Calibri" w:cs="Calibri"/>
           <w:lang w:val="cs-CZ"/>
         </w:rPr>
         <w:t xml:space="preserve">í </w:t>
       </w:r>
       <w:r>
         <w:rPr>
-          <w:rFonts w:eastAsia="Calibri" w:cs="Calibri" w:ascii="Calibri" w:hAnsi="Calibri"/>
+          <w:rFonts w:eastAsia="Calibri" w:cs="Calibri"/>
           <w:spacing w:val="-1"/>
           <w:lang w:val="cs-CZ"/>
         </w:rPr>
@@ -2303,7 +2303,7 @@
       </w:r>
       <w:r>
         <w:rPr>
-          <w:rFonts w:eastAsia="Calibri" w:cs="Calibri" w:ascii="Calibri" w:hAnsi="Calibri"/>
+          <w:rFonts w:eastAsia="Calibri" w:cs="Calibri"/>
           <w:spacing w:val="-2"/>
           <w:lang w:val="cs-CZ"/>
         </w:rPr>
@@ -2311,7 +2311,7 @@
       </w:r>
       <w:r>
         <w:rPr>
-          <w:rFonts w:eastAsia="Calibri" w:cs="Calibri" w:ascii="Calibri" w:hAnsi="Calibri"/>
+          <w:rFonts w:eastAsia="Calibri" w:cs="Calibri"/>
           <w:spacing w:val="1"/>
           <w:lang w:val="cs-CZ"/>
         </w:rPr>
@@ -2319,7 +2319,7 @@
       </w:r>
       <w:r>
         <w:rPr>
-          <w:rFonts w:eastAsia="Calibri" w:cs="Calibri" w:ascii="Calibri" w:hAnsi="Calibri"/>
+          <w:rFonts w:eastAsia="Calibri" w:cs="Calibri"/>
           <w:spacing w:val="-1"/>
           <w:lang w:val="cs-CZ"/>
         </w:rPr>
@@ -2327,14 +2327,14 @@
       </w:r>
       <w:r>
         <w:rPr>
-          <w:rFonts w:eastAsia="Calibri" w:cs="Calibri" w:ascii="Calibri" w:hAnsi="Calibri"/>
+          <w:rFonts w:eastAsia="Calibri" w:cs="Calibri"/>
           <w:lang w:val="cs-CZ"/>
         </w:rPr>
         <w:t>š</w:t>
       </w:r>
       <w:r>
         <w:rPr>
-          <w:rFonts w:eastAsia="Calibri" w:cs="Calibri" w:ascii="Calibri" w:hAnsi="Calibri"/>
+          <w:rFonts w:eastAsia="Calibri" w:cs="Calibri"/>
           <w:spacing w:val="-2"/>
           <w:lang w:val="cs-CZ"/>
         </w:rPr>
@@ -2342,14 +2342,14 @@
       </w:r>
       <w:r>
         <w:rPr>
-          <w:rFonts w:eastAsia="Calibri" w:cs="Calibri" w:ascii="Calibri" w:hAnsi="Calibri"/>
+          <w:rFonts w:eastAsia="Calibri" w:cs="Calibri"/>
           <w:lang w:val="cs-CZ"/>
         </w:rPr>
         <w:t>y</w:t>
       </w:r>
       <w:r>
         <w:rPr>
-          <w:rFonts w:eastAsia="Calibri" w:cs="Calibri" w:ascii="Calibri" w:hAnsi="Calibri"/>
+          <w:rFonts w:eastAsia="Calibri" w:cs="Calibri"/>
           <w:spacing w:val="2"/>
           <w:lang w:val="cs-CZ"/>
         </w:rPr>
@@ -2357,7 +2357,7 @@
       </w:r>
       <w:r>
         <w:rPr>
-          <w:rFonts w:eastAsia="Calibri" w:cs="Calibri" w:ascii="Calibri" w:hAnsi="Calibri"/>
+          <w:rFonts w:eastAsia="Calibri" w:cs="Calibri"/>
           <w:spacing w:val="-1"/>
           <w:lang w:val="cs-CZ"/>
         </w:rPr>
@@ -2365,14 +2365,14 @@
       </w:r>
       <w:r>
         <w:rPr>
-          <w:rFonts w:eastAsia="Calibri" w:cs="Calibri" w:ascii="Calibri" w:hAnsi="Calibri"/>
+          <w:rFonts w:eastAsia="Calibri" w:cs="Calibri"/>
           <w:lang w:val="cs-CZ"/>
         </w:rPr>
         <w:t>e</w:t>
       </w:r>
       <w:r>
         <w:rPr>
-          <w:rFonts w:eastAsia="Calibri" w:cs="Calibri" w:ascii="Calibri" w:hAnsi="Calibri"/>
+          <w:rFonts w:eastAsia="Calibri" w:cs="Calibri"/>
           <w:spacing w:val="-1"/>
           <w:lang w:val="cs-CZ"/>
         </w:rPr>
@@ -2380,14 +2380,14 @@
       </w:r>
       <w:r>
         <w:rPr>
-          <w:rFonts w:eastAsia="Calibri" w:cs="Calibri" w:ascii="Calibri" w:hAnsi="Calibri"/>
+          <w:rFonts w:eastAsia="Calibri" w:cs="Calibri"/>
           <w:lang w:val="cs-CZ"/>
         </w:rPr>
         <w:t>st</w:t>
       </w:r>
       <w:r>
         <w:rPr>
-          <w:rFonts w:eastAsia="Calibri" w:cs="Calibri" w:ascii="Calibri" w:hAnsi="Calibri"/>
+          <w:rFonts w:eastAsia="Calibri" w:cs="Calibri"/>
           <w:spacing w:val="-1"/>
           <w:lang w:val="cs-CZ"/>
         </w:rPr>
@@ -2395,14 +2395,14 @@
       </w:r>
       <w:r>
         <w:rPr>
-          <w:rFonts w:eastAsia="Calibri" w:cs="Calibri" w:ascii="Calibri" w:hAnsi="Calibri"/>
+          <w:rFonts w:eastAsia="Calibri" w:cs="Calibri"/>
           <w:lang w:val="cs-CZ"/>
         </w:rPr>
         <w:t>ij</w:t>
       </w:r>
       <w:r>
         <w:rPr>
-          <w:rFonts w:eastAsia="Calibri" w:cs="Calibri" w:ascii="Calibri" w:hAnsi="Calibri"/>
+          <w:rFonts w:eastAsia="Calibri" w:cs="Calibri"/>
           <w:spacing w:val="-1"/>
           <w:lang w:val="cs-CZ"/>
         </w:rPr>
@@ -2410,14 +2410,14 @@
       </w:r>
       <w:r>
         <w:rPr>
-          <w:rFonts w:eastAsia="Calibri" w:cs="Calibri" w:ascii="Calibri" w:hAnsi="Calibri"/>
+          <w:rFonts w:eastAsia="Calibri" w:cs="Calibri"/>
           <w:lang w:val="cs-CZ"/>
         </w:rPr>
         <w:t>í</w:t>
       </w:r>
       <w:r>
         <w:rPr>
-          <w:rFonts w:eastAsia="Calibri" w:cs="Calibri" w:ascii="Calibri" w:hAnsi="Calibri"/>
+          <w:rFonts w:eastAsia="Calibri" w:cs="Calibri"/>
           <w:spacing w:val="-1"/>
           <w:lang w:val="cs-CZ"/>
         </w:rPr>
@@ -2425,14 +2425,14 @@
       </w:r>
       <w:r>
         <w:rPr>
-          <w:rFonts w:eastAsia="Calibri" w:cs="Calibri" w:ascii="Calibri" w:hAnsi="Calibri"/>
+          <w:rFonts w:eastAsia="Calibri" w:cs="Calibri"/>
           <w:lang w:val="cs-CZ"/>
         </w:rPr>
         <w:t>o</w:t>
       </w:r>
       <w:r>
         <w:rPr>
-          <w:rFonts w:eastAsia="Calibri" w:cs="Calibri" w:ascii="Calibri" w:hAnsi="Calibri"/>
+          <w:rFonts w:eastAsia="Calibri" w:cs="Calibri"/>
           <w:spacing w:val="-1"/>
           <w:lang w:val="cs-CZ"/>
         </w:rPr>
@@ -2440,7 +2440,7 @@
       </w:r>
       <w:r>
         <w:rPr>
-          <w:rFonts w:eastAsia="Calibri" w:cs="Calibri" w:ascii="Calibri" w:hAnsi="Calibri"/>
+          <w:rFonts w:eastAsia="Calibri" w:cs="Calibri"/>
           <w:spacing w:val="1"/>
           <w:lang w:val="cs-CZ"/>
         </w:rPr>
@@ -2448,7 +2448,7 @@
       </w:r>
       <w:r>
         <w:rPr>
-          <w:rFonts w:eastAsia="Calibri" w:cs="Calibri" w:ascii="Calibri" w:hAnsi="Calibri"/>
+          <w:rFonts w:eastAsia="Calibri" w:cs="Calibri"/>
           <w:spacing w:val="-1"/>
           <w:lang w:val="cs-CZ"/>
         </w:rPr>
@@ -2456,7 +2456,7 @@
       </w:r>
       <w:r>
         <w:rPr>
-          <w:rFonts w:eastAsia="Calibri" w:cs="Calibri" w:ascii="Calibri" w:hAnsi="Calibri"/>
+          <w:rFonts w:eastAsia="Calibri" w:cs="Calibri"/>
           <w:spacing w:val="1"/>
           <w:lang w:val="cs-CZ"/>
         </w:rPr>
@@ -2464,14 +2464,14 @@
       </w:r>
       <w:r>
         <w:rPr>
-          <w:rFonts w:eastAsia="Calibri" w:cs="Calibri" w:ascii="Calibri" w:hAnsi="Calibri"/>
+          <w:rFonts w:eastAsia="Calibri" w:cs="Calibri"/>
           <w:lang w:val="cs-CZ"/>
         </w:rPr>
         <w:t>ru j</w:t>
       </w:r>
       <w:r>
         <w:rPr>
-          <w:rFonts w:eastAsia="Calibri" w:cs="Calibri" w:ascii="Calibri" w:hAnsi="Calibri"/>
+          <w:rFonts w:eastAsia="Calibri" w:cs="Calibri"/>
           <w:spacing w:val="-2"/>
           <w:lang w:val="cs-CZ"/>
         </w:rPr>
@@ -2479,7 +2479,7 @@
       </w:r>
       <w:r>
         <w:rPr>
-          <w:rFonts w:eastAsia="Calibri" w:cs="Calibri" w:ascii="Calibri" w:hAnsi="Calibri"/>
+          <w:rFonts w:eastAsia="Calibri" w:cs="Calibri"/>
           <w:spacing w:val="1"/>
           <w:lang w:val="cs-CZ"/>
         </w:rPr>
@@ -2487,14 +2487,14 @@
       </w:r>
       <w:r>
         <w:rPr>
-          <w:rFonts w:eastAsia="Calibri" w:cs="Calibri" w:ascii="Calibri" w:hAnsi="Calibri"/>
+          <w:rFonts w:eastAsia="Calibri" w:cs="Calibri"/>
           <w:lang w:val="cs-CZ"/>
         </w:rPr>
         <w:t xml:space="preserve">u </w:t>
       </w:r>
       <w:r>
         <w:rPr>
-          <w:rFonts w:eastAsia="Calibri" w:cs="Calibri" w:ascii="Calibri" w:hAnsi="Calibri"/>
+          <w:rFonts w:eastAsia="Calibri" w:cs="Calibri"/>
           <w:spacing w:val="-1"/>
           <w:lang w:val="cs-CZ"/>
         </w:rPr>
@@ -2502,7 +2502,7 @@
       </w:r>
       <w:r>
         <w:rPr>
-          <w:rFonts w:eastAsia="Calibri" w:cs="Calibri" w:ascii="Calibri" w:hAnsi="Calibri"/>
+          <w:rFonts w:eastAsia="Calibri" w:cs="Calibri"/>
           <w:spacing w:val="1"/>
           <w:lang w:val="cs-CZ"/>
         </w:rPr>
@@ -2510,7 +2510,7 @@
       </w:r>
       <w:r>
         <w:rPr>
-          <w:rFonts w:eastAsia="Calibri" w:cs="Calibri" w:ascii="Calibri" w:hAnsi="Calibri"/>
+          <w:rFonts w:eastAsia="Calibri" w:cs="Calibri"/>
           <w:spacing w:val="-3"/>
           <w:lang w:val="cs-CZ"/>
         </w:rPr>
@@ -2518,14 +2518,14 @@
       </w:r>
       <w:r>
         <w:rPr>
-          <w:rFonts w:eastAsia="Calibri" w:cs="Calibri" w:ascii="Calibri" w:hAnsi="Calibri"/>
+          <w:rFonts w:eastAsia="Calibri" w:cs="Calibri"/>
           <w:lang w:val="cs-CZ"/>
         </w:rPr>
         <w:t>y</w:t>
       </w:r>
       <w:r>
         <w:rPr>
-          <w:rFonts w:eastAsia="Calibri" w:cs="Calibri" w:ascii="Calibri" w:hAnsi="Calibri"/>
+          <w:rFonts w:eastAsia="Calibri" w:cs="Calibri"/>
           <w:spacing w:val="-1"/>
           <w:lang w:val="cs-CZ"/>
         </w:rPr>
@@ -2533,14 +2533,14 @@
       </w:r>
       <w:r>
         <w:rPr>
-          <w:rFonts w:eastAsia="Calibri" w:cs="Calibri" w:ascii="Calibri" w:hAnsi="Calibri"/>
+          <w:rFonts w:eastAsia="Calibri" w:cs="Calibri"/>
           <w:lang w:val="cs-CZ"/>
         </w:rPr>
         <w:t>a</w:t>
       </w:r>
       <w:r>
         <w:rPr>
-          <w:rFonts w:eastAsia="Calibri" w:cs="Calibri" w:ascii="Calibri" w:hAnsi="Calibri"/>
+          <w:rFonts w:eastAsia="Calibri" w:cs="Calibri"/>
           <w:spacing w:val="1"/>
           <w:lang w:val="cs-CZ"/>
         </w:rPr>
@@ -2548,14 +2548,14 @@
       </w:r>
       <w:r>
         <w:rPr>
-          <w:rFonts w:eastAsia="Calibri" w:cs="Calibri" w:ascii="Calibri" w:hAnsi="Calibri"/>
+          <w:rFonts w:eastAsia="Calibri" w:cs="Calibri"/>
           <w:lang w:val="cs-CZ"/>
         </w:rPr>
         <w:t>r</w:t>
       </w:r>
       <w:r>
         <w:rPr>
-          <w:rFonts w:eastAsia="Calibri" w:cs="Calibri" w:ascii="Calibri" w:hAnsi="Calibri"/>
+          <w:rFonts w:eastAsia="Calibri" w:cs="Calibri"/>
           <w:spacing w:val="1"/>
           <w:lang w:val="cs-CZ"/>
         </w:rPr>
@@ -2563,7 +2563,7 @@
       </w:r>
       <w:r>
         <w:rPr>
-          <w:rFonts w:eastAsia="Calibri" w:cs="Calibri" w:ascii="Calibri" w:hAnsi="Calibri"/>
+          <w:rFonts w:eastAsia="Calibri" w:cs="Calibri"/>
           <w:spacing w:val="-1"/>
           <w:lang w:val="cs-CZ"/>
         </w:rPr>
@@ -2571,14 +2571,14 @@
       </w:r>
       <w:r>
         <w:rPr>
-          <w:rFonts w:eastAsia="Calibri" w:cs="Calibri" w:ascii="Calibri" w:hAnsi="Calibri"/>
+          <w:rFonts w:eastAsia="Calibri" w:cs="Calibri"/>
           <w:lang w:val="cs-CZ"/>
         </w:rPr>
         <w:t>it</w:t>
       </w:r>
       <w:r>
         <w:rPr>
-          <w:rFonts w:eastAsia="Calibri" w:cs="Calibri" w:ascii="Calibri" w:hAnsi="Calibri"/>
+          <w:rFonts w:eastAsia="Calibri" w:cs="Calibri"/>
           <w:spacing w:val="-3"/>
           <w:lang w:val="cs-CZ"/>
         </w:rPr>
@@ -2586,14 +2586,14 @@
       </w:r>
       <w:r>
         <w:rPr>
-          <w:rFonts w:eastAsia="Calibri" w:cs="Calibri" w:ascii="Calibri" w:hAnsi="Calibri"/>
+          <w:rFonts w:eastAsia="Calibri" w:cs="Calibri"/>
           <w:lang w:val="cs-CZ"/>
         </w:rPr>
         <w:t xml:space="preserve">cí. </w:t>
       </w:r>
       <w:r>
         <w:rPr>
-          <w:rFonts w:eastAsia="Calibri" w:cs="Calibri" w:ascii="Calibri" w:hAnsi="Calibri"/>
+          <w:rFonts w:eastAsia="Calibri" w:cs="Calibri"/>
           <w:spacing w:val="-1"/>
           <w:lang w:val="cs-CZ"/>
         </w:rPr>
@@ -2601,7 +2601,7 @@
       </w:r>
       <w:r>
         <w:rPr>
-          <w:rFonts w:eastAsia="Calibri" w:cs="Calibri" w:ascii="Calibri" w:hAnsi="Calibri"/>
+          <w:rFonts w:eastAsia="Calibri" w:cs="Calibri"/>
           <w:spacing w:val="1"/>
           <w:lang w:val="cs-CZ"/>
         </w:rPr>
@@ -2609,7 +2609,7 @@
       </w:r>
       <w:r>
         <w:rPr>
-          <w:rFonts w:eastAsia="Calibri" w:cs="Calibri" w:ascii="Calibri" w:hAnsi="Calibri"/>
+          <w:rFonts w:eastAsia="Calibri" w:cs="Calibri"/>
           <w:spacing w:val="-1"/>
           <w:lang w:val="cs-CZ"/>
         </w:rPr>
@@ -2617,14 +2617,14 @@
       </w:r>
       <w:r>
         <w:rPr>
-          <w:rFonts w:eastAsia="Calibri" w:cs="Calibri" w:ascii="Calibri" w:hAnsi="Calibri"/>
+          <w:rFonts w:eastAsia="Calibri" w:cs="Calibri"/>
           <w:lang w:val="cs-CZ"/>
         </w:rPr>
         <w:t>á</w:t>
       </w:r>
       <w:r>
         <w:rPr>
-          <w:rFonts w:eastAsia="Calibri" w:cs="Calibri" w:ascii="Calibri" w:hAnsi="Calibri"/>
+          <w:rFonts w:eastAsia="Calibri" w:cs="Calibri"/>
           <w:spacing w:val="1"/>
           <w:lang w:val="cs-CZ"/>
         </w:rPr>
@@ -2632,14 +2632,14 @@
       </w:r>
       <w:r>
         <w:rPr>
-          <w:rFonts w:eastAsia="Calibri" w:cs="Calibri" w:ascii="Calibri" w:hAnsi="Calibri"/>
+          <w:rFonts w:eastAsia="Calibri" w:cs="Calibri"/>
           <w:lang w:val="cs-CZ"/>
         </w:rPr>
         <w:t>se</w:t>
       </w:r>
       <w:r>
         <w:rPr>
-          <w:rFonts w:eastAsia="Calibri" w:cs="Calibri" w:ascii="Calibri" w:hAnsi="Calibri"/>
+          <w:rFonts w:eastAsia="Calibri" w:cs="Calibri"/>
           <w:spacing w:val="-1"/>
           <w:lang w:val="cs-CZ"/>
         </w:rPr>
@@ -2647,14 +2647,14 @@
       </w:r>
       <w:r>
         <w:rPr>
-          <w:rFonts w:eastAsia="Calibri" w:cs="Calibri" w:ascii="Calibri" w:hAnsi="Calibri"/>
+          <w:rFonts w:eastAsia="Calibri" w:cs="Calibri"/>
           <w:lang w:val="cs-CZ"/>
         </w:rPr>
         <w:t>o</w:t>
       </w:r>
       <w:r>
         <w:rPr>
-          <w:rFonts w:eastAsia="Calibri" w:cs="Calibri" w:ascii="Calibri" w:hAnsi="Calibri"/>
+          <w:rFonts w:eastAsia="Calibri" w:cs="Calibri"/>
           <w:spacing w:val="-1"/>
           <w:lang w:val="cs-CZ"/>
         </w:rPr>
@@ -2662,14 +2662,14 @@
       </w:r>
       <w:r>
         <w:rPr>
-          <w:rFonts w:eastAsia="Calibri" w:cs="Calibri" w:ascii="Calibri" w:hAnsi="Calibri"/>
+          <w:rFonts w:eastAsia="Calibri" w:cs="Calibri"/>
           <w:lang w:val="cs-CZ"/>
         </w:rPr>
         <w:t>ř</w:t>
       </w:r>
       <w:r>
         <w:rPr>
-          <w:rFonts w:eastAsia="Calibri" w:cs="Calibri" w:ascii="Calibri" w:hAnsi="Calibri"/>
+          <w:rFonts w:eastAsia="Calibri" w:cs="Calibri"/>
           <w:spacing w:val="1"/>
           <w:lang w:val="cs-CZ"/>
         </w:rPr>
@@ -2677,7 +2677,7 @@
       </w:r>
       <w:r>
         <w:rPr>
-          <w:rFonts w:eastAsia="Calibri" w:cs="Calibri" w:ascii="Calibri" w:hAnsi="Calibri"/>
+          <w:rFonts w:eastAsia="Calibri" w:cs="Calibri"/>
           <w:spacing w:val="-3"/>
           <w:lang w:val="cs-CZ"/>
         </w:rPr>
@@ -2685,7 +2685,7 @@
       </w:r>
       <w:r>
         <w:rPr>
-          <w:rFonts w:eastAsia="Calibri" w:cs="Calibri" w:ascii="Calibri" w:hAnsi="Calibri"/>
+          <w:rFonts w:eastAsia="Calibri" w:cs="Calibri"/>
           <w:spacing w:val="1"/>
           <w:lang w:val="cs-CZ"/>
         </w:rPr>
@@ -2693,7 +2693,7 @@
       </w:r>
       <w:r>
         <w:rPr>
-          <w:rFonts w:eastAsia="Calibri" w:cs="Calibri" w:ascii="Calibri" w:hAnsi="Calibri"/>
+          <w:rFonts w:eastAsia="Calibri" w:cs="Calibri"/>
           <w:spacing w:val="-2"/>
           <w:lang w:val="cs-CZ"/>
         </w:rPr>
@@ -2701,7 +2701,7 @@
       </w:r>
       <w:r>
         <w:rPr>
-          <w:rFonts w:eastAsia="Calibri" w:cs="Calibri" w:ascii="Calibri" w:hAnsi="Calibri"/>
+          <w:rFonts w:eastAsia="Calibri" w:cs="Calibri"/>
           <w:spacing w:val="1"/>
           <w:lang w:val="cs-CZ"/>
         </w:rPr>
@@ -2709,7 +2709,7 @@
       </w:r>
       <w:r>
         <w:rPr>
-          <w:rFonts w:eastAsia="Calibri" w:cs="Calibri" w:ascii="Calibri" w:hAnsi="Calibri"/>
+          <w:rFonts w:eastAsia="Calibri" w:cs="Calibri"/>
           <w:lang w:val="cs-CZ"/>
         </w:rPr>
         <w:t xml:space="preserve">: </w:t>
@@ -2728,7 +2728,7 @@
       </w:pPr>
       <w:r>
         <w:rPr>
-          <w:rFonts w:eastAsia="Calibri" w:cs="Calibri" w:ascii="Calibri" w:hAnsi="Calibri"/>
+          <w:rFonts w:eastAsia="Calibri" w:cs="Calibri"/>
           <w:lang w:val="cs-CZ"/>
         </w:rPr>
       </w:r>
@@ -2747,7 +2747,7 @@
       </w:pPr>
       <w:r>
         <w:rPr>
-          <w:rFonts w:eastAsia="Calibri" w:cs="Calibri" w:ascii="Calibri" w:hAnsi="Calibri"/>
+          <w:rFonts w:eastAsia="Calibri" w:cs="Calibri"/>
           <w:spacing w:val="1"/>
           <w:lang w:val="cs-CZ"/>
         </w:rPr>
@@ -2788,7 +2788,7 @@
       </w:pPr>
       <w:r>
         <w:rPr>
-          <w:rFonts w:eastAsia="Calibri" w:cs="Calibri" w:ascii="Calibri" w:hAnsi="Calibri"/>
+          <w:rFonts w:eastAsia="Calibri" w:cs="Calibri"/>
           <w:spacing w:val="1"/>
           <w:lang w:val="cs-CZ"/>
         </w:rPr>
@@ -2809,7 +2809,7 @@
       </w:pPr>
       <w:r>
         <w:rPr>
-          <w:rFonts w:eastAsia="Calibri" w:cs="Calibri" w:ascii="Calibri" w:hAnsi="Calibri"/>
+          <w:rFonts w:eastAsia="Calibri" w:cs="Calibri"/>
           <w:spacing w:val="1"/>
           <w:lang w:val="cs-CZ"/>
         </w:rPr>
@@ -2921,7 +2921,7 @@
       </w:pPr>
       <w:r>
         <w:rPr>
-          <w:rFonts w:eastAsia="Calibri" w:cs="Calibri" w:ascii="Calibri" w:hAnsi="Calibri"/>
+          <w:rFonts w:eastAsia="Calibri" w:cs="Calibri"/>
           <w:b/>
           <w:lang w:val="cs-CZ"/>
         </w:rPr>
@@ -2942,7 +2942,7 @@
       </w:pPr>
       <w:r>
         <w:rPr>
-          <w:rFonts w:eastAsia="Calibri" w:cs="Calibri" w:ascii="Calibri" w:hAnsi="Calibri"/>
+          <w:rFonts w:eastAsia="Calibri" w:cs="Calibri"/>
           <w:b/>
           <w:lang w:val="cs-CZ"/>
         </w:rPr>
@@ -2962,7 +2962,7 @@
       </w:pPr>
       <w:r>
         <w:rPr>
-          <w:rFonts w:eastAsia="Calibri" w:cs="Calibri" w:ascii="Calibri" w:hAnsi="Calibri"/>
+          <w:rFonts w:eastAsia="Calibri" w:cs="Calibri"/>
           <w:b/>
           <w:lang w:val="cs-CZ"/>
         </w:rPr>
@@ -2972,7 +2972,7 @@
     <w:p>
       <w:pPr>
         <w:pStyle w:val="Normal"/>
-        <w:spacing w:lineRule="auto" w:line="240" w:before="41" w:after="0"/>
+        <w:spacing w:lineRule="auto" w:line="240" w:before="41" w:after="200"/>
         <w:ind w:start="116" w:end="4879"/>
         <w:jc w:val="both"/>
         <w:rPr>
@@ -2980,108 +2980,6 @@
           <w:b/>
           <w:lang w:val="cs-CZ"/>
         </w:rPr>
-      </w:pPr>
-      <w:bookmarkStart w:id="0" w:name="_GoBack"/>
-      <w:bookmarkEnd w:id="0"/>
-      <w:r>
-        <w:rPr>
-          <w:rFonts w:eastAsia="Calibri" w:cs="Calibri" w:ascii="Calibri" w:hAnsi="Calibri"/>
-          <w:b/>
-          <w:spacing w:val="-1"/>
-          <w:lang w:val="cs-CZ"/>
-        </w:rPr>
-        <w:t>vedou</w:t>
-      </w:r>
-      <w:r>
-        <w:rPr>
-          <w:rFonts w:eastAsia="Calibri" w:cs="Calibri" w:ascii="Calibri" w:hAnsi="Calibri"/>
-          <w:b/>
-          <w:spacing w:val="1"/>
-          <w:lang w:val="cs-CZ"/>
-        </w:rPr>
-        <w:t>c</w:t>
-      </w:r>
-      <w:r>
-        <w:rPr>
-          <w:rFonts w:eastAsia="Calibri" w:cs="Calibri" w:ascii="Calibri" w:hAnsi="Calibri"/>
-          <w:b/>
-          <w:lang w:val="cs-CZ"/>
-        </w:rPr>
-        <w:t>í</w:t>
-      </w:r>
-      <w:r>
-        <w:rPr>
-          <w:rFonts w:eastAsia="Calibri" w:cs="Calibri" w:ascii="Calibri" w:hAnsi="Calibri"/>
-          <w:b/>
-          <w:spacing w:val="18"/>
-          <w:lang w:val="cs-CZ"/>
-        </w:rPr>
-        <w:t xml:space="preserve"> K</w:t>
-      </w:r>
-      <w:r>
-        <w:rPr>
-          <w:rFonts w:eastAsia="Calibri" w:cs="Calibri" w:ascii="Calibri" w:hAnsi="Calibri"/>
-          <w:b/>
-          <w:spacing w:val="-1"/>
-          <w:lang w:val="cs-CZ"/>
-        </w:rPr>
-        <w:t>a</w:t>
-      </w:r>
-      <w:r>
-        <w:rPr>
-          <w:rFonts w:eastAsia="Calibri" w:cs="Calibri" w:ascii="Calibri" w:hAnsi="Calibri"/>
-          <w:b/>
-          <w:lang w:val="cs-CZ"/>
-        </w:rPr>
-        <w:t>t</w:t>
-      </w:r>
-      <w:r>
-        <w:rPr>
-          <w:rFonts w:eastAsia="Calibri" w:cs="Calibri" w:ascii="Calibri" w:hAnsi="Calibri"/>
-          <w:b/>
-          <w:spacing w:val="-1"/>
-          <w:lang w:val="cs-CZ"/>
-        </w:rPr>
-        <w:t>ed</w:t>
-      </w:r>
-      <w:r>
-        <w:rPr>
-          <w:rFonts w:eastAsia="Calibri" w:cs="Calibri" w:ascii="Calibri" w:hAnsi="Calibri"/>
-          <w:b/>
-          <w:spacing w:val="1"/>
-          <w:lang w:val="cs-CZ"/>
-        </w:rPr>
-        <w:t>r</w:t>
-      </w:r>
-      <w:r>
-        <w:rPr>
-          <w:rFonts w:eastAsia="Calibri" w:cs="Calibri" w:ascii="Calibri" w:hAnsi="Calibri"/>
-          <w:b/>
-          <w:lang w:val="cs-CZ"/>
-        </w:rPr>
-        <w:t>y</w:t>
-      </w:r>
-      <w:r>
-        <w:rPr>
-          <w:rFonts w:eastAsia="Calibri" w:cs="Calibri" w:ascii="Calibri" w:hAnsi="Calibri"/>
-          <w:b/>
-          <w:spacing w:val="21"/>
-          <w:lang w:val="cs-CZ"/>
-        </w:rPr>
-        <w:t xml:space="preserve"> </w:t>
-      </w:r>
-      <w:r>
-        <w:rPr>
-          <w:rFonts w:eastAsia="Calibri" w:cs="Calibri" w:ascii="Calibri" w:hAnsi="Calibri"/>
-          <w:b/>
-          <w:spacing w:val="-3"/>
-          <w:lang w:val="cs-CZ"/>
-        </w:rPr>
-        <w:t>technických studií</w:t>
-      </w:r>
-    </w:p>
-    <w:p>
-      <w:pPr>
         <w:sectPr>
           <w:type w:val="nextPage"/>
           <w:pgSz w:w="11906" w:h="16838"/>
@@ -3089,8 +2987,107 @@
           <w:pgNumType w:fmt="decimal"/>
           <w:formProt w:val="false"/>
           <w:textDirection w:val="lrTb"/>
+          <w:docGrid w:type="default" w:linePitch="100" w:charSpace="0"/>
         </w:sectPr>
       </w:pPr>
+      <w:bookmarkStart w:id="0" w:name="_GoBack"/>
+      <w:bookmarkEnd w:id="0"/>
+      <w:r>
+        <w:rPr>
+          <w:rFonts w:eastAsia="Calibri" w:cs="Calibri"/>
+          <w:b/>
+          <w:spacing w:val="-1"/>
+          <w:lang w:val="cs-CZ"/>
+        </w:rPr>
+        <w:t>vedou</w:t>
+      </w:r>
+      <w:r>
+        <w:rPr>
+          <w:rFonts w:eastAsia="Calibri" w:cs="Calibri"/>
+          <w:b/>
+          <w:spacing w:val="1"/>
+          <w:lang w:val="cs-CZ"/>
+        </w:rPr>
+        <w:t>c</w:t>
+      </w:r>
+      <w:r>
+        <w:rPr>
+          <w:rFonts w:eastAsia="Calibri" w:cs="Calibri"/>
+          <w:b/>
+          <w:lang w:val="cs-CZ"/>
+        </w:rPr>
+        <w:t>í</w:t>
+      </w:r>
+      <w:r>
+        <w:rPr>
+          <w:rFonts w:eastAsia="Calibri" w:cs="Calibri"/>
+          <w:b/>
+          <w:spacing w:val="18"/>
+          <w:lang w:val="cs-CZ"/>
+        </w:rPr>
+        <w:t xml:space="preserve"> K</w:t>
+      </w:r>
+      <w:r>
+        <w:rPr>
+          <w:rFonts w:eastAsia="Calibri" w:cs="Calibri"/>
+          <w:b/>
+          <w:spacing w:val="-1"/>
+          <w:lang w:val="cs-CZ"/>
+        </w:rPr>
+        <w:t>a</w:t>
+      </w:r>
+      <w:r>
+        <w:rPr>
+          <w:rFonts w:eastAsia="Calibri" w:cs="Calibri"/>
+          <w:b/>
+          <w:lang w:val="cs-CZ"/>
+        </w:rPr>
+        <w:t>t</w:t>
+      </w:r>
+      <w:r>
+        <w:rPr>
+          <w:rFonts w:eastAsia="Calibri" w:cs="Calibri"/>
+          <w:b/>
+          <w:spacing w:val="-1"/>
+          <w:lang w:val="cs-CZ"/>
+        </w:rPr>
+        <w:t>ed</w:t>
+      </w:r>
+      <w:r>
+        <w:rPr>
+          <w:rFonts w:eastAsia="Calibri" w:cs="Calibri"/>
+          <w:b/>
+          <w:spacing w:val="1"/>
+          <w:lang w:val="cs-CZ"/>
+        </w:rPr>
+        <w:t>r</w:t>
+      </w:r>
+      <w:r>
+        <w:rPr>
+          <w:rFonts w:eastAsia="Calibri" w:cs="Calibri"/>
+          <w:b/>
+          <w:lang w:val="cs-CZ"/>
+        </w:rPr>
+        <w:t>y</w:t>
+      </w:r>
+      <w:r>
+        <w:rPr>
+          <w:rFonts w:eastAsia="Calibri" w:cs="Calibri"/>
+          <w:b/>
+          <w:spacing w:val="21"/>
+          <w:lang w:val="cs-CZ"/>
+        </w:rPr>
+        <w:t xml:space="preserve"> </w:t>
+      </w:r>
+      <w:r>
+        <w:rPr>
+          <w:rFonts w:eastAsia="Calibri" w:cs="Calibri"/>
+          <w:b/>
+          <w:spacing w:val="-3"/>
+          <w:lang w:val="cs-CZ"/>
+        </w:rPr>
+        <w:t>technických studií</w:t>
+      </w:r>
     </w:p>
     <w:p>
       <w:pPr>
@@ -3107,7 +3104,7 @@
       </w:pPr>
       <w:r>
         <w:rPr>
-          <w:rFonts w:eastAsia="Calibri" w:cs="Calibri" w:ascii="Calibri" w:hAnsi="Calibri"/>
+          <w:rFonts w:eastAsia="Calibri" w:cs="Calibri"/>
           <w:b/>
           <w:spacing w:val="1"/>
           <w:lang w:val="cs-CZ"/>
@@ -3130,21 +3127,12 @@
       </w:pPr>
       <w:r>
         <w:rPr>
-          <w:rFonts w:eastAsia="Calibri" w:cs="Calibri" w:ascii="Calibri" w:hAnsi="Calibri"/>
-          <w:b/>
-          <w:spacing w:val="1"/>
-          <w:lang w:val="cs-CZ"/>
-        </w:rPr>
-        <w:t xml:space="preserve">11 </w:t>
-      </w:r>
-      <w:r>
-        <w:rPr>
-          <w:rFonts w:eastAsia="Calibri" w:cs="Calibri" w:ascii="Calibri" w:hAnsi="Calibri"/>
-          <w:b/>
-          <w:spacing w:val="1"/>
-          <w:lang w:val="cs-CZ"/>
-        </w:rPr>
-        <w:t>Datové struktury a algoritmy (DSA)</w:t>
+          <w:rFonts w:eastAsia="Calibri" w:cs="Calibri"/>
+          <w:b/>
+          <w:spacing w:val="1"/>
+          <w:lang w:val="cs-CZ"/>
+        </w:rPr>
+        <w:t>11 Datové struktury a algoritmy (DSA)</w:t>
       </w:r>
     </w:p>
     <w:p>
@@ -3162,7 +3150,7 @@
       </w:pPr>
       <w:r>
         <w:rPr>
-          <w:rFonts w:eastAsia="Calibri" w:cs="Calibri" w:ascii="Calibri" w:hAnsi="Calibri"/>
+          <w:rFonts w:eastAsia="Calibri" w:cs="Calibri"/>
           <w:i/>
           <w:spacing w:val="-1"/>
           <w:lang w:val="cs-CZ"/>
@@ -3185,7 +3173,7 @@
       </w:pPr>
       <w:r>
         <w:rPr>
-          <w:rFonts w:eastAsia="Calibri" w:cs="Calibri" w:ascii="Calibri" w:hAnsi="Calibri"/>
+          <w:rFonts w:eastAsia="Calibri" w:cs="Calibri"/>
           <w:i/>
           <w:spacing w:val="-1"/>
           <w:lang w:val="cs-CZ"/>
@@ -3207,21 +3195,12 @@
       </w:pPr>
       <w:r>
         <w:rPr>
-          <w:rFonts w:eastAsia="Calibri" w:cs="Calibri" w:ascii="Calibri" w:hAnsi="Calibri"/>
-          <w:b/>
-          <w:spacing w:val="1"/>
-          <w:lang w:val="cs-CZ"/>
-        </w:rPr>
-        <w:t xml:space="preserve">12 </w:t>
-      </w:r>
-      <w:r>
-        <w:rPr>
-          <w:rFonts w:eastAsia="Calibri" w:cs="Calibri" w:ascii="Calibri" w:hAnsi="Calibri"/>
-          <w:b/>
-          <w:spacing w:val="1"/>
-          <w:lang w:val="cs-CZ"/>
-        </w:rPr>
-        <w:t>Diskrétní struktury (DIS)</w:t>
+          <w:rFonts w:eastAsia="Calibri" w:cs="Calibri"/>
+          <w:b/>
+          <w:spacing w:val="1"/>
+          <w:lang w:val="cs-CZ"/>
+        </w:rPr>
+        <w:t>12 Diskrétní struktury (DIS)</w:t>
       </w:r>
     </w:p>
     <w:p>
@@ -3239,7 +3218,7 @@
       </w:pPr>
       <w:r>
         <w:rPr>
-          <w:rFonts w:eastAsia="Calibri" w:cs="Calibri" w:ascii="Calibri" w:hAnsi="Calibri"/>
+          <w:rFonts w:eastAsia="Calibri" w:cs="Calibri"/>
           <w:i/>
           <w:spacing w:val="-1"/>
           <w:lang w:val="cs-CZ"/>
@@ -3262,7 +3241,7 @@
       </w:pPr>
       <w:r>
         <w:rPr>
-          <w:rFonts w:eastAsia="Calibri" w:cs="Calibri" w:ascii="Calibri" w:hAnsi="Calibri"/>
+          <w:rFonts w:eastAsia="Calibri" w:cs="Calibri"/>
           <w:b/>
           <w:spacing w:val="1"/>
           <w:lang w:val="cs-CZ"/>
@@ -3284,21 +3263,12 @@
       </w:pPr>
       <w:r>
         <w:rPr>
-          <w:rFonts w:eastAsia="Calibri" w:cs="Calibri" w:ascii="Calibri" w:hAnsi="Calibri"/>
-          <w:b/>
-          <w:spacing w:val="1"/>
-          <w:lang w:val="cs-CZ"/>
-        </w:rPr>
-        <w:t xml:space="preserve">13 </w:t>
-      </w:r>
-      <w:r>
-        <w:rPr>
-          <w:rFonts w:eastAsia="Calibri" w:cs="Calibri" w:ascii="Calibri" w:hAnsi="Calibri"/>
-          <w:b/>
-          <w:spacing w:val="1"/>
-          <w:lang w:val="cs-CZ"/>
-        </w:rPr>
-        <w:t>Operační systémy (OPS)</w:t>
+          <w:rFonts w:eastAsia="Calibri" w:cs="Calibri"/>
+          <w:b/>
+          <w:spacing w:val="1"/>
+          <w:lang w:val="cs-CZ"/>
+        </w:rPr>
+        <w:t>13 Operační systémy (OPS)</w:t>
       </w:r>
     </w:p>
     <w:p>
@@ -3316,7 +3286,7 @@
       </w:pPr>
       <w:r>
         <w:rPr>
-          <w:rFonts w:eastAsia="Calibri" w:cs="Calibri" w:ascii="Calibri" w:hAnsi="Calibri"/>
+          <w:rFonts w:eastAsia="Calibri" w:cs="Calibri"/>
           <w:i/>
           <w:color w:val="FB9E00"/>
           <w:spacing w:val="-1"/>
@@ -3326,7 +3296,7 @@
       </w:r>
       <w:r>
         <w:rPr>
-          <w:rFonts w:eastAsia="Calibri" w:cs="Calibri" w:ascii="Calibri" w:hAnsi="Calibri"/>
+          <w:rFonts w:eastAsia="Calibri" w:cs="Calibri"/>
           <w:i/>
           <w:spacing w:val="-1"/>
           <w:lang w:val="cs-CZ"/>
@@ -3349,7 +3319,7 @@
       </w:pPr>
       <w:r>
         <w:rPr>
-          <w:rFonts w:eastAsia="Calibri" w:cs="Calibri" w:ascii="Calibri" w:hAnsi="Calibri"/>
+          <w:rFonts w:eastAsia="Calibri" w:cs="Calibri"/>
           <w:b/>
           <w:spacing w:val="1"/>
           <w:lang w:val="cs-CZ"/>
@@ -3371,21 +3341,12 @@
       </w:pPr>
       <w:r>
         <w:rPr>
-          <w:rFonts w:eastAsia="Calibri" w:cs="Calibri" w:ascii="Calibri" w:hAnsi="Calibri"/>
-          <w:b/>
-          <w:spacing w:val="1"/>
-          <w:lang w:val="cs-CZ"/>
-        </w:rPr>
-        <w:t xml:space="preserve">14 </w:t>
-      </w:r>
-      <w:r>
-        <w:rPr>
-          <w:rFonts w:eastAsia="Calibri" w:cs="Calibri" w:ascii="Calibri" w:hAnsi="Calibri"/>
-          <w:b/>
-          <w:spacing w:val="1"/>
-          <w:lang w:val="cs-CZ"/>
-        </w:rPr>
-        <w:t>Programovací jazyky a překladače (PJP)</w:t>
+          <w:rFonts w:eastAsia="Calibri" w:cs="Calibri"/>
+          <w:b/>
+          <w:spacing w:val="1"/>
+          <w:lang w:val="cs-CZ"/>
+        </w:rPr>
+        <w:t>14 Programovací jazyky a překladače (PJP)</w:t>
       </w:r>
     </w:p>
     <w:p>
@@ -3403,7 +3364,7 @@
       </w:pPr>
       <w:r>
         <w:rPr>
-          <w:rFonts w:eastAsia="Calibri" w:cs="Calibri" w:ascii="Calibri" w:hAnsi="Calibri"/>
+          <w:rFonts w:eastAsia="Calibri" w:cs="Calibri"/>
           <w:i/>
           <w:spacing w:val="-1"/>
           <w:lang w:val="cs-CZ"/>
@@ -3426,7 +3387,7 @@
       </w:pPr>
       <w:r>
         <w:rPr>
-          <w:rFonts w:eastAsia="Calibri" w:cs="Calibri" w:ascii="Calibri" w:hAnsi="Calibri"/>
+          <w:rFonts w:eastAsia="Calibri" w:cs="Calibri"/>
           <w:b/>
           <w:spacing w:val="1"/>
           <w:lang w:val="cs-CZ"/>
@@ -3448,21 +3409,12 @@
       </w:pPr>
       <w:r>
         <w:rPr>
-          <w:rFonts w:eastAsia="Calibri" w:cs="Calibri" w:ascii="Calibri" w:hAnsi="Calibri"/>
-          <w:b/>
-          <w:spacing w:val="1"/>
-          <w:lang w:val="cs-CZ"/>
-        </w:rPr>
-        <w:t xml:space="preserve">15 </w:t>
-      </w:r>
-      <w:r>
-        <w:rPr>
-          <w:rFonts w:eastAsia="Calibri" w:cs="Calibri" w:ascii="Calibri" w:hAnsi="Calibri"/>
-          <w:b/>
-          <w:spacing w:val="1"/>
-          <w:lang w:val="cs-CZ"/>
-        </w:rPr>
-        <w:t>Základy strukturované programování (ZSP)</w:t>
+          <w:rFonts w:eastAsia="Calibri" w:cs="Calibri"/>
+          <w:b/>
+          <w:spacing w:val="1"/>
+          <w:lang w:val="cs-CZ"/>
+        </w:rPr>
+        <w:t>15 Základy strukturované programování (ZSP)</w:t>
       </w:r>
     </w:p>
     <w:p>
@@ -3480,7 +3432,7 @@
       </w:pPr>
       <w:r>
         <w:rPr>
-          <w:rFonts w:eastAsia="Calibri" w:cs="Calibri" w:ascii="Calibri" w:hAnsi="Calibri"/>
+          <w:rFonts w:eastAsia="Calibri" w:cs="Calibri"/>
           <w:i/>
           <w:spacing w:val="-1"/>
           <w:lang w:val="cs-CZ"/>
@@ -3503,7 +3455,7 @@
       </w:pPr>
       <w:r>
         <w:rPr>
-          <w:rFonts w:eastAsia="Calibri" w:cs="Calibri" w:ascii="Calibri" w:hAnsi="Calibri"/>
+          <w:rFonts w:eastAsia="Calibri" w:cs="Calibri"/>
           <w:i/>
           <w:spacing w:val="-1"/>
           <w:lang w:val="cs-CZ"/>
@@ -3525,7 +3477,7 @@
       </w:pPr>
       <w:r>
         <w:rPr>
-          <w:rFonts w:eastAsia="Calibri" w:cs="Calibri" w:ascii="Calibri" w:hAnsi="Calibri"/>
+          <w:rFonts w:eastAsia="Calibri" w:cs="Calibri"/>
           <w:b/>
           <w:spacing w:val="1"/>
           <w:lang w:val="cs-CZ"/>
@@ -3545,23 +3497,13 @@
       </w:pPr>
       <w:r>
         <w:rPr>
-          <w:rFonts w:eastAsia="Calibri" w:cs="Calibri" w:ascii="Calibri" w:hAnsi="Calibri"/>
+          <w:rFonts w:eastAsia="Calibri" w:cs="Calibri"/>
           <w:b/>
           <w:color w:val="FB9E00"/>
           <w:spacing w:val="1"/>
           <w:lang w:val="cs-CZ"/>
         </w:rPr>
-        <w:t xml:space="preserve">21 </w:t>
-      </w:r>
-      <w:r>
-        <w:rPr>
-          <w:rFonts w:eastAsia="Calibri" w:cs="Calibri" w:ascii="Calibri" w:hAnsi="Calibri"/>
-          <w:b/>
-          <w:color w:val="FB9E00"/>
-          <w:spacing w:val="1"/>
-          <w:lang w:val="cs-CZ"/>
-        </w:rPr>
-        <w:t>Bezpečnost a ochrana dat (BOD)</w:t>
+        <w:t>21 Bezpečnost a ochrana dat (BOD)</w:t>
       </w:r>
     </w:p>
     <w:p>
@@ -3576,7 +3518,7 @@
       </w:pPr>
       <w:r>
         <w:rPr>
-          <w:rFonts w:eastAsia="Calibri" w:cs="Calibri" w:ascii="Calibri" w:hAnsi="Calibri"/>
+          <w:rFonts w:eastAsia="Calibri" w:cs="Calibri"/>
           <w:i/>
           <w:color w:val="FB9E00"/>
           <w:spacing w:val="-1"/>
@@ -3600,7 +3542,7 @@
       </w:pPr>
       <w:r>
         <w:rPr>
-          <w:rFonts w:eastAsia="Calibri" w:cs="Calibri" w:ascii="Calibri" w:hAnsi="Calibri"/>
+          <w:rFonts w:eastAsia="Calibri" w:cs="Calibri"/>
           <w:b/>
           <w:spacing w:val="1"/>
           <w:lang w:val="cs-CZ"/>
@@ -3622,21 +3564,12 @@
       </w:pPr>
       <w:r>
         <w:rPr>
-          <w:rFonts w:eastAsia="Calibri" w:cs="Calibri" w:ascii="Calibri" w:hAnsi="Calibri"/>
-          <w:b/>
-          <w:spacing w:val="1"/>
-          <w:lang w:val="cs-CZ"/>
-        </w:rPr>
-        <w:t xml:space="preserve">22 </w:t>
-      </w:r>
-      <w:r>
-        <w:rPr>
-          <w:rFonts w:eastAsia="Calibri" w:cs="Calibri" w:ascii="Calibri" w:hAnsi="Calibri"/>
-          <w:b/>
-          <w:spacing w:val="1"/>
-          <w:lang w:val="cs-CZ"/>
-        </w:rPr>
-        <w:t>Objektově orientované programování (OOP)</w:t>
+          <w:rFonts w:eastAsia="Calibri" w:cs="Calibri"/>
+          <w:b/>
+          <w:spacing w:val="1"/>
+          <w:lang w:val="cs-CZ"/>
+        </w:rPr>
+        <w:t>22 Objektově orientované programování (OOP)</w:t>
       </w:r>
     </w:p>
     <w:p>
@@ -3654,7 +3587,7 @@
       </w:pPr>
       <w:r>
         <w:rPr>
-          <w:rFonts w:eastAsia="Calibri" w:cs="Calibri" w:ascii="Calibri" w:hAnsi="Calibri"/>
+          <w:rFonts w:eastAsia="Calibri" w:cs="Calibri"/>
           <w:i/>
           <w:spacing w:val="-1"/>
           <w:lang w:val="cs-CZ"/>
@@ -3663,7 +3596,7 @@
       </w:r>
       <w:r>
         <w:rPr>
-          <w:rFonts w:eastAsia="Calibri" w:cs="Calibri" w:ascii="Calibri" w:hAnsi="Calibri"/>
+          <w:rFonts w:eastAsia="Calibri" w:cs="Calibri"/>
           <w:i/>
           <w:color w:val="FB9E00"/>
           <w:spacing w:val="-1"/>
@@ -3673,7 +3606,7 @@
       </w:r>
       <w:r>
         <w:rPr>
-          <w:rFonts w:eastAsia="Calibri" w:cs="Calibri" w:ascii="Calibri" w:hAnsi="Calibri"/>
+          <w:rFonts w:eastAsia="Calibri" w:cs="Calibri"/>
           <w:i/>
           <w:spacing w:val="-1"/>
           <w:lang w:val="cs-CZ"/>
@@ -3696,7 +3629,7 @@
       </w:pPr>
       <w:r>
         <w:rPr>
-          <w:rFonts w:eastAsia="Calibri" w:cs="Calibri" w:ascii="Calibri" w:hAnsi="Calibri"/>
+          <w:rFonts w:eastAsia="Calibri" w:cs="Calibri"/>
           <w:i/>
           <w:spacing w:val="-1"/>
           <w:lang w:val="cs-CZ"/>
@@ -3718,21 +3651,12 @@
       </w:pPr>
       <w:r>
         <w:rPr>
-          <w:rFonts w:eastAsia="Calibri" w:cs="Calibri" w:ascii="Calibri" w:hAnsi="Calibri"/>
-          <w:b/>
-          <w:spacing w:val="1"/>
-          <w:lang w:val="cs-CZ"/>
-        </w:rPr>
-        <w:t xml:space="preserve">23 </w:t>
-      </w:r>
-      <w:r>
-        <w:rPr>
-          <w:rFonts w:eastAsia="Calibri" w:cs="Calibri" w:ascii="Calibri" w:hAnsi="Calibri"/>
-          <w:b/>
-          <w:spacing w:val="1"/>
-          <w:lang w:val="cs-CZ"/>
-        </w:rPr>
-        <w:t>Softwarové inženýrství (SWI)</w:t>
+          <w:rFonts w:eastAsia="Calibri" w:cs="Calibri"/>
+          <w:b/>
+          <w:spacing w:val="1"/>
+          <w:lang w:val="cs-CZ"/>
+        </w:rPr>
+        <w:t>23 Softwarové inženýrství (SWI)</w:t>
       </w:r>
     </w:p>
     <w:p>
@@ -3750,7 +3674,7 @@
       </w:pPr>
       <w:r>
         <w:rPr>
-          <w:rFonts w:eastAsia="Calibri" w:cs="Calibri" w:ascii="Calibri" w:hAnsi="Calibri"/>
+          <w:rFonts w:eastAsia="Calibri" w:cs="Calibri"/>
           <w:i/>
           <w:spacing w:val="-1"/>
           <w:lang w:val="cs-CZ"/>
@@ -3773,7 +3697,7 @@
       </w:pPr>
       <w:r>
         <w:rPr>
-          <w:rFonts w:eastAsia="Calibri" w:cs="Calibri" w:ascii="Calibri" w:hAnsi="Calibri"/>
+          <w:rFonts w:eastAsia="Calibri" w:cs="Calibri"/>
           <w:i/>
           <w:spacing w:val="-1"/>
           <w:lang w:val="cs-CZ"/>
@@ -3795,21 +3719,12 @@
       </w:pPr>
       <w:r>
         <w:rPr>
-          <w:rFonts w:eastAsia="Calibri" w:cs="Calibri" w:ascii="Calibri" w:hAnsi="Calibri"/>
-          <w:b/>
-          <w:spacing w:val="1"/>
-          <w:lang w:val="cs-CZ"/>
-        </w:rPr>
-        <w:t xml:space="preserve">24 </w:t>
-      </w:r>
-      <w:r>
-        <w:rPr>
-          <w:rFonts w:eastAsia="Calibri" w:cs="Calibri" w:ascii="Calibri" w:hAnsi="Calibri"/>
-          <w:b/>
-          <w:spacing w:val="1"/>
-          <w:lang w:val="cs-CZ"/>
-        </w:rPr>
-        <w:t>Řízení softwarových projektů (ŘSP)</w:t>
+          <w:rFonts w:eastAsia="Calibri" w:cs="Calibri"/>
+          <w:b/>
+          <w:spacing w:val="1"/>
+          <w:lang w:val="cs-CZ"/>
+        </w:rPr>
+        <w:t>24 Řízení softwarových projektů (ŘSP)</w:t>
       </w:r>
     </w:p>
     <w:p>
@@ -3827,7 +3742,7 @@
       </w:pPr>
       <w:r>
         <w:rPr>
-          <w:rFonts w:eastAsia="Calibri" w:cs="Calibri" w:ascii="Calibri" w:hAnsi="Calibri"/>
+          <w:rFonts w:eastAsia="Calibri" w:cs="Calibri"/>
           <w:i/>
           <w:spacing w:val="-1"/>
           <w:lang w:val="cs-CZ"/>
@@ -3850,7 +3765,7 @@
       </w:pPr>
       <w:r>
         <w:rPr>
-          <w:rFonts w:eastAsia="Calibri" w:cs="Calibri" w:ascii="Calibri" w:hAnsi="Calibri"/>
+          <w:rFonts w:eastAsia="Calibri" w:cs="Calibri"/>
           <w:b/>
           <w:spacing w:val="1"/>
           <w:lang w:val="cs-CZ"/>
@@ -3872,21 +3787,12 @@
       </w:pPr>
       <w:r>
         <w:rPr>
-          <w:rFonts w:eastAsia="Calibri" w:cs="Calibri" w:ascii="Calibri" w:hAnsi="Calibri"/>
-          <w:b/>
-          <w:spacing w:val="1"/>
-          <w:lang w:val="cs-CZ"/>
-        </w:rPr>
-        <w:t xml:space="preserve">25 </w:t>
-      </w:r>
-      <w:r>
-        <w:rPr>
-          <w:rFonts w:eastAsia="Calibri" w:cs="Calibri" w:ascii="Calibri" w:hAnsi="Calibri"/>
-          <w:b/>
-          <w:spacing w:val="1"/>
-          <w:lang w:val="cs-CZ"/>
-        </w:rPr>
-        <w:t>Tvorba internetových stránek (TIS)</w:t>
+          <w:rFonts w:eastAsia="Calibri" w:cs="Calibri"/>
+          <w:b/>
+          <w:spacing w:val="1"/>
+          <w:lang w:val="cs-CZ"/>
+        </w:rPr>
+        <w:t>25 Tvorba internetových stránek (TIS)</w:t>
       </w:r>
     </w:p>
     <w:p>
@@ -3896,16 +3802,14 @@
         <w:ind w:start="116" w:end="49"/>
         <w:jc w:val="both"/>
         <w:rPr>
-          <w:rFonts w:ascii="Calibri" w:hAnsi="Calibri" w:eastAsia="Calibri" w:cs="Calibri"/>
-          <w:i/>
-          <w:spacing w:val="-1"/>
-          <w:lang w:val="cs-CZ"/>
-        </w:rPr>
-      </w:pPr>
-      <w:r>
-        <w:rPr>
-          <w:rFonts w:eastAsia="Calibri" w:cs="Calibri" w:ascii="Calibri" w:hAnsi="Calibri"/>
-          <w:i/>
+          <w:color w:val="FB9E00"/>
+        </w:rPr>
+      </w:pPr>
+      <w:r>
+        <w:rPr>
+          <w:rFonts w:eastAsia="Calibri" w:cs="Calibri"/>
+          <w:i/>
+          <w:color w:val="FB9E00"/>
           <w:spacing w:val="-1"/>
           <w:lang w:val="cs-CZ"/>
         </w:rPr>
@@ -3927,7 +3831,7 @@
       </w:pPr>
       <w:r>
         <w:rPr>
-          <w:rFonts w:eastAsia="Calibri" w:cs="Calibri" w:ascii="Calibri" w:hAnsi="Calibri"/>
+          <w:rFonts w:eastAsia="Calibri" w:cs="Calibri"/>
           <w:i/>
           <w:spacing w:val="-1"/>
           <w:lang w:val="cs-CZ"/>
@@ -3949,21 +3853,12 @@
       </w:pPr>
       <w:r>
         <w:rPr>
-          <w:rFonts w:eastAsia="Calibri" w:cs="Calibri" w:ascii="Calibri" w:hAnsi="Calibri"/>
-          <w:b/>
-          <w:spacing w:val="1"/>
-          <w:lang w:val="cs-CZ"/>
-        </w:rPr>
-        <w:t xml:space="preserve">26 </w:t>
-      </w:r>
-      <w:r>
-        <w:rPr>
-          <w:rFonts w:eastAsia="Calibri" w:cs="Calibri" w:ascii="Calibri" w:hAnsi="Calibri"/>
-          <w:b/>
-          <w:spacing w:val="1"/>
-          <w:lang w:val="cs-CZ"/>
-        </w:rPr>
-        <w:t>Úvod do databázových systémů (DB)</w:t>
+          <w:rFonts w:eastAsia="Calibri" w:cs="Calibri"/>
+          <w:b/>
+          <w:spacing w:val="1"/>
+          <w:lang w:val="cs-CZ"/>
+        </w:rPr>
+        <w:t>26 Úvod do databázových systémů (DB)</w:t>
       </w:r>
     </w:p>
     <w:p>
@@ -3981,12 +3876,22 @@
       </w:pPr>
       <w:r>
         <w:rPr>
-          <w:rFonts w:eastAsia="Calibri" w:cs="Calibri" w:ascii="Calibri" w:hAnsi="Calibri"/>
-          <w:i/>
-          <w:spacing w:val="-1"/>
-          <w:lang w:val="cs-CZ"/>
-        </w:rPr>
-        <w:t>Databázový systém (definice, účel, database management system). Návrh databáze (konceptuální, logický a fyzický model). Konceptuální modelování, ER model (princip a účel konceptuální analýzy, základní konstrukty ER modelu, integritní omezení). Relační model dat (definice, princip, integritní omezení). Relační algebra (základní operace, spojení, použití relační algebry pro dotazování). Transformace ER modelu do relačního modelu. Jazyk SQL pro definici dat, jazyk SQL pro manipulaci s daty. Příkaz SELECT jazyka SQL (základní dotazy, použitelné klauzule, dotazy nad více tabulkami a spojení, agregační funkce, vnořené poddotazy, implementace univerzálního a existenčního kvantifikátoru). Další možnosti jazyka SQL (ošetření hodnot NULL, podmíněné větvení, řádkové výrazy). Implementace a použití transakcí v jazyce SQL.</w:t>
+          <w:rFonts w:eastAsia="Calibri" w:cs="Calibri"/>
+          <w:i/>
+          <w:color w:val="FB9E00"/>
+          <w:spacing w:val="-1"/>
+          <w:lang w:val="cs-CZ"/>
+        </w:rPr>
+        <w:t>Databázový systém (definice, účel, database management system). Návrh databáze (konceptuální, logický a fyzický model)</w:t>
+      </w:r>
+      <w:r>
+        <w:rPr>
+          <w:rFonts w:eastAsia="Calibri" w:cs="Calibri"/>
+          <w:i/>
+          <w:spacing w:val="-1"/>
+          <w:lang w:val="cs-CZ"/>
+        </w:rPr>
+        <w:t>. Konceptuální modelování, ER model (princip a účel konceptuální analýzy, základní konstrukty ER modelu, integritní omezení). Relační model dat (definice, princip, integritní omezení). Relační algebra (základní operace, spojení, použití relační algebry pro dotazování). Transformace ER modelu do relačního modelu. Jazyk SQL pro definici dat, jazyk SQL pro manipulaci s daty. Příkaz SELECT jazyka SQL (základní dotazy, použitelné klauzule, dotazy nad více tabulkami a spojení, agregační funkce, vnořené poddotazy, implementace univerzálního a existenčního kvantifikátoru). Další možnosti jazyka SQL (ošetření hodnot NULL, podmíněné větvení, řádkové výrazy). Implementace a použití transakcí v jazyce SQL.</w:t>
       </w:r>
     </w:p>
     <w:p>
@@ -4004,7 +3909,7 @@
       </w:pPr>
       <w:r>
         <w:rPr>
-          <w:rFonts w:eastAsia="Calibri" w:cs="Calibri" w:ascii="Calibri" w:hAnsi="Calibri"/>
+          <w:rFonts w:eastAsia="Calibri" w:cs="Calibri"/>
           <w:b/>
           <w:spacing w:val="1"/>
           <w:lang w:val="cs-CZ"/>
@@ -4026,21 +3931,12 @@
       </w:pPr>
       <w:r>
         <w:rPr>
-          <w:rFonts w:eastAsia="Calibri" w:cs="Calibri" w:ascii="Calibri" w:hAnsi="Calibri"/>
-          <w:b/>
-          <w:spacing w:val="1"/>
-          <w:lang w:val="cs-CZ"/>
-        </w:rPr>
-        <w:t xml:space="preserve">27 </w:t>
-      </w:r>
-      <w:r>
-        <w:rPr>
-          <w:rFonts w:eastAsia="Calibri" w:cs="Calibri" w:ascii="Calibri" w:hAnsi="Calibri"/>
-          <w:b/>
-          <w:spacing w:val="1"/>
-          <w:lang w:val="cs-CZ"/>
-        </w:rPr>
-        <w:t xml:space="preserve">Úvod do počítačových sítí (UPS) </w:t>
+          <w:rFonts w:eastAsia="Calibri" w:cs="Calibri"/>
+          <w:b/>
+          <w:spacing w:val="1"/>
+          <w:lang w:val="cs-CZ"/>
+        </w:rPr>
+        <w:t xml:space="preserve">27 Úvod do počítačových sítí (UPS) </w:t>
       </w:r>
     </w:p>
     <w:p>
@@ -4058,7 +3954,7 @@
       </w:pPr>
       <w:r>
         <w:rPr>
-          <w:rFonts w:eastAsia="Calibri" w:cs="Calibri" w:ascii="Calibri" w:hAnsi="Calibri"/>
+          <w:rFonts w:eastAsia="Calibri" w:cs="Calibri"/>
           <w:i/>
           <w:spacing w:val="-1"/>
           <w:lang w:val="cs-CZ"/>
@@ -4081,7 +3977,7 @@
       </w:pPr>
       <w:r>
         <w:rPr>
-          <w:rFonts w:eastAsia="Calibri" w:cs="Calibri" w:ascii="Calibri" w:hAnsi="Calibri"/>
+          <w:rFonts w:eastAsia="Calibri" w:cs="Calibri"/>
           <w:i/>
           <w:spacing w:val="-1"/>
           <w:lang w:val="cs-CZ"/>
@@ -4103,7 +3999,7 @@
       </w:pPr>
       <w:r>
         <w:rPr>
-          <w:rFonts w:eastAsia="Calibri" w:cs="Calibri" w:ascii="Calibri" w:hAnsi="Calibri"/>
+          <w:rFonts w:eastAsia="Calibri" w:cs="Calibri"/>
           <w:b/>
           <w:spacing w:val="1"/>
           <w:lang w:val="cs-CZ"/>
@@ -4126,21 +4022,12 @@
       </w:pPr>
       <w:r>
         <w:rPr>
-          <w:rFonts w:eastAsia="Calibri" w:cs="Calibri" w:ascii="Calibri" w:hAnsi="Calibri"/>
-          <w:b/>
-          <w:spacing w:val="1"/>
-          <w:lang w:val="cs-CZ"/>
-        </w:rPr>
-        <w:t xml:space="preserve">31 </w:t>
-      </w:r>
-      <w:r>
-        <w:rPr>
-          <w:rFonts w:eastAsia="Calibri" w:cs="Calibri" w:ascii="Calibri" w:hAnsi="Calibri"/>
-          <w:b/>
-          <w:spacing w:val="1"/>
-          <w:lang w:val="cs-CZ"/>
-        </w:rPr>
-        <w:t>Návrh a implementace databázových systémů (NIDB)</w:t>
+          <w:rFonts w:eastAsia="Calibri" w:cs="Calibri"/>
+          <w:b/>
+          <w:spacing w:val="1"/>
+          <w:lang w:val="cs-CZ"/>
+        </w:rPr>
+        <w:t>31 Návrh a implementace databázových systémů (NIDB)</w:t>
       </w:r>
     </w:p>
     <w:p>
@@ -4158,7 +4045,7 @@
       </w:pPr>
       <w:r>
         <w:rPr>
-          <w:rFonts w:eastAsia="Calibri" w:cs="Calibri" w:ascii="Calibri" w:hAnsi="Calibri"/>
+          <w:rFonts w:eastAsia="Calibri" w:cs="Calibri"/>
           <w:i/>
           <w:color w:val="FB9E00"/>
           <w:spacing w:val="-1"/>
@@ -4168,7 +4055,7 @@
       </w:r>
       <w:r>
         <w:rPr>
-          <w:rFonts w:eastAsia="Calibri" w:cs="Calibri" w:ascii="Calibri" w:hAnsi="Calibri"/>
+          <w:rFonts w:eastAsia="Calibri" w:cs="Calibri"/>
           <w:i/>
           <w:spacing w:val="-1"/>
           <w:lang w:val="cs-CZ"/>
@@ -4191,7 +4078,7 @@
       </w:pPr>
       <w:r>
         <w:rPr>
-          <w:rFonts w:eastAsia="Calibri" w:cs="Calibri" w:ascii="Calibri" w:hAnsi="Calibri"/>
+          <w:rFonts w:eastAsia="Calibri" w:cs="Calibri"/>
           <w:i/>
           <w:spacing w:val="-1"/>
           <w:lang w:val="cs-CZ"/>
@@ -4213,21 +4100,12 @@
       </w:pPr>
       <w:r>
         <w:rPr>
-          <w:rFonts w:eastAsia="Calibri" w:cs="Calibri" w:ascii="Calibri" w:hAnsi="Calibri"/>
-          <w:b/>
-          <w:spacing w:val="1"/>
-          <w:lang w:val="cs-CZ"/>
-        </w:rPr>
-        <w:t xml:space="preserve">32 </w:t>
-      </w:r>
-      <w:r>
-        <w:rPr>
-          <w:rFonts w:eastAsia="Calibri" w:cs="Calibri" w:ascii="Calibri" w:hAnsi="Calibri"/>
-          <w:b/>
-          <w:spacing w:val="1"/>
-          <w:lang w:val="cs-CZ"/>
-        </w:rPr>
-        <w:t>Návrh uživatelských rozhraní (NUR)</w:t>
+          <w:rFonts w:eastAsia="Calibri" w:cs="Calibri"/>
+          <w:b/>
+          <w:spacing w:val="1"/>
+          <w:lang w:val="cs-CZ"/>
+        </w:rPr>
+        <w:t>32 Návrh uživatelských rozhraní (NUR)</w:t>
       </w:r>
     </w:p>
     <w:p>
@@ -4245,7 +4123,7 @@
       </w:pPr>
       <w:r>
         <w:rPr>
-          <w:rFonts w:eastAsia="Calibri" w:cs="Calibri" w:ascii="Calibri" w:hAnsi="Calibri"/>
+          <w:rFonts w:eastAsia="Calibri" w:cs="Calibri"/>
           <w:i/>
           <w:spacing w:val="-1"/>
           <w:lang w:val="cs-CZ"/>
@@ -4268,7 +4146,7 @@
       </w:pPr>
       <w:r>
         <w:rPr>
-          <w:rFonts w:eastAsia="Calibri" w:cs="Calibri" w:ascii="Calibri" w:hAnsi="Calibri"/>
+          <w:rFonts w:eastAsia="Calibri" w:cs="Calibri"/>
           <w:b/>
           <w:spacing w:val="1"/>
           <w:lang w:val="cs-CZ"/>
@@ -4290,21 +4168,12 @@
       </w:pPr>
       <w:r>
         <w:rPr>
-          <w:rFonts w:eastAsia="Calibri" w:cs="Calibri" w:ascii="Calibri" w:hAnsi="Calibri"/>
-          <w:b/>
-          <w:spacing w:val="1"/>
-          <w:lang w:val="cs-CZ"/>
-        </w:rPr>
-        <w:t xml:space="preserve">33 </w:t>
-      </w:r>
-      <w:r>
-        <w:rPr>
-          <w:rFonts w:eastAsia="Calibri" w:cs="Calibri" w:ascii="Calibri" w:hAnsi="Calibri"/>
-          <w:b/>
-          <w:spacing w:val="1"/>
-          <w:lang w:val="cs-CZ"/>
-        </w:rPr>
-        <w:t>Počítačová grafika a virtuální realita (PGVR)</w:t>
+          <w:rFonts w:eastAsia="Calibri" w:cs="Calibri"/>
+          <w:b/>
+          <w:spacing w:val="1"/>
+          <w:lang w:val="cs-CZ"/>
+        </w:rPr>
+        <w:t>33 Počítačová grafika a virtuální realita (PGVR)</w:t>
       </w:r>
     </w:p>
     <w:p>
@@ -4322,7 +4191,7 @@
       </w:pPr>
       <w:r>
         <w:rPr>
-          <w:rFonts w:eastAsia="Calibri" w:cs="Calibri" w:ascii="Calibri" w:hAnsi="Calibri"/>
+          <w:rFonts w:eastAsia="Calibri" w:cs="Calibri"/>
           <w:i/>
           <w:spacing w:val="-1"/>
           <w:lang w:val="cs-CZ"/>
@@ -4345,7 +4214,7 @@
       </w:pPr>
       <w:r>
         <w:rPr>
-          <w:rFonts w:eastAsia="Calibri" w:cs="Calibri" w:ascii="Calibri" w:hAnsi="Calibri"/>
+          <w:rFonts w:eastAsia="Calibri" w:cs="Calibri"/>
           <w:b/>
           <w:spacing w:val="1"/>
           <w:lang w:val="cs-CZ"/>
@@ -4367,7 +4236,7 @@
       </w:pPr>
       <w:r>
         <w:rPr>
-          <w:rFonts w:eastAsia="Calibri" w:cs="Calibri" w:ascii="Calibri" w:hAnsi="Calibri"/>
+          <w:rFonts w:eastAsia="Calibri" w:cs="Calibri"/>
           <w:b/>
           <w:spacing w:val="1"/>
           <w:lang w:val="cs-CZ"/>
@@ -4377,7 +4246,7 @@
       <w:bookmarkStart w:id="1" w:name="_Hlk54618710"/>
       <w:r>
         <w:rPr>
-          <w:rFonts w:eastAsia="Calibri" w:cs="Calibri" w:ascii="Calibri" w:hAnsi="Calibri"/>
+          <w:rFonts w:eastAsia="Calibri" w:cs="Calibri"/>
           <w:b/>
           <w:spacing w:val="1"/>
           <w:lang w:val="cs-CZ"/>
@@ -4401,7 +4270,7 @@
       </w:pPr>
       <w:r>
         <w:rPr>
-          <w:rFonts w:eastAsia="Calibri" w:cs="Calibri" w:ascii="Calibri" w:hAnsi="Calibri"/>
+          <w:rFonts w:eastAsia="Calibri" w:cs="Calibri"/>
           <w:i/>
           <w:spacing w:val="-1"/>
           <w:lang w:val="cs-CZ"/>
@@ -4424,7 +4293,7 @@
       </w:pPr>
       <w:r>
         <w:rPr>
-          <w:rFonts w:eastAsia="Calibri" w:cs="Calibri" w:ascii="Calibri" w:hAnsi="Calibri"/>
+          <w:rFonts w:eastAsia="Calibri" w:cs="Calibri"/>
           <w:b/>
           <w:spacing w:val="1"/>
           <w:lang w:val="cs-CZ"/>
@@ -4446,21 +4315,12 @@
       </w:pPr>
       <w:r>
         <w:rPr>
-          <w:rFonts w:eastAsia="Calibri" w:cs="Calibri" w:ascii="Calibri" w:hAnsi="Calibri"/>
-          <w:b/>
-          <w:spacing w:val="1"/>
-          <w:lang w:val="cs-CZ"/>
-        </w:rPr>
-        <w:t xml:space="preserve">35 </w:t>
-      </w:r>
-      <w:r>
-        <w:rPr>
-          <w:rFonts w:eastAsia="Calibri" w:cs="Calibri" w:ascii="Calibri" w:hAnsi="Calibri"/>
-          <w:b/>
-          <w:spacing w:val="1"/>
-          <w:lang w:val="cs-CZ"/>
-        </w:rPr>
-        <w:t>Webové technologie (WT)</w:t>
+          <w:rFonts w:eastAsia="Calibri" w:cs="Calibri"/>
+          <w:b/>
+          <w:spacing w:val="1"/>
+          <w:lang w:val="cs-CZ"/>
+        </w:rPr>
+        <w:t>35 Webové technologie (WT)</w:t>
       </w:r>
     </w:p>
     <w:p>
@@ -4478,12 +4338,22 @@
       </w:pPr>
       <w:r>
         <w:rPr>
-          <w:rFonts w:eastAsia="Calibri" w:cs="Calibri" w:ascii="Calibri" w:hAnsi="Calibri"/>
-          <w:i/>
-          <w:spacing w:val="-1"/>
-          <w:lang w:val="cs-CZ"/>
-        </w:rPr>
-        <w:t>Knihovna jQuery – možnosti použití při tvorbě www stránek. AJAX - vlastnosti, příklady použití. Architektura MVC, vysvětlení, výhody. Framework Bootstap (vlastnosti, použití, výhody). Využití frameworků Symfony při tvorbě webových aplikací, vlastnosti, výhody. Twig - vlastnosti, použití. Mapování objektového modelu na relační databáze (objektově-relační mapování – ORM, doctrine), jeho výhody.</w:t>
+          <w:rFonts w:eastAsia="Calibri" w:cs="Calibri"/>
+          <w:i/>
+          <w:color w:val="FB9E00"/>
+          <w:spacing w:val="-1"/>
+          <w:lang w:val="cs-CZ"/>
+        </w:rPr>
+        <w:t>Knihovna jQuery – možnosti použití při tvorbě www stránek. AJAX - vlastnosti, příklady použití. Architektura MVC, vysvětlení, výhody.</w:t>
+      </w:r>
+      <w:r>
+        <w:rPr>
+          <w:rFonts w:eastAsia="Calibri" w:cs="Calibri"/>
+          <w:i/>
+          <w:spacing w:val="-1"/>
+          <w:lang w:val="cs-CZ"/>
+        </w:rPr>
+        <w:t xml:space="preserve"> Framework Bootstap (vlastnosti, použití, výhody). Využití frameworků Symfony při tvorbě webových aplikací, vlastnosti, výhody. Twig - vlastnosti, použití. Mapování objektového modelu na relační databáze (objektově-relační mapování – ORM, doctrine), jeho výhody.</w:t>
       </w:r>
     </w:p>
     <w:p>
@@ -4501,7 +4371,7 @@
       </w:pPr>
       <w:r>
         <w:rPr>
-          <w:rFonts w:eastAsia="Calibri" w:cs="Calibri" w:ascii="Calibri" w:hAnsi="Calibri"/>
+          <w:rFonts w:eastAsia="Calibri" w:cs="Calibri"/>
           <w:i/>
           <w:spacing w:val="-1"/>
           <w:lang w:val="cs-CZ"/>
@@ -4921,6 +4791,7 @@
     <w:rsid w:val="00a91ae1"/>
     <w:pPr>
       <w:widowControl w:val="false"/>
+      <w:suppressAutoHyphens w:val="true"/>
       <w:bidi w:val="0"/>
       <w:spacing w:lineRule="auto" w:line="276" w:before="0" w:after="200"/>
       <w:jc w:val="start"/>
@@ -5068,18 +4939,45 @@
       <w:rFonts w:cs="Noto Sans Devanagari"/>
     </w:rPr>
   </w:style>
+  <w:style w:type="paragraph" w:styleId="Nadpisuser">
+    <w:name w:val="Nadpis (user)"/>
+    <w:basedOn w:val="Normal"/>
+    <w:next w:val="BodyText"/>
+    <w:qFormat/>
+    <w:pPr>
+      <w:keepNext w:val="true"/>
+      <w:spacing w:before="240" w:after="120"/>
+    </w:pPr>
+    <w:rPr>
+      <w:rFonts w:ascii="Liberation Sans" w:hAnsi="Liberation Sans" w:eastAsia="Noto Sans CJK SC" w:cs="Noto Sans Devanagari"/>
+      <w:sz w:val="28"/>
+      <w:szCs w:val="28"/>
+    </w:rPr>
+  </w:style>
+  <w:style w:type="paragraph" w:styleId="Rejstkuser">
+    <w:name w:val="Rejstřík (user)"/>
+    <w:basedOn w:val="Normal"/>
+    <w:qFormat/>
+    <w:pPr>
+      <w:suppressLineNumbers/>
+    </w:pPr>
+    <w:rPr>
+      <w:rFonts w:cs="Noto Sans Devanagari"/>
+    </w:rPr>
+  </w:style>
   <w:style w:type="paragraph" w:styleId="Default" w:customStyle="1">
     <w:name w:val="Default"/>
     <w:qFormat/>
     <w:rsid w:val="00ec3d57"/>
     <w:pPr>
       <w:widowControl/>
+      <w:suppressAutoHyphens w:val="true"/>
       <w:bidi w:val="0"/>
       <w:spacing w:lineRule="auto" w:line="240" w:before="0" w:after="0"/>
       <w:jc w:val="start"/>
     </w:pPr>
     <w:rPr>
-      <w:rFonts w:ascii="Times New Roman" w:hAnsi="Times New Roman" w:cs="Times New Roman" w:eastAsia="Calibri"/>
+      <w:rFonts w:ascii="Times New Roman" w:hAnsi="Times New Roman" w:eastAsia="Calibri" w:cs="Times New Roman"/>
       <w:color w:val="000000"/>
       <w:kern w:val="0"/>
       <w:sz w:val="24"/>
@@ -5156,8 +5054,8 @@
       <w:szCs w:val="16"/>
     </w:rPr>
   </w:style>
-  <w:style w:type="numbering" w:styleId="Bezseznamu" w:default="1">
-    <w:name w:val="Bez seznamu"/>
+  <w:style w:type="numbering" w:styleId="Bezseznamuuser" w:default="1">
+    <w:name w:val="Bez seznamu (user)"/>
     <w:uiPriority w:val="99"/>
     <w:semiHidden/>
     <w:unhideWhenUsed/>

</xml_diff>

<commit_message>
Struktura projektu + nove otazky z DSA (razeni)
</commit_message>
<xml_diff>
--- a/SZZ_okruhy_AI_2019-2020_2023.docx
+++ b/SZZ_okruhy_AI_2019-2020_2023.docx
@@ -3152,10 +3152,30 @@
         <w:rPr>
           <w:rFonts w:eastAsia="Calibri" w:cs="Calibri"/>
           <w:i/>
-          <w:spacing w:val="-1"/>
-          <w:lang w:val="cs-CZ"/>
-        </w:rPr>
-        <w:t>Algoritmy řazení výběrem (Select-sort), vkládáním (Insert-sort), zaměňováním (Buble-sort), řazení haldou (Heap-sort), přihrádkové řazení (Radix-sort, Caset-sort), řazení slučováním (Merge-sort), řazení dělením (Quick-sort). Minimální, průměrná a maximální asymptotická operační složitost algoritmů řazení. Adresní metody vyhledávání (přímý přístup, otevřené a zřetězené rozptylování). Asociativní metody vyhledávání (sekvenční, binárním půlením, binární vyhledávací stromy). Operační a paměťová složitost algoritmů vyhledávání. Datové typy zásobník, fronta, prioritní fronta, pole, tabulka, seznam, množina - jejich specifikace a implementace.</w:t>
+          <w:color w:val="FB9E00"/>
+          <w:spacing w:val="-1"/>
+          <w:lang w:val="cs-CZ"/>
+        </w:rPr>
+        <w:t>Algoritmy řazení výběrem (Select-sort), vkládáním (Insert-sort), zaměňováním (Buble-sort), řazení haldou (Heap-sort)</w:t>
+      </w:r>
+      <w:r>
+        <w:rPr>
+          <w:rFonts w:eastAsia="Calibri" w:cs="Calibri"/>
+          <w:i/>
+          <w:spacing w:val="-1"/>
+          <w:lang w:val="cs-CZ"/>
+        </w:rPr>
+        <w:t xml:space="preserve">, přihrádkové řazení (Radix-sort, Caset-sort), řazení slučováním (Merge-sort), řazení dělením (Quick-sort). Minimální, průměrná a maximální asymptotická operační složitost algoritmů řazení. Adresní metody vyhledávání (přímý přístup, otevřené a zřetězené rozptylování). Asociativní metody vyhledávání (sekvenční, binárním půlením, binární vyhledávací stromy). Operační a paměťová složitost algoritmů vyhledávání. </w:t>
+      </w:r>
+      <w:r>
+        <w:rPr>
+          <w:rFonts w:eastAsia="Calibri" w:cs="Calibri"/>
+          <w:i/>
+          <w:color w:val="FB9E00"/>
+          <w:spacing w:val="-1"/>
+          <w:lang w:val="cs-CZ"/>
+        </w:rPr>
+        <w:t>Datové typy zásobník, fronta, prioritní fronta, pole, tabulka, seznam, množina - jejich specifikace a implementace.</w:t>
       </w:r>
     </w:p>
     <w:p>
@@ -3369,7 +3389,26 @@
           <w:spacing w:val="-1"/>
           <w:lang w:val="cs-CZ"/>
         </w:rPr>
-        <w:t>Chomského hierarchie, teorie formálních jazyků a gramatik, návaznost na teorii automatů (konečné automaty, zásobníkové automaty, Turingův stroj). Bezkontextové jazyky a jejich modely (zásobníkové automaty, bezkontextové gramatiky). Struktura překladače a charakteristika fází překladu (lexikální analýza, deterministická syntaktická analýza a generování kódu).</w:t>
+        <w:t>Chomského hierarchie, teorie formálních jazyků a gramatik, návaznost na teorii automatů (konečné automaty, zásobníkové automaty, Turingův stroj). Bezkontextové jazyky a jejich modely (zásobníkové automaty, bezkontextové gramatiky). Struktura překladače a charakteristika fází překladu (</w:t>
+      </w:r>
+      <w:r>
+        <w:rPr>
+          <w:rFonts w:eastAsia="Calibri" w:cs="Calibri"/>
+          <w:i/>
+          <w:color w:val="FB9E00"/>
+          <w:spacing w:val="-1"/>
+          <w:lang w:val="cs-CZ"/>
+        </w:rPr>
+        <w:t>lexikální analýza,</w:t>
+      </w:r>
+      <w:r>
+        <w:rPr>
+          <w:rFonts w:eastAsia="Calibri" w:cs="Calibri"/>
+          <w:i/>
+          <w:spacing w:val="-1"/>
+          <w:lang w:val="cs-CZ"/>
+        </w:rPr>
+        <w:t xml:space="preserve"> deterministická syntaktická analýza a generování kódu).</w:t>
       </w:r>
     </w:p>
     <w:p>
@@ -3434,10 +3473,58 @@
         <w:rPr>
           <w:rFonts w:eastAsia="Calibri" w:cs="Calibri"/>
           <w:i/>
-          <w:spacing w:val="-1"/>
-          <w:lang w:val="cs-CZ"/>
-        </w:rPr>
-        <w:t>Algoritmus, program, proces. Překladač, interpret, preprocesor. Reprezentace dat v paměti počítače, základní datové typy, proměnné, konstanty, přetypování. Operátory a jejich priorita, výrazy. Základní příkazy. Řízení běhu programu - řídicí struktury. Datový typ ukazatel. Funkce a procedury, návratový typ, formální a skutečné parametry, parametry volané hodnotou a referencí. Rozklad problému na podproblémy, procedurální přístup, rekurze. Jednorozměrná a vícerozměrná pole. Řetězce. Standardní vstup a výstup, funkce vstupu/výstupu, práce se soubory. Binární a textové soubory. Strukturované datové typy. Dynamické datové struktury. Modulární programování, hlavičkové soubory.</w:t>
+          <w:color w:val="FB9E00"/>
+          <w:spacing w:val="-1"/>
+          <w:lang w:val="cs-CZ"/>
+        </w:rPr>
+        <w:t>Algoritmus</w:t>
+      </w:r>
+      <w:r>
+        <w:rPr>
+          <w:rFonts w:eastAsia="Calibri" w:cs="Calibri"/>
+          <w:i/>
+          <w:spacing w:val="-1"/>
+          <w:lang w:val="cs-CZ"/>
+        </w:rPr>
+        <w:t xml:space="preserve">, program, proces. </w:t>
+      </w:r>
+      <w:r>
+        <w:rPr>
+          <w:rFonts w:eastAsia="Calibri" w:cs="Calibri"/>
+          <w:i/>
+          <w:color w:val="FB9E00"/>
+          <w:spacing w:val="-1"/>
+          <w:lang w:val="cs-CZ"/>
+        </w:rPr>
+        <w:t>Překladač, interpret,</w:t>
+      </w:r>
+      <w:r>
+        <w:rPr>
+          <w:rFonts w:eastAsia="Calibri" w:cs="Calibri"/>
+          <w:i/>
+          <w:spacing w:val="-1"/>
+          <w:lang w:val="cs-CZ"/>
+        </w:rPr>
+        <w:t xml:space="preserve"> preprocesor. Reprezentace dat v paměti počítače, </w:t>
+      </w:r>
+      <w:r>
+        <w:rPr>
+          <w:rFonts w:eastAsia="Calibri" w:cs="Calibri"/>
+          <w:i/>
+          <w:color w:val="FB9E00"/>
+          <w:spacing w:val="-1"/>
+          <w:lang w:val="cs-CZ"/>
+        </w:rPr>
+        <w:t>základní datové typy, proměnné, konstanty, přetypování.</w:t>
+      </w:r>
+      <w:r>
+        <w:rPr>
+          <w:rFonts w:eastAsia="Calibri" w:cs="Calibri"/>
+          <w:i/>
+          <w:spacing w:val="-1"/>
+          <w:lang w:val="cs-CZ"/>
+        </w:rPr>
+        <w:t xml:space="preserve"> Operátory a jejich priorita, výrazy. Základní příkazy. Řízení běhu programu - řídicí struktury. Datový typ ukazatel. Funkce a procedury, návratový typ, formální a skutečné parametry, parametry volané hodnotou a referencí. Rozklad problému na podproblémy, procedurální přístup, rekurze. Jednorozměrná a vícerozměrná pole. Řetězce. Standardní vstup a výstup, funkce vstupu/výstupu, práce se soubory. Binární a textové soubory. Strukturované datové typy. Dynamické datové struktury. Modulární programování, hlavičkové soubory.</w:t>
       </w:r>
     </w:p>
     <w:p>
@@ -5054,8 +5141,8 @@
       <w:szCs w:val="16"/>
     </w:rPr>
   </w:style>
-  <w:style w:type="numbering" w:styleId="Bezseznamuuser" w:default="1">
-    <w:name w:val="Bez seznamu (user)"/>
+  <w:style w:type="numbering" w:styleId="Bezseznamu" w:default="1">
+    <w:name w:val="Bez seznamu"/>
     <w:uiPriority w:val="99"/>
     <w:semiHidden/>
     <w:unhideWhenUsed/>

</xml_diff>

<commit_message>
UPDATE: DB + DS
</commit_message>
<xml_diff>
--- a/SZZ_okruhy_AI_2019-2020_2023.docx
+++ b/SZZ_okruhy_AI_2019-2020_2023.docx
@@ -213,6 +213,7 @@
     <w:p>
       <w:pPr>
         <w:pStyle w:val="Normal"/>
+        <w:bidi w:val="0"/>
         <w:spacing w:before="0" w:after="0"/>
         <w:ind w:start="116" w:end="49"/>
         <w:jc w:val="both"/>
@@ -227,10 +228,97 @@
         <w:rPr>
           <w:rFonts w:eastAsia="Calibri" w:cs="Calibri"/>
           <w:i/>
-          <w:spacing w:val="-1"/>
-          <w:lang w:val="cs-CZ"/>
-        </w:rPr>
-        <w:t>Množiny (intuitivní definice, podmnožiny, operace s množinami a jejich vlastnosti, mohutnost množin). Relace (definice, inverzní relace, relace na množině a jejich vlastnosti, ekvivalence, uspořádání). Zobrazení (definice, vlastnosti). Výroková logika (výrok, logické spojky, formule a pravdivostní ohodnocení, tautologie a kontradikce, de Morganovy zákony, negace formulí, sémantický důsledek, CNF/DNF). Predikátová logika (rozdíly oproti výrokové logice, syntaxe a sémantika, interpretace, sémantický důsledek). Neorientované grafy (definice a základní pojmy, isomorfismus, stupeň uzlu, sledy v grafu, souvislost grafu, stromy a kostry). Orientované grafy (definice a základní pojmy, sledy v orientovaném grafu, silná souvislost, stupně uzlu). Vlastnosti grafů (pokrytí, Eulerův graf, vzdálenost na grafu). Kořenové stromy (definice, hloubka, pravidelné a binární stromy). Reprezentace grafů v paměti (matice incidence, matice sousednosti, spojová reprezentace). Základní grafové algoritmy (prohledávání do šířky a do hloubky, určení minimální kostry, Huffmanův kód, Dijkstrův algoritmus).</w:t>
+          <w:color w:val="FB9E00"/>
+          <w:spacing w:val="-1"/>
+          <w:lang w:val="cs-CZ"/>
+        </w:rPr>
+        <w:t>Množiny (intuitivní definice, podmnožiny, operace s množinami a jejich vlastnosti, mohutnost množin).</w:t>
+      </w:r>
+      <w:r>
+        <w:rPr>
+          <w:rFonts w:eastAsia="Calibri" w:cs="Calibri"/>
+          <w:i/>
+          <w:spacing w:val="-1"/>
+          <w:lang w:val="cs-CZ"/>
+        </w:rPr>
+        <w:t xml:space="preserve"> </w:t>
+      </w:r>
+      <w:r>
+        <w:rPr>
+          <w:rFonts w:eastAsia="Calibri" w:cs="Calibri"/>
+          <w:i/>
+          <w:color w:val="FB9E00"/>
+          <w:spacing w:val="-1"/>
+          <w:lang w:val="cs-CZ"/>
+        </w:rPr>
+        <w:t>Relace (definice, inverzní relace, relace na množině a jejich vlastnosti, ekvivalence, uspořádání). Zobrazení (definice, vlastnosti).</w:t>
+      </w:r>
+      <w:r>
+        <w:rPr>
+          <w:rFonts w:eastAsia="Calibri" w:cs="Calibri"/>
+          <w:i/>
+          <w:color w:val="FB9E00"/>
+          <w:spacing w:val="-1"/>
+          <w:lang w:val="cs-CZ"/>
+        </w:rPr>
+        <w:t xml:space="preserve"> Výroková logika (výrok, logické spojky, formule a pravdivostní ohodnocení, tautologie a kontradikce, de Morganovy zákony, negace formulí, sémantický důsledek, CNF/DNF).</w:t>
+      </w:r>
+      <w:r>
+        <w:rPr>
+          <w:rFonts w:eastAsia="Calibri" w:cs="Calibri"/>
+          <w:i/>
+          <w:spacing w:val="-1"/>
+          <w:lang w:val="cs-CZ"/>
+        </w:rPr>
+        <w:t xml:space="preserve"> </w:t>
+      </w:r>
+      <w:r>
+        <w:rPr>
+          <w:rFonts w:eastAsia="Calibri" w:cs="Calibri"/>
+          <w:i/>
+          <w:color w:val="FB9E00"/>
+          <w:spacing w:val="-1"/>
+          <w:lang w:val="cs-CZ"/>
+        </w:rPr>
+        <w:t>Predikátová logika (rozdíly oproti výrokové logice, syntaxe a sémantika, interpretace, sémantický důsledek).</w:t>
+      </w:r>
+      <w:r>
+        <w:rPr>
+          <w:rFonts w:eastAsia="Calibri" w:cs="Calibri"/>
+          <w:i/>
+          <w:spacing w:val="-1"/>
+          <w:lang w:val="cs-CZ"/>
+        </w:rPr>
+        <w:t xml:space="preserve"> Neorientované grafy (definice a základní pojmy, isomorfismus, stupeň uzlu, sledy v grafu, souvislost grafu, stromy a kostry). Orientované grafy (definice a základní pojmy, sledy v orientovaném grafu, silná souvislost, stupně uzlu). Vlastnosti grafů (pokrytí, Eulerův graf, vzdálenost na grafu). Kořenové stromy (definice, hloubka, pravidelné a binární stromy). </w:t>
+      </w:r>
+      <w:r>
+        <w:rPr>
+          <w:rFonts w:eastAsia="Calibri" w:cs="Calibri"/>
+          <w:i/>
+          <w:color w:val="FB9E00"/>
+          <w:spacing w:val="-1"/>
+          <w:lang w:val="cs-CZ"/>
+        </w:rPr>
+        <w:t>Reprezentace grafů v paměti (matice incidence, matice sousednosti, spojová reprezentace).</w:t>
+      </w:r>
+      <w:r>
+        <w:rPr>
+          <w:rFonts w:eastAsia="Calibri" w:cs="Calibri"/>
+          <w:i/>
+          <w:spacing w:val="-1"/>
+          <w:lang w:val="cs-CZ"/>
+        </w:rPr>
+        <w:t xml:space="preserve"> Základní grafové algoritmy (prohledávání do šířky a do hloubky, určení minimální kostry, Huffmanův kód, </w:t>
+      </w:r>
+      <w:r>
+        <w:rPr>
+          <w:rFonts w:eastAsia="Calibri" w:cs="Calibri"/>
+          <w:i/>
+          <w:color w:val="FB9E00"/>
+          <w:spacing w:val="-1"/>
+          <w:lang w:val="cs-CZ"/>
+        </w:rPr>
+        <w:t>Dijkstrův algoritmus).</w:t>
       </w:r>
     </w:p>
     <w:p>
@@ -308,7 +396,17 @@
           <w:spacing w:val="-1"/>
           <w:lang w:val="cs-CZ"/>
         </w:rPr>
-        <w:t xml:space="preserve"> Přidělování procesoru (jednotlivé stavy přidělování procesoru, funkce modulu přidělování procesoru, způsoby přidělování v multiprogramovém systému). Přidělování paměti (adresování paměti, funkce modulu přidělování paměti, stránkování na žádost). Systém souborů, úkoly, úrovně, charakteristika souborových systémů FAT32, NTFS, EXT2 (výhody, práva, použití, způsob ukládání souborů).</w:t>
+        <w:t xml:space="preserve"> </w:t>
+      </w:r>
+      <w:r>
+        <w:rPr>
+          <w:rFonts w:eastAsia="Calibri" w:cs="Calibri"/>
+          <w:i/>
+          <w:color w:val="FB9E00"/>
+          <w:spacing w:val="-1"/>
+          <w:lang w:val="cs-CZ"/>
+        </w:rPr>
+        <w:t>Přidělování procesoru (jednotlivé stavy přidělování procesoru, funkce modulu přidělování procesoru, způsoby přidělování v multiprogramovém systému). Přidělování paměti (adresování paměti, funkce modulu přidělování paměti, stránkování na žádost). Systém souborů, úkoly, úrovně, charakteristika souborových systémů FAT32, NTFS, EXT2 (výhody, práva, použití, způsob ukládání souborů).</w:t>
       </w:r>
     </w:p>
     <w:p>
@@ -550,54 +648,45 @@
           <w:spacing w:val="-1"/>
           <w:lang w:val="cs-CZ"/>
         </w:rPr>
-        <w:t>Algoritmus</w:t>
-      </w:r>
-      <w:r>
-        <w:rPr>
-          <w:rFonts w:eastAsia="Calibri" w:cs="Calibri"/>
-          <w:i/>
-          <w:spacing w:val="-1"/>
-          <w:lang w:val="cs-CZ"/>
-        </w:rPr>
-        <w:t xml:space="preserve">, program, proces. </w:t>
-      </w:r>
-      <w:r>
-        <w:rPr>
-          <w:rFonts w:eastAsia="Calibri" w:cs="Calibri"/>
-          <w:i/>
-          <w:color w:val="FB9E00"/>
-          <w:spacing w:val="-1"/>
-          <w:lang w:val="cs-CZ"/>
-        </w:rPr>
-        <w:t>Překladač, interpret,</w:t>
-      </w:r>
-      <w:r>
-        <w:rPr>
-          <w:rFonts w:eastAsia="Calibri" w:cs="Calibri"/>
-          <w:i/>
-          <w:spacing w:val="-1"/>
-          <w:lang w:val="cs-CZ"/>
-        </w:rPr>
-        <w:t xml:space="preserve"> preprocesor. Reprezentace dat v paměti počítače, </w:t>
-      </w:r>
-      <w:r>
-        <w:rPr>
-          <w:rFonts w:eastAsia="Calibri" w:cs="Calibri"/>
-          <w:i/>
-          <w:color w:val="FB9E00"/>
-          <w:spacing w:val="-1"/>
-          <w:lang w:val="cs-CZ"/>
-        </w:rPr>
-        <w:t>základní datové typy, proměnné, konstanty, přetypování.</w:t>
-      </w:r>
-      <w:r>
-        <w:rPr>
-          <w:rFonts w:eastAsia="Calibri" w:cs="Calibri"/>
-          <w:i/>
-          <w:spacing w:val="-1"/>
-          <w:lang w:val="cs-CZ"/>
-        </w:rPr>
-        <w:t xml:space="preserve"> Operátory a jejich priorita, výrazy. Základní příkazy. Řízení běhu programu - řídicí struktury. Datový typ ukazatel. Funkce a procedury, návratový typ, formální a skutečné parametry, parametry volané hodnotou a referencí. Rozklad problému na podproblémy, procedurální přístup, rekurze. Jednorozměrná a vícerozměrná pole. Řetězce. Standardní vstup a výstup, funkce vstupu/výstupu, práce se soubory. Binární a textové soubory. Strukturované datové typy. Dynamické datové struktury. Modulární programování, hlavičkové soubory.</w:t>
+        <w:t>Algoritmus, program, proces. Překladač, interpret, preprocesor. Reprezentace dat v paměti počítače, základní datové typy, proměnné, konstanty, přetypování.</w:t>
+      </w:r>
+      <w:r>
+        <w:rPr>
+          <w:rFonts w:eastAsia="Calibri" w:cs="Calibri"/>
+          <w:i/>
+          <w:spacing w:val="-1"/>
+          <w:lang w:val="cs-CZ"/>
+        </w:rPr>
+        <w:t xml:space="preserve"> </w:t>
+      </w:r>
+      <w:r>
+        <w:rPr>
+          <w:rFonts w:eastAsia="Calibri" w:cs="Calibri"/>
+          <w:i/>
+          <w:color w:val="FB9E00"/>
+          <w:spacing w:val="-1"/>
+          <w:lang w:val="cs-CZ"/>
+        </w:rPr>
+        <w:t>Operátory a jejich priorita, výrazy. Základní příkazy. Řízení běhu programu - řídicí struktury. Datový typ ukazatel. Funkce a procedury, návratový typ, formální a skutečné parametry, parametry volané hodnotou a referencí. Rozklad problému na podproblémy, procedurální přístup, rekurze. Jednorozměrná a vícerozměrná pole. Řetězce. Standardní vstup a výstup, funkce vstupu/výstupu, práce se soubory. Binární a textové soubory.</w:t>
+      </w:r>
+      <w:r>
+        <w:rPr>
+          <w:rFonts w:eastAsia="Calibri" w:cs="Calibri"/>
+          <w:i/>
+          <w:spacing w:val="-1"/>
+          <w:lang w:val="cs-CZ"/>
+        </w:rPr>
+        <w:t xml:space="preserve"> </w:t>
+      </w:r>
+      <w:r>
+        <w:rPr>
+          <w:rFonts w:eastAsia="Calibri" w:cs="Calibri"/>
+          <w:i/>
+          <w:color w:val="FB9E00"/>
+          <w:spacing w:val="-1"/>
+          <w:lang w:val="cs-CZ"/>
+        </w:rPr>
+        <w:t>Strukturované datové typy. Dynamické datové struktury. Modulární programování, hlavičkové soubory.</w:t>
       </w:r>
     </w:p>
     <w:p>
@@ -749,10 +838,77 @@
         <w:rPr>
           <w:rFonts w:eastAsia="Calibri" w:cs="Calibri"/>
           <w:i/>
-          <w:spacing w:val="-1"/>
-          <w:lang w:val="cs-CZ"/>
-        </w:rPr>
-        <w:t xml:space="preserve">Principy objektového programování, třídy a jejich použití. Struktura objektu, atributy a metody. Dynamický charakter objektu, konstruktor, destruktor, instance třídy. Kopírovací a přesunující operace. Přetěžování metod, přetěžování operátorů. Dědičnost, hierarchie tříd, kompozice. Abstraktní třídy, polymorfismus, virtuální metody. Výjimky a jejich zpracování. </w:t>
+          <w:color w:val="FB9E00"/>
+          <w:spacing w:val="-1"/>
+          <w:lang w:val="cs-CZ"/>
+        </w:rPr>
+        <w:t>Principy objektového programování, třídy a jejich použití. Struktura objektu, atributy a metody.</w:t>
+      </w:r>
+      <w:r>
+        <w:rPr>
+          <w:rFonts w:eastAsia="Calibri" w:cs="Calibri"/>
+          <w:i/>
+          <w:spacing w:val="-1"/>
+          <w:lang w:val="cs-CZ"/>
+        </w:rPr>
+        <w:t xml:space="preserve"> Dynamický charakter objektu, </w:t>
+      </w:r>
+      <w:r>
+        <w:rPr>
+          <w:rFonts w:eastAsia="Calibri" w:cs="Calibri"/>
+          <w:i/>
+          <w:color w:val="FB9E00"/>
+          <w:spacing w:val="-1"/>
+          <w:lang w:val="cs-CZ"/>
+        </w:rPr>
+        <w:t>konstruktor, destruktor, instance třídy.</w:t>
+      </w:r>
+      <w:r>
+        <w:rPr>
+          <w:rFonts w:eastAsia="Calibri" w:cs="Calibri"/>
+          <w:i/>
+          <w:spacing w:val="-1"/>
+          <w:lang w:val="cs-CZ"/>
+        </w:rPr>
+        <w:t xml:space="preserve"> Kopírovací a přesunující operace. </w:t>
+      </w:r>
+      <w:r>
+        <w:rPr>
+          <w:rFonts w:eastAsia="Calibri" w:cs="Calibri"/>
+          <w:i/>
+          <w:color w:val="FB9E00"/>
+          <w:spacing w:val="-1"/>
+          <w:lang w:val="cs-CZ"/>
+        </w:rPr>
+        <w:t>Přetěžování metod, přetěžování operátorů. Dědičnost, hierarchie tříd,</w:t>
+      </w:r>
+      <w:r>
+        <w:rPr>
+          <w:rFonts w:eastAsia="Calibri" w:cs="Calibri"/>
+          <w:i/>
+          <w:spacing w:val="-1"/>
+          <w:lang w:val="cs-CZ"/>
+        </w:rPr>
+        <w:t xml:space="preserve"> kompozice. </w:t>
+      </w:r>
+      <w:r>
+        <w:rPr>
+          <w:rFonts w:eastAsia="Calibri" w:cs="Calibri"/>
+          <w:i/>
+          <w:color w:val="FB9E00"/>
+          <w:spacing w:val="-1"/>
+          <w:lang w:val="cs-CZ"/>
+        </w:rPr>
+        <w:t>Abstraktní třídy, polymorfismus,</w:t>
+      </w:r>
+      <w:r>
+        <w:rPr>
+          <w:rFonts w:eastAsia="Calibri" w:cs="Calibri"/>
+          <w:i/>
+          <w:spacing w:val="-1"/>
+          <w:lang w:val="cs-CZ"/>
+        </w:rPr>
+        <w:t xml:space="preserve"> virtuální metody. Výjimky a jejich zpracování. </w:t>
       </w:r>
       <w:r>
         <w:rPr>
@@ -868,7 +1024,55 @@
           <w:spacing w:val="-1"/>
           <w:lang w:val="cs-CZ"/>
         </w:rPr>
-        <w:t xml:space="preserve"> Modelování procesů, modelování požadavků, katalog požadavků, funkční a nefunkční požadavky. Model jednání, aktéři, případy užití. Konceptuální analýza, modelování dat. Integritní omezení a jejich popis (OCL). Metodiky tvorby softwarových produktů, klasické, agilní. Modelem řízený vývoj, přímé a reverzní inženýrství, okružní jízda (round-trip). Zajištění kvality, softwarové metriky, analýza a řízení rizik, bezpečnost informačních systémů, testování.</w:t>
+        <w:t xml:space="preserve"> </w:t>
+      </w:r>
+      <w:r>
+        <w:rPr>
+          <w:rFonts w:eastAsia="Calibri" w:cs="Calibri"/>
+          <w:i/>
+          <w:color w:val="FB9E00"/>
+          <w:spacing w:val="-1"/>
+          <w:lang w:val="cs-CZ"/>
+        </w:rPr>
+        <w:t>Modelování procesů, modelování požadavků, katalog požadavků, funkční a nefunkční požadavky. Model jednání, aktéři, případy užití. Konceptuální analýza, modelování dat.</w:t>
+      </w:r>
+      <w:r>
+        <w:rPr>
+          <w:rFonts w:eastAsia="Calibri" w:cs="Calibri"/>
+          <w:i/>
+          <w:spacing w:val="-1"/>
+          <w:lang w:val="cs-CZ"/>
+        </w:rPr>
+        <w:t xml:space="preserve"> </w:t>
+      </w:r>
+      <w:r>
+        <w:rPr>
+          <w:rFonts w:eastAsia="Calibri" w:cs="Calibri"/>
+          <w:i/>
+          <w:color w:val="FB9E00"/>
+          <w:spacing w:val="-1"/>
+          <w:lang w:val="cs-CZ"/>
+        </w:rPr>
+        <w:t>Integritní omezení a jejich popis (OCL). Metodiky tvorby softwarových produktů, klasické, agilní. Modelem řízený vývoj, přímé a reverzní inženýrství, okružní jízda (round-trip).</w:t>
+      </w:r>
+      <w:r>
+        <w:rPr>
+          <w:rFonts w:eastAsia="Calibri" w:cs="Calibri"/>
+          <w:i/>
+          <w:spacing w:val="-1"/>
+          <w:lang w:val="cs-CZ"/>
+        </w:rPr>
+        <w:t xml:space="preserve"> </w:t>
+      </w:r>
+      <w:r>
+        <w:rPr>
+          <w:rFonts w:eastAsia="Calibri" w:cs="Calibri"/>
+          <w:i/>
+          <w:color w:val="FB9E00"/>
+          <w:spacing w:val="-1"/>
+          <w:lang w:val="cs-CZ"/>
+        </w:rPr>
+        <w:t>Zajištění kvality, softwarové metriky, analýza a řízení rizik, bezpečnost informačních systémů, testování.</w:t>
       </w:r>
     </w:p>
     <w:p>
@@ -933,10 +1137,20 @@
         <w:rPr>
           <w:rFonts w:eastAsia="Calibri" w:cs="Calibri"/>
           <w:i/>
-          <w:spacing w:val="-1"/>
-          <w:lang w:val="cs-CZ"/>
-        </w:rPr>
-        <w:t>Rozdíl mezi tradičními, agilními a extrémními způsoby řízení projektů. Charakteristika agilních metod vývoje SW a jejich srovnání s tradičními (plánovacími) a formálními přístupy. Způsoby získávání, formalizace a dokumentace zákaznických požadavků. Extrémní programování (XP). Scrum, scrumban. Procesní zlepšování v oblasti vývoje SW. IT management v organizacích, ITIL.</w:t>
+          <w:color w:val="FB9E00"/>
+          <w:spacing w:val="-1"/>
+          <w:lang w:val="cs-CZ"/>
+        </w:rPr>
+        <w:t>Rozdíl mezi tradičními, agilními a extrémními způsoby řízení projektů. Charakteristika agilních metod vývoje SW a jejich srovnání s tradičními (plánovacími) a formálními přístupy. Způsoby získávání, formalizace a dokumentace zákaznických požadavků. Extrémní programování (XP). Scrum, scrumban. Procesní zlepšování v oblasti vývoje SW.</w:t>
+      </w:r>
+      <w:r>
+        <w:rPr>
+          <w:rFonts w:eastAsia="Calibri" w:cs="Calibri"/>
+          <w:i/>
+          <w:spacing w:val="-1"/>
+          <w:lang w:val="cs-CZ"/>
+        </w:rPr>
+        <w:t xml:space="preserve"> IT management v organizacích, ITIL.</w:t>
       </w:r>
     </w:p>
     <w:p>
@@ -1071,16 +1285,35 @@
           <w:spacing w:val="-1"/>
           <w:lang w:val="cs-CZ"/>
         </w:rPr>
-        <w:t>Databázový systém (definice, účel, database management system). Návrh databáze (konceptuální, logický a fyzický model)</w:t>
-      </w:r>
-      <w:r>
-        <w:rPr>
-          <w:rFonts w:eastAsia="Calibri" w:cs="Calibri"/>
-          <w:i/>
-          <w:spacing w:val="-1"/>
-          <w:lang w:val="cs-CZ"/>
-        </w:rPr>
-        <w:t>. Konceptuální modelování, ER model (princip a účel konceptuální analýzy, základní konstrukty ER modelu, integritní omezení). Relační model dat (definice, princip, integritní omezení). Relační algebra (základní operace, spojení, použití relační algebry pro dotazování). Transformace ER modelu do relačního modelu. Jazyk SQL pro definici dat, jazyk SQL pro manipulaci s daty. Příkaz SELECT jazyka SQL (základní dotazy, použitelné klauzule, dotazy nad více tabulkami a spojení, agregační funkce, vnořené poddotazy, implementace univerzálního a existenčního kvantifikátoru). Další možnosti jazyka SQL (ošetření hodnot NULL, podmíněné větvení, řádkové výrazy). Implementace a použití transakcí v jazyce SQL.</w:t>
+        <w:t>Databázový systém (definice, účel, database management system). Návrh databáze (konceptuální, logický a fyzický model). Konceptuální modelování, ER model (princip a účel konceptuální analýzy, základní konstrukty ER modelu, integritní omezení). Relační model dat (definice, princip, integritní omezení).</w:t>
+      </w:r>
+      <w:r>
+        <w:rPr>
+          <w:rFonts w:eastAsia="Calibri" w:cs="Calibri"/>
+          <w:i/>
+          <w:spacing w:val="-1"/>
+          <w:lang w:val="cs-CZ"/>
+        </w:rPr>
+        <w:t xml:space="preserve"> </w:t>
+      </w:r>
+      <w:r>
+        <w:rPr>
+          <w:rFonts w:eastAsia="Calibri" w:cs="Calibri"/>
+          <w:i/>
+          <w:color w:val="FB9E00"/>
+          <w:spacing w:val="-1"/>
+          <w:lang w:val="cs-CZ"/>
+        </w:rPr>
+        <w:t>Relační algebra (základní operace, spojení, použití relační algebry pro dotazování). Transformace ER modelu do relačního modelu. Jazyk SQL pro definici dat, jazyk SQL pro manipulaci s daty. Příkaz SELECT jazyka SQL (základní dotazy, použitelné klauzule, dotazy nad více tabulkami a spojení, agregační funkce, vnořené poddotazy, implementace univerzálního a existenčního kvantifikátoru).</w:t>
+      </w:r>
+      <w:r>
+        <w:rPr>
+          <w:rFonts w:eastAsia="Calibri" w:cs="Calibri"/>
+          <w:i/>
+          <w:spacing w:val="-1"/>
+          <w:lang w:val="cs-CZ"/>
+        </w:rPr>
+        <w:t xml:space="preserve"> Další možnosti jazyka SQL (ošetření hodnot NULL, podmíněné větvení, řádkové výrazy). Implementace a použití transakcí v jazyce SQL.</w:t>
       </w:r>
     </w:p>
     <w:p>
@@ -1145,10 +1378,30 @@
         <w:rPr>
           <w:rFonts w:eastAsia="Calibri" w:cs="Calibri"/>
           <w:i/>
-          <w:spacing w:val="-1"/>
-          <w:lang w:val="cs-CZ"/>
-        </w:rPr>
-        <w:t>Ethernet - verze, rychlosti. IPv4 adresa, maska, CIDR, IP datagram. IP protokol. Protokoly ARP, ICMP, IGMP. TCP a UDP protokoly. Fragmentace a segmentace. Směrování. Firewally. Protokoly DNS, SMTP, POP3, IMAP, HTTP, FTP – charakteristika, použití, fáze komunikace. Bezdrátové sítě standardu 802.11 b/g/a/n. ISDN a ADSL.</w:t>
+          <w:color w:val="FB9E00"/>
+          <w:spacing w:val="-1"/>
+          <w:lang w:val="cs-CZ"/>
+        </w:rPr>
+        <w:t>Ethernet - verze, rychlosti. IPv4 adresa, maska, CIDR, IP datagram. IP protokol. Protokoly ARP, ICMP, IGMP. TCP a UDP protokoly. Fragmentace a segmentace. Směrování. Firewally. Protokoly DNS, SMTP, POP3, IMAP, HTTP, FTP – charakteristika, použití, fáze komunikace.</w:t>
+      </w:r>
+      <w:r>
+        <w:rPr>
+          <w:rFonts w:eastAsia="Calibri" w:cs="Calibri"/>
+          <w:i/>
+          <w:spacing w:val="-1"/>
+          <w:lang w:val="cs-CZ"/>
+        </w:rPr>
+        <w:t xml:space="preserve"> </w:t>
+      </w:r>
+      <w:r>
+        <w:rPr>
+          <w:rFonts w:eastAsia="Calibri" w:cs="Calibri"/>
+          <w:i/>
+          <w:color w:val="FB9E00"/>
+          <w:spacing w:val="-1"/>
+          <w:lang w:val="cs-CZ"/>
+        </w:rPr>
+        <w:t>Bezdrátové sítě standardu 802.11 b/g/a/n. ISDN a ADSL.</w:t>
       </w:r>
     </w:p>
     <w:p>
@@ -1249,7 +1502,74 @@
           <w:spacing w:val="-1"/>
           <w:lang w:val="cs-CZ"/>
         </w:rPr>
-        <w:t>Pokročilejší rysy jazyka SQL (datové typy a operátory, pohledy, oprávnění, uživatelské role). Transakce (princip a účel, způsoby implementace, prokládání transakcí a související problémy, stupeň izolace a uzamykání). Fyzická vrstva databáze (reprezentace odvozených dat, zajištění integritních omezení, fyzické uložení tabulek, indexy, pohledy). Procedurální rozšíření SQL (účel, použití, kursory a triggery, možnosti pro zajištění integritních omezení). Objektově orientované databáze (motivace, výhody a nevýhody, základy objektového návrhu, třídy, metody, navazování vztahů). Objektově-relační model (motivace, vlastnosti, příklady).</w:t>
+        <w:t xml:space="preserve">Pokročilejší rysy jazyka SQL (datové typy a operátory, pohledy, oprávnění, uživatelské role). </w:t>
+      </w:r>
+      <w:r>
+        <w:rPr>
+          <w:rFonts w:eastAsia="Calibri" w:cs="Calibri"/>
+          <w:i/>
+          <w:color w:val="FB9E00"/>
+          <w:spacing w:val="-1"/>
+          <w:lang w:val="cs-CZ"/>
+        </w:rPr>
+        <w:t>Transakce (princip a účel,</w:t>
+      </w:r>
+      <w:r>
+        <w:rPr>
+          <w:rFonts w:eastAsia="Calibri" w:cs="Calibri"/>
+          <w:i/>
+          <w:spacing w:val="-1"/>
+          <w:lang w:val="cs-CZ"/>
+        </w:rPr>
+        <w:t xml:space="preserve"> způsoby implementace, prokládání transakcí a související problémy, stupeň izolace a uzamykání). Fyzická vrstva databáze (reprezentace odvozených dat, zajištění integritních omezení, fyzické uložení tabulek, </w:t>
+      </w:r>
+      <w:r>
+        <w:rPr>
+          <w:rFonts w:eastAsia="Calibri" w:cs="Calibri"/>
+          <w:i/>
+          <w:color w:val="FB9E00"/>
+          <w:spacing w:val="-1"/>
+          <w:lang w:val="cs-CZ"/>
+        </w:rPr>
+        <w:t>indexy</w:t>
+      </w:r>
+      <w:r>
+        <w:rPr>
+          <w:rFonts w:eastAsia="Calibri" w:cs="Calibri"/>
+          <w:i/>
+          <w:spacing w:val="-1"/>
+          <w:lang w:val="cs-CZ"/>
+        </w:rPr>
+        <w:t xml:space="preserve">, pohledy). Procedurální rozšíření SQL (účel, použití, kursory a </w:t>
+      </w:r>
+      <w:r>
+        <w:rPr>
+          <w:rFonts w:eastAsia="Calibri" w:cs="Calibri"/>
+          <w:i/>
+          <w:color w:val="FB9E00"/>
+          <w:spacing w:val="-1"/>
+          <w:lang w:val="cs-CZ"/>
+        </w:rPr>
+        <w:t>triggery, možnosti pro zajištění integritních omezení).</w:t>
+      </w:r>
+      <w:r>
+        <w:rPr>
+          <w:rFonts w:eastAsia="Calibri" w:cs="Calibri"/>
+          <w:i/>
+          <w:spacing w:val="-1"/>
+          <w:lang w:val="cs-CZ"/>
+        </w:rPr>
+        <w:t xml:space="preserve"> Objektově orientované databáze (motivace, výhody a nevýhody, základy objektového návrhu, třídy, metody, navazování vztahů). </w:t>
+      </w:r>
+      <w:r>
+        <w:rPr>
+          <w:rFonts w:eastAsia="Calibri" w:cs="Calibri"/>
+          <w:i/>
+          <w:color w:val="FB9E00"/>
+          <w:spacing w:val="-1"/>
+          <w:lang w:val="cs-CZ"/>
+        </w:rPr>
+        <w:t>Objektově-relační model (motivace, vlastnosti, příklady).</w:t>
       </w:r>
     </w:p>
     <w:p>
@@ -1382,10 +1702,39 @@
         <w:rPr>
           <w:rFonts w:eastAsia="Calibri" w:cs="Calibri"/>
           <w:i/>
-          <w:spacing w:val="-1"/>
-          <w:lang w:val="cs-CZ"/>
-        </w:rPr>
-        <w:t>Obraz, jeho reprezentace a zobrazovací řetězec, barevné modely. Algoritmizace dvourozměrných objektů, modelování křivek, ploch a těles. Promítání, viditelnost, textury a světlo ve scéně. Globální zobrazovací metody. Virtuální realita, tvorba 3D modelů , prezentační vrstvy simulačních nástrojů.</w:t>
+          <w:color w:val="FB9E00"/>
+          <w:spacing w:val="-1"/>
+          <w:lang w:val="cs-CZ"/>
+        </w:rPr>
+        <w:t>Obraz, jeho reprezentace a zobrazovací řetězec, barevné modely.</w:t>
+      </w:r>
+      <w:r>
+        <w:rPr>
+          <w:rFonts w:eastAsia="Calibri" w:cs="Calibri"/>
+          <w:i/>
+          <w:spacing w:val="-1"/>
+          <w:lang w:val="cs-CZ"/>
+        </w:rPr>
+        <w:t xml:space="preserve"> Algoritmizace dvourozměrných objektů,</w:t>
+      </w:r>
+      <w:r>
+        <w:rPr>
+          <w:rFonts w:eastAsia="Calibri" w:cs="Calibri"/>
+          <w:i/>
+          <w:color w:val="FB9E00"/>
+          <w:spacing w:val="-1"/>
+          <w:lang w:val="cs-CZ"/>
+        </w:rPr>
+        <w:t xml:space="preserve"> modelování křivek, ploch a těles.</w:t>
+      </w:r>
+      <w:r>
+        <w:rPr>
+          <w:rFonts w:eastAsia="Calibri" w:cs="Calibri"/>
+          <w:i/>
+          <w:spacing w:val="-1"/>
+          <w:lang w:val="cs-CZ"/>
+        </w:rPr>
+        <w:t xml:space="preserve"> Promítání, viditelnost, textury a světlo ve scéně. Globální zobrazovací metody. Virtuální realita, tvorba 3D modelů , prezentační vrstvy simulačních nástrojů.</w:t>
       </w:r>
     </w:p>
     <w:p>
@@ -1709,7 +2058,7 @@
   <w:docDefaults>
     <w:rPrDefault>
       <w:rPr>
-        <w:rFonts w:ascii="Calibri" w:hAnsi="Calibri" w:eastAsia="Calibri" w:cs="" w:asciiTheme="minorHAnsi" w:cstheme="minorBidi" w:eastAsiaTheme="minorHAnsi" w:hAnsiTheme="minorHAnsi"/>
+        <w:rFonts w:ascii="Calibri" w:hAnsi="Calibri" w:eastAsia="Calibri" w:cs="Noto Sans Arabic"/>
         <w:sz w:val="22"/>
         <w:szCs w:val="22"/>
         <w:lang w:val="en-US" w:eastAsia="en-US" w:bidi="ar-SA"/>
@@ -1721,396 +2070,21 @@
       </w:pPr>
     </w:pPrDefault>
   </w:docDefaults>
-  <w:latentStyles w:defLockedState="0" w:defUIPriority="99" w:defSemiHidden="0" w:defUnhideWhenUsed="0" w:defQFormat="0" w:count="375">
-    <w:lsdException w:name="Normal" w:uiPriority="0" w:qFormat="1"/>
-    <w:lsdException w:name="heading 1" w:uiPriority="9" w:qFormat="1"/>
-    <w:lsdException w:name="heading 2" w:uiPriority="9" w:semiHidden="1" w:unhideWhenUsed="1" w:qFormat="1"/>
-    <w:lsdException w:name="heading 3" w:uiPriority="9" w:semiHidden="1" w:unhideWhenUsed="1" w:qFormat="1"/>
-    <w:lsdException w:name="heading 4" w:uiPriority="9" w:semiHidden="1" w:unhideWhenUsed="1" w:qFormat="1"/>
-    <w:lsdException w:name="heading 5" w:uiPriority="9" w:semiHidden="1" w:unhideWhenUsed="1" w:qFormat="1"/>
-    <w:lsdException w:name="heading 6" w:uiPriority="9" w:semiHidden="1" w:unhideWhenUsed="1" w:qFormat="1"/>
-    <w:lsdException w:name="heading 7" w:uiPriority="9" w:semiHidden="1" w:unhideWhenUsed="1" w:qFormat="1"/>
-    <w:lsdException w:name="heading 8" w:uiPriority="9" w:semiHidden="1" w:unhideWhenUsed="1" w:qFormat="1"/>
-    <w:lsdException w:name="heading 9" w:uiPriority="9" w:semiHidden="1" w:unhideWhenUsed="1" w:qFormat="1"/>
-    <w:lsdException w:name="index 1" w:semiHidden="1" w:unhideWhenUsed="1"/>
-    <w:lsdException w:name="index 2" w:semiHidden="1" w:unhideWhenUsed="1"/>
-    <w:lsdException w:name="index 3" w:semiHidden="1" w:unhideWhenUsed="1"/>
-    <w:lsdException w:name="index 4" w:semiHidden="1" w:unhideWhenUsed="1"/>
-    <w:lsdException w:name="index 5" w:semiHidden="1" w:unhideWhenUsed="1"/>
-    <w:lsdException w:name="index 6" w:semiHidden="1" w:unhideWhenUsed="1"/>
-    <w:lsdException w:name="index 7" w:semiHidden="1" w:unhideWhenUsed="1"/>
-    <w:lsdException w:name="index 8" w:semiHidden="1" w:unhideWhenUsed="1"/>
-    <w:lsdException w:name="index 9" w:semiHidden="1" w:unhideWhenUsed="1"/>
-    <w:lsdException w:name="toc 1" w:uiPriority="39" w:semiHidden="1" w:unhideWhenUsed="1"/>
-    <w:lsdException w:name="toc 2" w:uiPriority="39" w:semiHidden="1" w:unhideWhenUsed="1"/>
-    <w:lsdException w:name="toc 3" w:uiPriority="39" w:semiHidden="1" w:unhideWhenUsed="1"/>
-    <w:lsdException w:name="toc 4" w:uiPriority="39" w:semiHidden="1" w:unhideWhenUsed="1"/>
-    <w:lsdException w:name="toc 5" w:uiPriority="39" w:semiHidden="1" w:unhideWhenUsed="1"/>
-    <w:lsdException w:name="toc 6" w:uiPriority="39" w:semiHidden="1" w:unhideWhenUsed="1"/>
-    <w:lsdException w:name="toc 7" w:uiPriority="39" w:semiHidden="1" w:unhideWhenUsed="1"/>
-    <w:lsdException w:name="toc 8" w:uiPriority="39" w:semiHidden="1" w:unhideWhenUsed="1"/>
-    <w:lsdException w:name="toc 9" w:uiPriority="39" w:semiHidden="1" w:unhideWhenUsed="1"/>
-    <w:lsdException w:name="Normal Indent" w:semiHidden="1" w:unhideWhenUsed="1"/>
-    <w:lsdException w:name="footnote text" w:semiHidden="1" w:unhideWhenUsed="1"/>
-    <w:lsdException w:name="annotation text" w:semiHidden="1" w:unhideWhenUsed="1"/>
-    <w:lsdException w:name="header" w:semiHidden="1" w:unhideWhenUsed="1"/>
-    <w:lsdException w:name="footer" w:semiHidden="1" w:unhideWhenUsed="1"/>
-    <w:lsdException w:name="index heading" w:semiHidden="1" w:unhideWhenUsed="1"/>
-    <w:lsdException w:name="caption" w:uiPriority="35" w:semiHidden="1" w:unhideWhenUsed="1" w:qFormat="1"/>
-    <w:lsdException w:name="table of figures" w:semiHidden="1" w:unhideWhenUsed="1"/>
-    <w:lsdException w:name="envelope address" w:semiHidden="1" w:unhideWhenUsed="1"/>
-    <w:lsdException w:name="envelope return" w:semiHidden="1" w:unhideWhenUsed="1"/>
-    <w:lsdException w:name="footnote reference" w:semiHidden="1" w:unhideWhenUsed="1"/>
-    <w:lsdException w:name="annotation reference" w:semiHidden="1" w:unhideWhenUsed="1"/>
-    <w:lsdException w:name="line number" w:semiHidden="1" w:unhideWhenUsed="1"/>
-    <w:lsdException w:name="page number" w:semiHidden="1" w:unhideWhenUsed="1"/>
-    <w:lsdException w:name="endnote reference" w:semiHidden="1" w:unhideWhenUsed="1"/>
-    <w:lsdException w:name="endnote text" w:semiHidden="1" w:unhideWhenUsed="1"/>
-    <w:lsdException w:name="table of authorities" w:semiHidden="1" w:unhideWhenUsed="1"/>
-    <w:lsdException w:name="macro" w:semiHidden="1" w:unhideWhenUsed="1"/>
-    <w:lsdException w:name="toa heading" w:semiHidden="1" w:unhideWhenUsed="1"/>
-    <w:lsdException w:name="List" w:semiHidden="1" w:unhideWhenUsed="1"/>
-    <w:lsdException w:name="List Bullet" w:semiHidden="1" w:unhideWhenUsed="1"/>
-    <w:lsdException w:name="List Number" w:semiHidden="1" w:unhideWhenUsed="1"/>
-    <w:lsdException w:name="List 2" w:semiHidden="1" w:unhideWhenUsed="1"/>
-    <w:lsdException w:name="List 3" w:semiHidden="1" w:unhideWhenUsed="1"/>
-    <w:lsdException w:name="List 4" w:semiHidden="1" w:unhideWhenUsed="1"/>
-    <w:lsdException w:name="List 5" w:semiHidden="1" w:unhideWhenUsed="1"/>
-    <w:lsdException w:name="List Bullet 2" w:semiHidden="1" w:unhideWhenUsed="1"/>
-    <w:lsdException w:name="List Bullet 3" w:semiHidden="1" w:unhideWhenUsed="1"/>
-    <w:lsdException w:name="List Bullet 4" w:semiHidden="1" w:unhideWhenUsed="1"/>
-    <w:lsdException w:name="List Bullet 5" w:semiHidden="1" w:unhideWhenUsed="1"/>
-    <w:lsdException w:name="List Number 2" w:semiHidden="1" w:unhideWhenUsed="1"/>
-    <w:lsdException w:name="List Number 3" w:semiHidden="1" w:unhideWhenUsed="1"/>
-    <w:lsdException w:name="List Number 4" w:semiHidden="1" w:unhideWhenUsed="1"/>
-    <w:lsdException w:name="List Number 5" w:semiHidden="1" w:unhideWhenUsed="1"/>
-    <w:lsdException w:name="Title" w:uiPriority="10" w:qFormat="1"/>
-    <w:lsdException w:name="Closing" w:semiHidden="1" w:unhideWhenUsed="1"/>
-    <w:lsdException w:name="Signature" w:semiHidden="1" w:unhideWhenUsed="1"/>
-    <w:lsdException w:name="Default Paragraph Font" w:uiPriority="1" w:semiHidden="1" w:unhideWhenUsed="1"/>
-    <w:lsdException w:name="Body Text" w:semiHidden="1" w:unhideWhenUsed="1"/>
-    <w:lsdException w:name="Body Text Indent" w:semiHidden="1" w:unhideWhenUsed="1"/>
-    <w:lsdException w:name="List Continue" w:semiHidden="1" w:unhideWhenUsed="1"/>
-    <w:lsdException w:name="List Continue 2" w:semiHidden="1" w:unhideWhenUsed="1"/>
-    <w:lsdException w:name="List Continue 3" w:semiHidden="1" w:unhideWhenUsed="1"/>
-    <w:lsdException w:name="List Continue 4" w:semiHidden="1" w:unhideWhenUsed="1"/>
-    <w:lsdException w:name="List Continue 5" w:semiHidden="1" w:unhideWhenUsed="1"/>
-    <w:lsdException w:name="Message Header" w:semiHidden="1" w:unhideWhenUsed="1"/>
-    <w:lsdException w:name="Subtitle" w:uiPriority="11" w:qFormat="1"/>
-    <w:lsdException w:name="Salutation" w:semiHidden="1" w:unhideWhenUsed="1"/>
-    <w:lsdException w:name="Date" w:semiHidden="1" w:unhideWhenUsed="1"/>
-    <w:lsdException w:name="Body Text First Indent" w:semiHidden="1" w:unhideWhenUsed="1"/>
-    <w:lsdException w:name="Body Text First Indent 2" w:semiHidden="1" w:unhideWhenUsed="1"/>
-    <w:lsdException w:name="Note Heading" w:semiHidden="1" w:unhideWhenUsed="1"/>
-    <w:lsdException w:name="Body Text 2" w:semiHidden="1" w:unhideWhenUsed="1"/>
-    <w:lsdException w:name="Body Text 3" w:semiHidden="1" w:unhideWhenUsed="1"/>
-    <w:lsdException w:name="Body Text Indent 2" w:semiHidden="1" w:unhideWhenUsed="1"/>
-    <w:lsdException w:name="Body Text Indent 3" w:semiHidden="1" w:unhideWhenUsed="1"/>
-    <w:lsdException w:name="Block Text" w:semiHidden="1" w:unhideWhenUsed="1"/>
-    <w:lsdException w:name="Hyperlink" w:semiHidden="1" w:unhideWhenUsed="1"/>
-    <w:lsdException w:name="FollowedHyperlink" w:semiHidden="1" w:unhideWhenUsed="1"/>
-    <w:lsdException w:name="Strong" w:uiPriority="22" w:qFormat="1"/>
-    <w:lsdException w:name="Emphasis" w:uiPriority="20" w:qFormat="1"/>
-    <w:lsdException w:name="Document Map" w:semiHidden="1" w:unhideWhenUsed="1"/>
-    <w:lsdException w:name="Plain Text" w:semiHidden="1" w:unhideWhenUsed="1"/>
-    <w:lsdException w:name="E-mail Signature" w:semiHidden="1" w:unhideWhenUsed="1"/>
-    <w:lsdException w:name="HTML Top of Form" w:semiHidden="1" w:unhideWhenUsed="1"/>
-    <w:lsdException w:name="HTML Bottom of Form" w:semiHidden="1" w:unhideWhenUsed="1"/>
-    <w:lsdException w:name="Normal (Web)" w:semiHidden="1" w:unhideWhenUsed="1"/>
-    <w:lsdException w:name="HTML Acronym" w:semiHidden="1" w:unhideWhenUsed="1"/>
-    <w:lsdException w:name="HTML Address" w:semiHidden="1" w:unhideWhenUsed="1"/>
-    <w:lsdException w:name="HTML Cite" w:semiHidden="1" w:unhideWhenUsed="1"/>
-    <w:lsdException w:name="HTML Code" w:semiHidden="1" w:unhideWhenUsed="1"/>
-    <w:lsdException w:name="HTML Definition" w:semiHidden="1" w:unhideWhenUsed="1"/>
-    <w:lsdException w:name="HTML Keyboard" w:semiHidden="1" w:unhideWhenUsed="1"/>
-    <w:lsdException w:name="HTML Preformatted" w:semiHidden="1" w:unhideWhenUsed="1"/>
-    <w:lsdException w:name="HTML Sample" w:semiHidden="1" w:unhideWhenUsed="1"/>
-    <w:lsdException w:name="HTML Typewriter" w:semiHidden="1" w:unhideWhenUsed="1"/>
-    <w:lsdException w:name="HTML Variable" w:semiHidden="1" w:unhideWhenUsed="1"/>
-    <w:lsdException w:name="Normal Table" w:semiHidden="1" w:unhideWhenUsed="1"/>
-    <w:lsdException w:name="annotation subject" w:semiHidden="1" w:unhideWhenUsed="1"/>
-    <w:lsdException w:name="No List" w:semiHidden="1" w:unhideWhenUsed="1"/>
-    <w:lsdException w:name="Outline List 1" w:semiHidden="1" w:unhideWhenUsed="1"/>
-    <w:lsdException w:name="Outline List 2" w:semiHidden="1" w:unhideWhenUsed="1"/>
-    <w:lsdException w:name="Outline List 3" w:semiHidden="1" w:unhideWhenUsed="1"/>
-    <w:lsdException w:name="Table Simple 1" w:semiHidden="1" w:unhideWhenUsed="1"/>
-    <w:lsdException w:name="Table Simple 2" w:semiHidden="1" w:unhideWhenUsed="1"/>
-    <w:lsdException w:name="Table Simple 3" w:semiHidden="1" w:unhideWhenUsed="1"/>
-    <w:lsdException w:name="Table Classic 1" w:semiHidden="1" w:unhideWhenUsed="1"/>
-    <w:lsdException w:name="Table Classic 2" w:semiHidden="1" w:unhideWhenUsed="1"/>
-    <w:lsdException w:name="Table Classic 3" w:semiHidden="1" w:unhideWhenUsed="1"/>
-    <w:lsdException w:name="Table Classic 4" w:semiHidden="1" w:unhideWhenUsed="1"/>
-    <w:lsdException w:name="Table Colorful 1" w:semiHidden="1" w:unhideWhenUsed="1"/>
-    <w:lsdException w:name="Table Colorful 2" w:semiHidden="1" w:unhideWhenUsed="1"/>
-    <w:lsdException w:name="Table Colorful 3" w:semiHidden="1" w:unhideWhenUsed="1"/>
-    <w:lsdException w:name="Table Columns 1" w:semiHidden="1" w:unhideWhenUsed="1"/>
-    <w:lsdException w:name="Table Columns 2" w:semiHidden="1" w:unhideWhenUsed="1"/>
-    <w:lsdException w:name="Table Columns 3" w:semiHidden="1" w:unhideWhenUsed="1"/>
-    <w:lsdException w:name="Table Columns 4" w:semiHidden="1" w:unhideWhenUsed="1"/>
-    <w:lsdException w:name="Table Columns 5" w:semiHidden="1" w:unhideWhenUsed="1"/>
-    <w:lsdException w:name="Table Grid 1" w:semiHidden="1" w:unhideWhenUsed="1"/>
-    <w:lsdException w:name="Table Grid 2" w:semiHidden="1" w:unhideWhenUsed="1"/>
-    <w:lsdException w:name="Table Grid 3" w:semiHidden="1" w:unhideWhenUsed="1"/>
-    <w:lsdException w:name="Table Grid 4" w:semiHidden="1" w:unhideWhenUsed="1"/>
-    <w:lsdException w:name="Table Grid 5" w:semiHidden="1" w:unhideWhenUsed="1"/>
-    <w:lsdException w:name="Table Grid 6" w:semiHidden="1" w:unhideWhenUsed="1"/>
-    <w:lsdException w:name="Table Grid 7" w:semiHidden="1" w:unhideWhenUsed="1"/>
-    <w:lsdException w:name="Table Grid 8" w:semiHidden="1" w:unhideWhenUsed="1"/>
-    <w:lsdException w:name="Table List 1" w:semiHidden="1" w:unhideWhenUsed="1"/>
-    <w:lsdException w:name="Table List 2" w:semiHidden="1" w:unhideWhenUsed="1"/>
-    <w:lsdException w:name="Table List 3" w:semiHidden="1" w:unhideWhenUsed="1"/>
-    <w:lsdException w:name="Table List 4" w:semiHidden="1" w:unhideWhenUsed="1"/>
-    <w:lsdException w:name="Table List 5" w:semiHidden="1" w:unhideWhenUsed="1"/>
-    <w:lsdException w:name="Table List 6" w:semiHidden="1" w:unhideWhenUsed="1"/>
-    <w:lsdException w:name="Table List 7" w:semiHidden="1" w:unhideWhenUsed="1"/>
-    <w:lsdException w:name="Table List 8" w:semiHidden="1" w:unhideWhenUsed="1"/>
-    <w:lsdException w:name="Table 3D effects 1" w:semiHidden="1" w:unhideWhenUsed="1"/>
-    <w:lsdException w:name="Table 3D effects 2" w:semiHidden="1" w:unhideWhenUsed="1"/>
-    <w:lsdException w:name="Table 3D effects 3" w:semiHidden="1" w:unhideWhenUsed="1"/>
-    <w:lsdException w:name="Table Contemporary" w:semiHidden="1" w:unhideWhenUsed="1"/>
-    <w:lsdException w:name="Table Elegant" w:semiHidden="1" w:unhideWhenUsed="1"/>
-    <w:lsdException w:name="Table Professional" w:semiHidden="1" w:unhideWhenUsed="1"/>
-    <w:lsdException w:name="Table Subtle 1" w:semiHidden="1" w:unhideWhenUsed="1"/>
-    <w:lsdException w:name="Table Subtle 2" w:semiHidden="1" w:unhideWhenUsed="1"/>
-    <w:lsdException w:name="Table Web 1" w:semiHidden="1" w:unhideWhenUsed="1"/>
-    <w:lsdException w:name="Table Web 2" w:semiHidden="1" w:unhideWhenUsed="1"/>
-    <w:lsdException w:name="Table Web 3" w:semiHidden="1" w:unhideWhenUsed="1"/>
-    <w:lsdException w:name="Balloon Text" w:semiHidden="1" w:unhideWhenUsed="1"/>
-    <w:lsdException w:name="Table Grid" w:uiPriority="59"/>
-    <w:lsdException w:name="Table Theme" w:semiHidden="1" w:unhideWhenUsed="1"/>
-    <w:lsdException w:name="Placeholder Text" w:semiHidden="1"/>
-    <w:lsdException w:name="No Spacing" w:uiPriority="1" w:qFormat="1"/>
-    <w:lsdException w:name="Light Shading" w:uiPriority="60"/>
-    <w:lsdException w:name="Light List" w:uiPriority="61"/>
-    <w:lsdException w:name="Light Grid" w:uiPriority="62"/>
-    <w:lsdException w:name="Medium Shading 1" w:uiPriority="63"/>
-    <w:lsdException w:name="Medium Shading 2" w:uiPriority="64"/>
-    <w:lsdException w:name="Medium List 1" w:uiPriority="65"/>
-    <w:lsdException w:name="Medium List 2" w:uiPriority="66"/>
-    <w:lsdException w:name="Medium Grid 1" w:uiPriority="67"/>
-    <w:lsdException w:name="Medium Grid 2" w:uiPriority="68"/>
-    <w:lsdException w:name="Medium Grid 3" w:uiPriority="69"/>
-    <w:lsdException w:name="Dark List" w:uiPriority="70"/>
-    <w:lsdException w:name="Colorful Shading" w:uiPriority="71"/>
-    <w:lsdException w:name="Colorful List" w:uiPriority="72"/>
-    <w:lsdException w:name="Colorful Grid" w:uiPriority="73"/>
-    <w:lsdException w:name="Light Shading Accent 1" w:uiPriority="60"/>
-    <w:lsdException w:name="Light List Accent 1" w:uiPriority="61"/>
-    <w:lsdException w:name="Light Grid Accent 1" w:uiPriority="62"/>
-    <w:lsdException w:name="Medium Shading 1 Accent 1" w:uiPriority="63"/>
-    <w:lsdException w:name="Medium Shading 2 Accent 1" w:uiPriority="64"/>
-    <w:lsdException w:name="Medium List 1 Accent 1" w:uiPriority="65"/>
-    <w:lsdException w:name="Revision" w:semiHidden="1"/>
-    <w:lsdException w:name="List Paragraph" w:uiPriority="34" w:qFormat="1"/>
-    <w:lsdException w:name="Quote" w:uiPriority="29" w:qFormat="1"/>
-    <w:lsdException w:name="Intense Quote" w:uiPriority="30" w:qFormat="1"/>
-    <w:lsdException w:name="Medium List 2 Accent 1" w:uiPriority="66"/>
-    <w:lsdException w:name="Medium Grid 1 Accent 1" w:uiPriority="67"/>
-    <w:lsdException w:name="Medium Grid 2 Accent 1" w:uiPriority="68"/>
-    <w:lsdException w:name="Medium Grid 3 Accent 1" w:uiPriority="69"/>
-    <w:lsdException w:name="Dark List Accent 1" w:uiPriority="70"/>
-    <w:lsdException w:name="Colorful Shading Accent 1" w:uiPriority="71"/>
-    <w:lsdException w:name="Colorful List Accent 1" w:uiPriority="72"/>
-    <w:lsdException w:name="Colorful Grid Accent 1" w:uiPriority="73"/>
-    <w:lsdException w:name="Light Shading Accent 2" w:uiPriority="60"/>
-    <w:lsdException w:name="Light List Accent 2" w:uiPriority="61"/>
-    <w:lsdException w:name="Light Grid Accent 2" w:uiPriority="62"/>
-    <w:lsdException w:name="Medium Shading 1 Accent 2" w:uiPriority="63"/>
-    <w:lsdException w:name="Medium Shading 2 Accent 2" w:uiPriority="64"/>
-    <w:lsdException w:name="Medium List 1 Accent 2" w:uiPriority="65"/>
-    <w:lsdException w:name="Medium List 2 Accent 2" w:uiPriority="66"/>
-    <w:lsdException w:name="Medium Grid 1 Accent 2" w:uiPriority="67"/>
-    <w:lsdException w:name="Medium Grid 2 Accent 2" w:uiPriority="68"/>
-    <w:lsdException w:name="Medium Grid 3 Accent 2" w:uiPriority="69"/>
-    <w:lsdException w:name="Dark List Accent 2" w:uiPriority="70"/>
-    <w:lsdException w:name="Colorful Shading Accent 2" w:uiPriority="71"/>
-    <w:lsdException w:name="Colorful List Accent 2" w:uiPriority="72"/>
-    <w:lsdException w:name="Colorful Grid Accent 2" w:uiPriority="73"/>
-    <w:lsdException w:name="Light Shading Accent 3" w:uiPriority="60"/>
-    <w:lsdException w:name="Light List Accent 3" w:uiPriority="61"/>
-    <w:lsdException w:name="Light Grid Accent 3" w:uiPriority="62"/>
-    <w:lsdException w:name="Medium Shading 1 Accent 3" w:uiPriority="63"/>
-    <w:lsdException w:name="Medium Shading 2 Accent 3" w:uiPriority="64"/>
-    <w:lsdException w:name="Medium List 1 Accent 3" w:uiPriority="65"/>
-    <w:lsdException w:name="Medium List 2 Accent 3" w:uiPriority="66"/>
-    <w:lsdException w:name="Medium Grid 1 Accent 3" w:uiPriority="67"/>
-    <w:lsdException w:name="Medium Grid 2 Accent 3" w:uiPriority="68"/>
-    <w:lsdException w:name="Medium Grid 3 Accent 3" w:uiPriority="69"/>
-    <w:lsdException w:name="Dark List Accent 3" w:uiPriority="70"/>
-    <w:lsdException w:name="Colorful Shading Accent 3" w:uiPriority="71"/>
-    <w:lsdException w:name="Colorful List Accent 3" w:uiPriority="72"/>
-    <w:lsdException w:name="Colorful Grid Accent 3" w:uiPriority="73"/>
-    <w:lsdException w:name="Light Shading Accent 4" w:uiPriority="60"/>
-    <w:lsdException w:name="Light List Accent 4" w:uiPriority="61"/>
-    <w:lsdException w:name="Light Grid Accent 4" w:uiPriority="62"/>
-    <w:lsdException w:name="Medium Shading 1 Accent 4" w:uiPriority="63"/>
-    <w:lsdException w:name="Medium Shading 2 Accent 4" w:uiPriority="64"/>
-    <w:lsdException w:name="Medium List 1 Accent 4" w:uiPriority="65"/>
-    <w:lsdException w:name="Medium List 2 Accent 4" w:uiPriority="66"/>
-    <w:lsdException w:name="Medium Grid 1 Accent 4" w:uiPriority="67"/>
-    <w:lsdException w:name="Medium Grid 2 Accent 4" w:uiPriority="68"/>
-    <w:lsdException w:name="Medium Grid 3 Accent 4" w:uiPriority="69"/>
-    <w:lsdException w:name="Dark List Accent 4" w:uiPriority="70"/>
-    <w:lsdException w:name="Colorful Shading Accent 4" w:uiPriority="71"/>
-    <w:lsdException w:name="Colorful List Accent 4" w:uiPriority="72"/>
-    <w:lsdException w:name="Colorful Grid Accent 4" w:uiPriority="73"/>
-    <w:lsdException w:name="Light Shading Accent 5" w:uiPriority="60"/>
-    <w:lsdException w:name="Light List Accent 5" w:uiPriority="61"/>
-    <w:lsdException w:name="Light Grid Accent 5" w:uiPriority="62"/>
-    <w:lsdException w:name="Medium Shading 1 Accent 5" w:uiPriority="63"/>
-    <w:lsdException w:name="Medium Shading 2 Accent 5" w:uiPriority="64"/>
-    <w:lsdException w:name="Medium List 1 Accent 5" w:uiPriority="65"/>
-    <w:lsdException w:name="Medium List 2 Accent 5" w:uiPriority="66"/>
-    <w:lsdException w:name="Medium Grid 1 Accent 5" w:uiPriority="67"/>
-    <w:lsdException w:name="Medium Grid 2 Accent 5" w:uiPriority="68"/>
-    <w:lsdException w:name="Medium Grid 3 Accent 5" w:uiPriority="69"/>
-    <w:lsdException w:name="Dark List Accent 5" w:uiPriority="70"/>
-    <w:lsdException w:name="Colorful Shading Accent 5" w:uiPriority="71"/>
-    <w:lsdException w:name="Colorful List Accent 5" w:uiPriority="72"/>
-    <w:lsdException w:name="Colorful Grid Accent 5" w:uiPriority="73"/>
-    <w:lsdException w:name="Light Shading Accent 6" w:uiPriority="60"/>
-    <w:lsdException w:name="Light List Accent 6" w:uiPriority="61"/>
-    <w:lsdException w:name="Light Grid Accent 6" w:uiPriority="62"/>
-    <w:lsdException w:name="Medium Shading 1 Accent 6" w:uiPriority="63"/>
-    <w:lsdException w:name="Medium Shading 2 Accent 6" w:uiPriority="64"/>
-    <w:lsdException w:name="Medium List 1 Accent 6" w:uiPriority="65"/>
-    <w:lsdException w:name="Medium List 2 Accent 6" w:uiPriority="66"/>
-    <w:lsdException w:name="Medium Grid 1 Accent 6" w:uiPriority="67"/>
-    <w:lsdException w:name="Medium Grid 2 Accent 6" w:uiPriority="68"/>
-    <w:lsdException w:name="Medium Grid 3 Accent 6" w:uiPriority="69"/>
-    <w:lsdException w:name="Dark List Accent 6" w:uiPriority="70"/>
-    <w:lsdException w:name="Colorful Shading Accent 6" w:uiPriority="71"/>
-    <w:lsdException w:name="Colorful List Accent 6" w:uiPriority="72"/>
-    <w:lsdException w:name="Colorful Grid Accent 6" w:uiPriority="73"/>
-    <w:lsdException w:name="Subtle Emphasis" w:uiPriority="19" w:qFormat="1"/>
-    <w:lsdException w:name="Intense Emphasis" w:uiPriority="21" w:qFormat="1"/>
-    <w:lsdException w:name="Subtle Reference" w:uiPriority="31" w:qFormat="1"/>
-    <w:lsdException w:name="Intense Reference" w:uiPriority="32" w:qFormat="1"/>
-    <w:lsdException w:name="Book Title" w:uiPriority="33" w:qFormat="1"/>
-    <w:lsdException w:name="Bibliography" w:uiPriority="37" w:semiHidden="1" w:unhideWhenUsed="1"/>
-    <w:lsdException w:name="TOC Heading" w:uiPriority="39" w:semiHidden="1" w:unhideWhenUsed="1" w:qFormat="1"/>
-    <w:lsdException w:name="Plain Table 1" w:uiPriority="41"/>
-    <w:lsdException w:name="Plain Table 2" w:uiPriority="42"/>
-    <w:lsdException w:name="Plain Table 3" w:uiPriority="43"/>
-    <w:lsdException w:name="Plain Table 4" w:uiPriority="44"/>
-    <w:lsdException w:name="Plain Table 5" w:uiPriority="45"/>
-    <w:lsdException w:name="Grid Table Light" w:uiPriority="40"/>
-    <w:lsdException w:name="Grid Table 1 Light" w:uiPriority="46"/>
-    <w:lsdException w:name="Grid Table 2" w:uiPriority="47"/>
-    <w:lsdException w:name="Grid Table 3" w:uiPriority="48"/>
-    <w:lsdException w:name="Grid Table 4" w:uiPriority="49"/>
-    <w:lsdException w:name="Grid Table 5 Dark" w:uiPriority="50"/>
-    <w:lsdException w:name="Grid Table 6 Colorful" w:uiPriority="51"/>
-    <w:lsdException w:name="Grid Table 7 Colorful" w:uiPriority="52"/>
-    <w:lsdException w:name="Grid Table 1 Light Accent 1" w:uiPriority="46"/>
-    <w:lsdException w:name="Grid Table 2 Accent 1" w:uiPriority="47"/>
-    <w:lsdException w:name="Grid Table 3 Accent 1" w:uiPriority="48"/>
-    <w:lsdException w:name="Grid Table 4 Accent 1" w:uiPriority="49"/>
-    <w:lsdException w:name="Grid Table 5 Dark Accent 1" w:uiPriority="50"/>
-    <w:lsdException w:name="Grid Table 6 Colorful Accent 1" w:uiPriority="51"/>
-    <w:lsdException w:name="Grid Table 7 Colorful Accent 1" w:uiPriority="52"/>
-    <w:lsdException w:name="Grid Table 1 Light Accent 2" w:uiPriority="46"/>
-    <w:lsdException w:name="Grid Table 2 Accent 2" w:uiPriority="47"/>
-    <w:lsdException w:name="Grid Table 3 Accent 2" w:uiPriority="48"/>
-    <w:lsdException w:name="Grid Table 4 Accent 2" w:uiPriority="49"/>
-    <w:lsdException w:name="Grid Table 5 Dark Accent 2" w:uiPriority="50"/>
-    <w:lsdException w:name="Grid Table 6 Colorful Accent 2" w:uiPriority="51"/>
-    <w:lsdException w:name="Grid Table 7 Colorful Accent 2" w:uiPriority="52"/>
-    <w:lsdException w:name="Grid Table 1 Light Accent 3" w:uiPriority="46"/>
-    <w:lsdException w:name="Grid Table 2 Accent 3" w:uiPriority="47"/>
-    <w:lsdException w:name="Grid Table 3 Accent 3" w:uiPriority="48"/>
-    <w:lsdException w:name="Grid Table 4 Accent 3" w:uiPriority="49"/>
-    <w:lsdException w:name="Grid Table 5 Dark Accent 3" w:uiPriority="50"/>
-    <w:lsdException w:name="Grid Table 6 Colorful Accent 3" w:uiPriority="51"/>
-    <w:lsdException w:name="Grid Table 7 Colorful Accent 3" w:uiPriority="52"/>
-    <w:lsdException w:name="Grid Table 1 Light Accent 4" w:uiPriority="46"/>
-    <w:lsdException w:name="Grid Table 2 Accent 4" w:uiPriority="47"/>
-    <w:lsdException w:name="Grid Table 3 Accent 4" w:uiPriority="48"/>
-    <w:lsdException w:name="Grid Table 4 Accent 4" w:uiPriority="49"/>
-    <w:lsdException w:name="Grid Table 5 Dark Accent 4" w:uiPriority="50"/>
-    <w:lsdException w:name="Grid Table 6 Colorful Accent 4" w:uiPriority="51"/>
-    <w:lsdException w:name="Grid Table 7 Colorful Accent 4" w:uiPriority="52"/>
-    <w:lsdException w:name="Grid Table 1 Light Accent 5" w:uiPriority="46"/>
-    <w:lsdException w:name="Grid Table 2 Accent 5" w:uiPriority="47"/>
-    <w:lsdException w:name="Grid Table 3 Accent 5" w:uiPriority="48"/>
-    <w:lsdException w:name="Grid Table 4 Accent 5" w:uiPriority="49"/>
-    <w:lsdException w:name="Grid Table 5 Dark Accent 5" w:uiPriority="50"/>
-    <w:lsdException w:name="Grid Table 6 Colorful Accent 5" w:uiPriority="51"/>
-    <w:lsdException w:name="Grid Table 7 Colorful Accent 5" w:uiPriority="52"/>
-    <w:lsdException w:name="Grid Table 1 Light Accent 6" w:uiPriority="46"/>
-    <w:lsdException w:name="Grid Table 2 Accent 6" w:uiPriority="47"/>
-    <w:lsdException w:name="Grid Table 3 Accent 6" w:uiPriority="48"/>
-    <w:lsdException w:name="Grid Table 4 Accent 6" w:uiPriority="49"/>
-    <w:lsdException w:name="Grid Table 5 Dark Accent 6" w:uiPriority="50"/>
-    <w:lsdException w:name="Grid Table 6 Colorful Accent 6" w:uiPriority="51"/>
-    <w:lsdException w:name="Grid Table 7 Colorful Accent 6" w:uiPriority="52"/>
-    <w:lsdException w:name="List Table 1 Light" w:uiPriority="46"/>
-    <w:lsdException w:name="List Table 2" w:uiPriority="47"/>
-    <w:lsdException w:name="List Table 3" w:uiPriority="48"/>
-    <w:lsdException w:name="List Table 4" w:uiPriority="49"/>
-    <w:lsdException w:name="List Table 5 Dark" w:uiPriority="50"/>
-    <w:lsdException w:name="List Table 6 Colorful" w:uiPriority="51"/>
-    <w:lsdException w:name="List Table 7 Colorful" w:uiPriority="52"/>
-    <w:lsdException w:name="List Table 1 Light Accent 1" w:uiPriority="46"/>
-    <w:lsdException w:name="List Table 2 Accent 1" w:uiPriority="47"/>
-    <w:lsdException w:name="List Table 3 Accent 1" w:uiPriority="48"/>
-    <w:lsdException w:name="List Table 4 Accent 1" w:uiPriority="49"/>
-    <w:lsdException w:name="List Table 5 Dark Accent 1" w:uiPriority="50"/>
-    <w:lsdException w:name="List Table 6 Colorful Accent 1" w:uiPriority="51"/>
-    <w:lsdException w:name="List Table 7 Colorful Accent 1" w:uiPriority="52"/>
-    <w:lsdException w:name="List Table 1 Light Accent 2" w:uiPriority="46"/>
-    <w:lsdException w:name="List Table 2 Accent 2" w:uiPriority="47"/>
-    <w:lsdException w:name="List Table 3 Accent 2" w:uiPriority="48"/>
-    <w:lsdException w:name="List Table 4 Accent 2" w:uiPriority="49"/>
-    <w:lsdException w:name="List Table 5 Dark Accent 2" w:uiPriority="50"/>
-    <w:lsdException w:name="List Table 6 Colorful Accent 2" w:uiPriority="51"/>
-    <w:lsdException w:name="List Table 7 Colorful Accent 2" w:uiPriority="52"/>
-    <w:lsdException w:name="List Table 1 Light Accent 3" w:uiPriority="46"/>
-    <w:lsdException w:name="List Table 2 Accent 3" w:uiPriority="47"/>
-    <w:lsdException w:name="List Table 3 Accent 3" w:uiPriority="48"/>
-    <w:lsdException w:name="List Table 4 Accent 3" w:uiPriority="49"/>
-    <w:lsdException w:name="List Table 5 Dark Accent 3" w:uiPriority="50"/>
-    <w:lsdException w:name="List Table 6 Colorful Accent 3" w:uiPriority="51"/>
-    <w:lsdException w:name="List Table 7 Colorful Accent 3" w:uiPriority="52"/>
-    <w:lsdException w:name="List Table 1 Light Accent 4" w:uiPriority="46"/>
-    <w:lsdException w:name="List Table 2 Accent 4" w:uiPriority="47"/>
-    <w:lsdException w:name="List Table 3 Accent 4" w:uiPriority="48"/>
-    <w:lsdException w:name="List Table 4 Accent 4" w:uiPriority="49"/>
-    <w:lsdException w:name="List Table 5 Dark Accent 4" w:uiPriority="50"/>
-    <w:lsdException w:name="List Table 6 Colorful Accent 4" w:uiPriority="51"/>
-    <w:lsdException w:name="List Table 7 Colorful Accent 4" w:uiPriority="52"/>
-    <w:lsdException w:name="List Table 1 Light Accent 5" w:uiPriority="46"/>
-    <w:lsdException w:name="List Table 2 Accent 5" w:uiPriority="47"/>
-    <w:lsdException w:name="List Table 3 Accent 5" w:uiPriority="48"/>
-    <w:lsdException w:name="List Table 4 Accent 5" w:uiPriority="49"/>
-    <w:lsdException w:name="List Table 5 Dark Accent 5" w:uiPriority="50"/>
-    <w:lsdException w:name="List Table 6 Colorful Accent 5" w:uiPriority="51"/>
-    <w:lsdException w:name="List Table 7 Colorful Accent 5" w:uiPriority="52"/>
-    <w:lsdException w:name="List Table 1 Light Accent 6" w:uiPriority="46"/>
-    <w:lsdException w:name="List Table 2 Accent 6" w:uiPriority="47"/>
-    <w:lsdException w:name="List Table 3 Accent 6" w:uiPriority="48"/>
-    <w:lsdException w:name="List Table 4 Accent 6" w:uiPriority="49"/>
-    <w:lsdException w:name="List Table 5 Dark Accent 6" w:uiPriority="50"/>
-    <w:lsdException w:name="List Table 6 Colorful Accent 6" w:uiPriority="51"/>
-    <w:lsdException w:name="List Table 7 Colorful Accent 6" w:uiPriority="52"/>
-    <w:lsdException w:name="Mention" w:semiHidden="1" w:unhideWhenUsed="1"/>
-    <w:lsdException w:name="Smart Hyperlink" w:semiHidden="1" w:unhideWhenUsed="1"/>
-    <w:lsdException w:name="Hashtag" w:semiHidden="1" w:unhideWhenUsed="1"/>
-    <w:lsdException w:name="Unresolved Mention" w:semiHidden="1" w:unhideWhenUsed="1"/>
-  </w:latentStyles>
-  <w:style w:type="paragraph" w:styleId="Normal" w:default="1">
+  <w:style w:type="paragraph" w:styleId="Normal">
     <w:name w:val="Normal"/>
     <w:qFormat/>
-    <w:rsid w:val="00a91ae1"/>
     <w:pPr>
       <w:widowControl w:val="false"/>
       <w:suppressAutoHyphens w:val="true"/>
+      <w:kinsoku w:val="true"/>
+      <w:overflowPunct w:val="true"/>
+      <w:autoSpaceDE w:val="true"/>
       <w:bidi w:val="0"/>
       <w:spacing w:lineRule="auto" w:line="276" w:before="0" w:after="200"/>
       <w:jc w:val="start"/>
     </w:pPr>
     <w:rPr>
-      <w:rFonts w:ascii="Calibri" w:hAnsi="Calibri" w:eastAsia="Calibri" w:cs="" w:asciiTheme="minorHAnsi" w:cstheme="minorBidi" w:eastAsiaTheme="minorHAnsi" w:hAnsiTheme="minorHAnsi"/>
+      <w:rFonts w:ascii="Calibri" w:hAnsi="Calibri" w:eastAsia="Calibri" w:cs="Noto Sans Arabic"/>
       <w:color w:val="auto"/>
       <w:kern w:val="0"/>
       <w:sz w:val="22"/>
@@ -2118,22 +2092,16 @@
       <w:lang w:val="en-US" w:eastAsia="en-US" w:bidi="ar-SA"/>
     </w:rPr>
   </w:style>
-  <w:style w:type="character" w:styleId="DefaultParagraphFont" w:default="1">
+  <w:style w:type="character" w:styleId="DefaultParagraphFont">
     <w:name w:val="Default Paragraph Font"/>
-    <w:uiPriority w:val="1"/>
-    <w:semiHidden/>
-    <w:unhideWhenUsed/>
     <w:qFormat/>
     <w:rPr/>
   </w:style>
-  <w:style w:type="character" w:styleId="ProsttextChar" w:customStyle="1">
+  <w:style w:type="character" w:styleId="ProsttextChar">
     <w:name w:val="Prostý text Char"/>
     <w:basedOn w:val="DefaultParagraphFont"/>
     <w:link w:val="PlainText"/>
-    <w:uiPriority w:val="99"/>
-    <w:semiHidden/>
     <w:qFormat/>
-    <w:rsid w:val="00d3053c"/>
     <w:rPr>
       <w:rFonts w:ascii="Calibri" w:hAnsi="Calibri"/>
       <w:szCs w:val="21"/>
@@ -2143,36 +2111,26 @@
   <w:style w:type="character" w:styleId="CommentReference">
     <w:name w:val="annotation reference"/>
     <w:basedOn w:val="DefaultParagraphFont"/>
-    <w:uiPriority w:val="99"/>
-    <w:semiHidden/>
-    <w:unhideWhenUsed/>
     <w:qFormat/>
-    <w:rsid w:val="0093482a"/>
     <w:rPr>
       <w:sz w:val="16"/>
       <w:szCs w:val="16"/>
     </w:rPr>
   </w:style>
-  <w:style w:type="character" w:styleId="TextkomenteChar" w:customStyle="1">
+  <w:style w:type="character" w:styleId="TextkomenteChar">
     <w:name w:val="Text komentáře Char"/>
     <w:basedOn w:val="DefaultParagraphFont"/>
-    <w:uiPriority w:val="99"/>
-    <w:semiHidden/>
     <w:qFormat/>
-    <w:rsid w:val="0093482a"/>
     <w:rPr>
       <w:sz w:val="20"/>
       <w:szCs w:val="20"/>
     </w:rPr>
   </w:style>
-  <w:style w:type="character" w:styleId="PedmtkomenteChar" w:customStyle="1">
+  <w:style w:type="character" w:styleId="PedmtkomenteChar">
     <w:name w:val="Předmět komentáře Char"/>
     <w:basedOn w:val="TextkomenteChar"/>
     <w:link w:val="annotationsubject"/>
-    <w:uiPriority w:val="99"/>
-    <w:semiHidden/>
     <w:qFormat/>
-    <w:rsid w:val="0093482a"/>
     <w:rPr>
       <w:b/>
       <w:bCs/>
@@ -2180,14 +2138,11 @@
       <w:szCs w:val="20"/>
     </w:rPr>
   </w:style>
-  <w:style w:type="character" w:styleId="TextbublinyChar" w:customStyle="1">
+  <w:style w:type="character" w:styleId="TextbublinyChar">
     <w:name w:val="Text bubliny Char"/>
     <w:basedOn w:val="DefaultParagraphFont"/>
     <w:link w:val="BalloonText"/>
-    <w:uiPriority w:val="99"/>
-    <w:semiHidden/>
     <w:qFormat/>
-    <w:rsid w:val="0093482a"/>
     <w:rPr>
       <w:rFonts w:ascii="Tahoma" w:hAnsi="Tahoma" w:cs="Tahoma"/>
       <w:sz w:val="16"/>
@@ -2278,13 +2233,15 @@
       <w:rFonts w:cs="Noto Sans Devanagari"/>
     </w:rPr>
   </w:style>
-  <w:style w:type="paragraph" w:styleId="Default" w:customStyle="1">
+  <w:style w:type="paragraph" w:styleId="Default">
     <w:name w:val="Default"/>
     <w:qFormat/>
-    <w:rsid w:val="00ec3d57"/>
     <w:pPr>
       <w:widowControl/>
       <w:suppressAutoHyphens w:val="true"/>
+      <w:kinsoku w:val="true"/>
+      <w:overflowPunct w:val="true"/>
+      <w:autoSpaceDE w:val="true"/>
       <w:bidi w:val="0"/>
       <w:spacing w:lineRule="auto" w:line="240" w:before="0" w:after="0"/>
       <w:jc w:val="start"/>
@@ -2302,11 +2259,7 @@
     <w:name w:val="Plain Text"/>
     <w:basedOn w:val="Normal"/>
     <w:link w:val="ProsttextChar"/>
-    <w:uiPriority w:val="99"/>
-    <w:semiHidden/>
-    <w:unhideWhenUsed/>
     <w:qFormat/>
-    <w:rsid w:val="00d3053c"/>
     <w:pPr>
       <w:widowControl/>
       <w:spacing w:lineRule="auto" w:line="240" w:before="0" w:after="0"/>
@@ -2321,10 +2274,6 @@
     <w:name w:val="annotation text"/>
     <w:basedOn w:val="Normal"/>
     <w:link w:val="TextkomenteChar"/>
-    <w:uiPriority w:val="99"/>
-    <w:semiHidden/>
-    <w:unhideWhenUsed/>
-    <w:rsid w:val="0093482a"/>
     <w:pPr>
       <w:spacing w:lineRule="auto" w:line="240"/>
     </w:pPr>
@@ -2338,11 +2287,7 @@
     <w:basedOn w:val="CommentText"/>
     <w:next w:val="CommentText"/>
     <w:link w:val="PedmtkomenteChar"/>
-    <w:uiPriority w:val="99"/>
-    <w:semiHidden/>
-    <w:unhideWhenUsed/>
     <w:qFormat/>
-    <w:rsid w:val="0093482a"/>
     <w:pPr/>
     <w:rPr>
       <w:b/>
@@ -2353,11 +2298,7 @@
     <w:name w:val="Balloon Text"/>
     <w:basedOn w:val="Normal"/>
     <w:link w:val="TextbublinyChar"/>
-    <w:uiPriority w:val="99"/>
-    <w:semiHidden/>
-    <w:unhideWhenUsed/>
     <w:qFormat/>
-    <w:rsid w:val="0093482a"/>
     <w:pPr>
       <w:spacing w:lineRule="auto" w:line="240" w:before="0" w:after="0"/>
     </w:pPr>
@@ -2367,26 +2308,9 @@
       <w:szCs w:val="16"/>
     </w:rPr>
   </w:style>
-  <w:style w:type="numbering" w:styleId="Bezseznamu" w:default="1">
+  <w:style w:type="numbering" w:styleId="Bezseznamu">
     <w:name w:val="Bez seznamu"/>
-    <w:uiPriority w:val="99"/>
-    <w:semiHidden/>
-    <w:unhideWhenUsed/>
     <w:qFormat/>
-  </w:style>
-  <w:style w:type="table" w:default="1" w:styleId="Normlntabulka">
-    <w:name w:val="Normal Table"/>
-    <w:uiPriority w:val="99"/>
-    <w:semiHidden/>
-    <w:unhideWhenUsed/>
-    <w:tblPr>
-      <w:tblCellMar>
-        <w:top w:w="0" w:type="dxa"/>
-        <w:left w:w="108" w:type="dxa"/>
-        <w:bottom w:w="0" w:type="dxa"/>
-        <w:right w:w="108" w:type="dxa"/>
-      </w:tblCellMar>
-    </w:tblPr>
   </w:style>
 </w:styles>
 </file>
@@ -2434,14 +2358,14 @@
     </a:clrScheme>
     <a:fontScheme name="Office">
       <a:majorFont>
-        <a:latin typeface="Cambria" pitchFamily="0" charset="1"/>
-        <a:ea typeface=""/>
-        <a:cs typeface=""/>
+        <a:latin typeface="Arial" pitchFamily="0" charset="1"/>
+        <a:ea typeface="DejaVu Sans" pitchFamily="0" charset="1"/>
+        <a:cs typeface="DejaVu Sans" pitchFamily="0" charset="1"/>
       </a:majorFont>
       <a:minorFont>
-        <a:latin typeface="Calibri" pitchFamily="0" charset="1"/>
-        <a:ea typeface=""/>
-        <a:cs typeface=""/>
+        <a:latin typeface="Arial" pitchFamily="0" charset="1"/>
+        <a:ea typeface="DejaVu Sans" pitchFamily="0" charset="1"/>
+        <a:cs typeface="DejaVu Sans" pitchFamily="0" charset="1"/>
       </a:minorFont>
     </a:fontScheme>
     <a:fmtScheme>
@@ -2449,58 +2373,25 @@
         <a:solidFill>
           <a:schemeClr val="phClr"/>
         </a:solidFill>
-        <a:gradFill>
-          <a:gsLst>
-            <a:gs pos="0">
-              <a:schemeClr val="phClr">
-                <a:tint val="50000"/>
-              </a:schemeClr>
-            </a:gs>
-            <a:gs pos="35000">
-              <a:schemeClr val="phClr">
-                <a:tint val="37000"/>
-              </a:schemeClr>
-            </a:gs>
-            <a:gs pos="100000">
-              <a:schemeClr val="phClr">
-                <a:tint val="15000"/>
-              </a:schemeClr>
-            </a:gs>
-          </a:gsLst>
-          <a:lin ang="16200000" scaled="1"/>
-          <a:tileRect l="0" t="0" r="0" b="0"/>
-        </a:gradFill>
-        <a:gradFill>
-          <a:gsLst>
-            <a:gs pos="0">
-              <a:schemeClr val="phClr">
-                <a:shade val="51000"/>
-              </a:schemeClr>
-            </a:gs>
-            <a:gs pos="80000">
-              <a:schemeClr val="phClr">
-                <a:shade val="93000"/>
-              </a:schemeClr>
-            </a:gs>
-            <a:gs pos="100000">
-              <a:schemeClr val="phClr">
-                <a:shade val="94000"/>
-              </a:schemeClr>
-            </a:gs>
-          </a:gsLst>
-          <a:lin ang="16200000" scaled="0"/>
-          <a:tileRect l="0" t="0" r="0" b="0"/>
-        </a:gradFill>
+        <a:solidFill>
+          <a:schemeClr val="phClr"/>
+        </a:solidFill>
+        <a:solidFill>
+          <a:schemeClr val="phClr"/>
+        </a:solidFill>
       </a:fillStyleLst>
       <a:lnStyleLst>
-        <a:ln w="9525" cap="flat" cmpd="sng" algn="ctr">
+        <a:ln w="6350" cap="flat" cmpd="sng" algn="ctr">
           <a:prstDash val="solid"/>
+          <a:miter/>
         </a:ln>
-        <a:ln w="25400" cap="flat" cmpd="sng" algn="ctr">
+        <a:ln w="6350" cap="flat" cmpd="sng" algn="ctr">
           <a:prstDash val="solid"/>
+          <a:miter/>
         </a:ln>
-        <a:ln w="38100" cap="flat" cmpd="sng" algn="ctr">
+        <a:ln w="6350" cap="flat" cmpd="sng" algn="ctr">
           <a:prstDash val="solid"/>
+          <a:miter/>
         </a:ln>
       </a:lnStyleLst>
       <a:effectStyleLst>
@@ -2518,62 +2409,14 @@
         <a:solidFill>
           <a:schemeClr val="phClr"/>
         </a:solidFill>
-        <a:gradFill>
-          <a:gsLst>
-            <a:gs pos="0">
-              <a:schemeClr val="phClr">
-                <a:tint val="40000"/>
-              </a:schemeClr>
-            </a:gs>
-            <a:gs pos="40000">
-              <a:schemeClr val="phClr">
-                <a:tint val="45000"/>
-                <a:shade val="99000"/>
-              </a:schemeClr>
-            </a:gs>
-            <a:gs pos="100000">
-              <a:schemeClr val="phClr">
-                <a:shade val="20000"/>
-              </a:schemeClr>
-            </a:gs>
-          </a:gsLst>
-          <a:path path="circle">
-            <a:fillToRect l="50000" t="-80000" r="50000" b="180000"/>
-          </a:path>
-          <a:tileRect l="0" t="0" r="0" b="0"/>
-        </a:gradFill>
-        <a:gradFill>
-          <a:gsLst>
-            <a:gs pos="0">
-              <a:schemeClr val="phClr">
-                <a:tint val="80000"/>
-              </a:schemeClr>
-            </a:gs>
-            <a:gs pos="100000">
-              <a:schemeClr val="phClr">
-                <a:shade val="30000"/>
-              </a:schemeClr>
-            </a:gs>
-          </a:gsLst>
-          <a:path path="circle">
-            <a:fillToRect l="50000" t="50000" r="50000" b="50000"/>
-          </a:path>
-          <a:tileRect l="0" t="0" r="0" b="0"/>
-        </a:gradFill>
+        <a:solidFill>
+          <a:schemeClr val="phClr"/>
+        </a:solidFill>
+        <a:solidFill>
+          <a:schemeClr val="phClr"/>
+        </a:solidFill>
       </a:bgFillStyleLst>
     </a:fmtScheme>
   </a:themeElements>
 </a:theme>
-</file>
-
-<file path=customXml/item1.xml><?xml version="1.0" encoding="utf-8"?>
-<b:Sources xmlns:b="http://schemas.openxmlformats.org/officeDocument/2006/bibliography" xmlns="http://schemas.openxmlformats.org/officeDocument/2006/bibliography" SelectedStyle="\APA.XSL" StyleName="APA"/>
-</file>
-
-<file path=customXml/itemProps1.xml><?xml version="1.0" encoding="utf-8"?>
-<ds:datastoreItem xmlns:ds="http://schemas.openxmlformats.org/officeDocument/2006/customXml" ds:itemID="{BFDA7E87-BB94-423A-8AB8-0FA3C55C75E5}">
-  <ds:schemaRefs>
-    <ds:schemaRef ds:uri="http://schemas.openxmlformats.org/officeDocument/2006/bibliography"/>
-  </ds:schemaRefs>
-</ds:datastoreItem>
 </file>
</xml_diff>